<commit_message>
Update report with real task 1 output
Co-Authored-By: Claude Sonnet 5.5 <noreply@anthropic.com>
Claude-Session: https://claude.ai/code/session_01BXekJbo41pFTNXWYwPGDvg
</commit_message>
<xml_diff>
--- a/Laboratornaya_Bash_Linux_Stepanov.docx
+++ b/Laboratornaya_Bash_Linux_Stepanov.docx
@@ -544,7 +544,7 @@
           <w:sz w:val="24"/>
           <w:szCs w:val="24"/>
         </w:rPr>
-        <w:t xml:space="preserve">Команды pwd, whoami, ls, ls -l, ls -a и date позволяют определить текущий каталог, пользователя, содержимое каталога (в том числе подробное и со скрытыми файлами) и текущее время. Результат pwd и ls -l после создания каталогов:</w:t>
+        <w:t xml:space="preserve">Команды pwd, whoami, ls, ls -l, ls -a и date позволяют определить текущий каталог, пользователя, содержимое каталога (в том числе подробное и со скрытыми файлами) и текущее время. Результат выполнения команд (каталог practice_linux):</w:t>
       </w:r>
     </w:p>
     <w:p>
@@ -580,6 +580,168 @@
           <w:sz w:val="20"/>
           <w:szCs w:val="20"/>
         </w:rPr>
+        <w:t xml:space="preserve">/home/stepanovgv1@cloud.mgupp.ru/practice_linux</w:t>
+      </w:r>
+    </w:p>
+    <w:p>
+      <w:pPr>
+        <w:pBdr>
+          <w:left w:val="single" w:color="808080" w:sz="12" w:space="6"/>
+        </w:pBdr>
+        <w:shd w:fill="F2F2F2" w:val="clear"/>
+        <w:spacing w:after="0" w:line="260"/>
+        <w:ind w:left="200"/>
+      </w:pPr>
+      <w:r>
+        <w:rPr>
+          <w:rFonts w:ascii="Courier New" w:cs="Courier New" w:eastAsia="Courier New" w:hAnsi="Courier New"/>
+          <w:sz w:val="20"/>
+          <w:szCs w:val="20"/>
+        </w:rPr>
+        <w:t xml:space="preserve">$ whoami</w:t>
+      </w:r>
+    </w:p>
+    <w:p>
+      <w:pPr>
+        <w:pBdr>
+          <w:left w:val="single" w:color="808080" w:sz="12" w:space="6"/>
+        </w:pBdr>
+        <w:shd w:fill="F2F2F2" w:val="clear"/>
+        <w:spacing w:after="0" w:line="260"/>
+        <w:ind w:left="200"/>
+      </w:pPr>
+      <w:r>
+        <w:rPr>
+          <w:rFonts w:ascii="Courier New" w:cs="Courier New" w:eastAsia="Courier New" w:hAnsi="Courier New"/>
+          <w:sz w:val="20"/>
+          <w:szCs w:val="20"/>
+        </w:rPr>
+        <w:t xml:space="preserve">stepanovgv1</w:t>
+      </w:r>
+    </w:p>
+    <w:p>
+      <w:pPr>
+        <w:pBdr>
+          <w:left w:val="single" w:color="808080" w:sz="12" w:space="6"/>
+        </w:pBdr>
+        <w:shd w:fill="F2F2F2" w:val="clear"/>
+        <w:spacing w:after="0" w:line="260"/>
+        <w:ind w:left="200"/>
+      </w:pPr>
+      <w:r>
+        <w:rPr>
+          <w:rFonts w:ascii="Courier New" w:cs="Courier New" w:eastAsia="Courier New" w:hAnsi="Courier New"/>
+          <w:sz w:val="20"/>
+          <w:szCs w:val="20"/>
+        </w:rPr>
+        <w:t xml:space="preserve">$ ls</w:t>
+      </w:r>
+    </w:p>
+    <w:p>
+      <w:pPr>
+        <w:pBdr>
+          <w:left w:val="single" w:color="808080" w:sz="12" w:space="6"/>
+        </w:pBdr>
+        <w:shd w:fill="F2F2F2" w:val="clear"/>
+        <w:spacing w:after="0" w:line="260"/>
+        <w:ind w:left="200"/>
+      </w:pPr>
+      <w:r>
+        <w:rPr>
+          <w:rFonts w:ascii="Courier New" w:cs="Courier New" w:eastAsia="Courier New" w:hAnsi="Courier New"/>
+          <w:sz w:val="20"/>
+          <w:szCs w:val="20"/>
+        </w:rPr>
+        <w:t xml:space="preserve">data</w:t>
+      </w:r>
+    </w:p>
+    <w:p>
+      <w:pPr>
+        <w:pBdr>
+          <w:left w:val="single" w:color="808080" w:sz="12" w:space="6"/>
+        </w:pBdr>
+        <w:shd w:fill="F2F2F2" w:val="clear"/>
+        <w:spacing w:after="0" w:line="260"/>
+        <w:ind w:left="200"/>
+      </w:pPr>
+      <w:r>
+        <w:rPr>
+          <w:rFonts w:ascii="Courier New" w:cs="Courier New" w:eastAsia="Courier New" w:hAnsi="Courier New"/>
+          <w:sz w:val="20"/>
+          <w:szCs w:val="20"/>
+        </w:rPr>
+        <w:t xml:space="preserve">results</w:t>
+      </w:r>
+    </w:p>
+    <w:p>
+      <w:pPr>
+        <w:pBdr>
+          <w:left w:val="single" w:color="808080" w:sz="12" w:space="6"/>
+        </w:pBdr>
+        <w:shd w:fill="F2F2F2" w:val="clear"/>
+        <w:spacing w:after="0" w:line="260"/>
+        <w:ind w:left="200"/>
+      </w:pPr>
+      <w:r>
+        <w:rPr>
+          <w:rFonts w:ascii="Courier New" w:cs="Courier New" w:eastAsia="Courier New" w:hAnsi="Courier New"/>
+          <w:sz w:val="20"/>
+          <w:szCs w:val="20"/>
+        </w:rPr>
+        <w:t xml:space="preserve">scripts</w:t>
+      </w:r>
+    </w:p>
+    <w:p>
+      <w:pPr>
+        <w:pBdr>
+          <w:left w:val="single" w:color="808080" w:sz="12" w:space="6"/>
+        </w:pBdr>
+        <w:shd w:fill="F2F2F2" w:val="clear"/>
+        <w:spacing w:after="0" w:line="260"/>
+        <w:ind w:left="200"/>
+      </w:pPr>
+      <w:r>
+        <w:rPr>
+          <w:rFonts w:ascii="Courier New" w:cs="Courier New" w:eastAsia="Courier New" w:hAnsi="Courier New"/>
+          <w:sz w:val="20"/>
+          <w:szCs w:val="20"/>
+        </w:rPr>
+        <w:t xml:space="preserve">sorted_students.txt</w:t>
+      </w:r>
+    </w:p>
+    <w:p>
+      <w:pPr>
+        <w:pBdr>
+          <w:left w:val="single" w:color="808080" w:sz="12" w:space="6"/>
+        </w:pBdr>
+        <w:shd w:fill="F2F2F2" w:val="clear"/>
+        <w:spacing w:after="0" w:line="260"/>
+        <w:ind w:left="200"/>
+      </w:pPr>
+      <w:r>
+        <w:rPr>
+          <w:rFonts w:ascii="Courier New" w:cs="Courier New" w:eastAsia="Courier New" w:hAnsi="Courier New"/>
+          <w:sz w:val="20"/>
+          <w:szCs w:val="20"/>
+        </w:rPr>
+        <w:t xml:space="preserve">students.txt</w:t>
+      </w:r>
+    </w:p>
+    <w:p>
+      <w:pPr>
+        <w:pBdr>
+          <w:left w:val="single" w:color="808080" w:sz="12" w:space="6"/>
+        </w:pBdr>
+        <w:shd w:fill="F2F2F2" w:val="clear"/>
+        <w:spacing w:after="0" w:line="260"/>
+        <w:ind w:left="200"/>
+      </w:pPr>
+      <w:r>
+        <w:rPr>
+          <w:rFonts w:ascii="Courier New" w:cs="Courier New" w:eastAsia="Courier New" w:hAnsi="Courier New"/>
+          <w:sz w:val="20"/>
+          <w:szCs w:val="20"/>
+        </w:rPr>
         <w:t xml:space="preserve">$ ls -l</w:t>
       </w:r>
     </w:p>
@@ -598,79 +760,277 @@
           <w:sz w:val="20"/>
           <w:szCs w:val="20"/>
         </w:rPr>
-        <w:t xml:space="preserve">/home/student/practice_linux</w:t>
-      </w:r>
-    </w:p>
-    <w:p>
-      <w:pPr>
-        <w:pBdr>
-          <w:left w:val="single" w:color="808080" w:sz="12" w:space="6"/>
-        </w:pBdr>
-        <w:shd w:fill="F2F2F2" w:val="clear"/>
-        <w:spacing w:after="0" w:line="260"/>
-        <w:ind w:left="200"/>
-      </w:pPr>
-      <w:r>
-        <w:rPr>
-          <w:rFonts w:ascii="Courier New" w:cs="Courier New" w:eastAsia="Courier New" w:hAnsi="Courier New"/>
-          <w:sz w:val="20"/>
-          <w:szCs w:val="20"/>
-        </w:rPr>
-        <w:t xml:space="preserve">total 12</w:t>
-      </w:r>
-    </w:p>
-    <w:p>
-      <w:pPr>
-        <w:pBdr>
-          <w:left w:val="single" w:color="808080" w:sz="12" w:space="6"/>
-        </w:pBdr>
-        <w:shd w:fill="F2F2F2" w:val="clear"/>
-        <w:spacing w:after="0" w:line="260"/>
-        <w:ind w:left="200"/>
-      </w:pPr>
-      <w:r>
-        <w:rPr>
-          <w:rFonts w:ascii="Courier New" w:cs="Courier New" w:eastAsia="Courier New" w:hAnsi="Courier New"/>
-          <w:sz w:val="20"/>
-          <w:szCs w:val="20"/>
-        </w:rPr>
-        <w:t xml:space="preserve">drwxr-xr-x 2 root root 4096 Oct 22 05:55 data</w:t>
-      </w:r>
-    </w:p>
-    <w:p>
-      <w:pPr>
-        <w:pBdr>
-          <w:left w:val="single" w:color="808080" w:sz="12" w:space="6"/>
-        </w:pBdr>
-        <w:shd w:fill="F2F2F2" w:val="clear"/>
-        <w:spacing w:after="0" w:line="260"/>
-        <w:ind w:left="200"/>
-      </w:pPr>
-      <w:r>
-        <w:rPr>
-          <w:rFonts w:ascii="Courier New" w:cs="Courier New" w:eastAsia="Courier New" w:hAnsi="Courier New"/>
-          <w:sz w:val="20"/>
-          <w:szCs w:val="20"/>
-        </w:rPr>
-        <w:t xml:space="preserve">drwxr-xr-x 2 root root 4096 Oct 22 05:55 results</w:t>
-      </w:r>
-    </w:p>
-    <w:p>
-      <w:pPr>
-        <w:pBdr>
-          <w:left w:val="single" w:color="808080" w:sz="12" w:space="6"/>
-        </w:pBdr>
-        <w:shd w:fill="F2F2F2" w:val="clear"/>
-        <w:spacing w:after="0" w:line="260"/>
-        <w:ind w:left="200"/>
-      </w:pPr>
-      <w:r>
-        <w:rPr>
-          <w:rFonts w:ascii="Courier New" w:cs="Courier New" w:eastAsia="Courier New" w:hAnsi="Courier New"/>
-          <w:sz w:val="20"/>
-          <w:szCs w:val="20"/>
-        </w:rPr>
-        <w:t xml:space="preserve">drwxr-xr-x 2 root root 4096 Oct 22 05:55 scripts</w:t>
+        <w:t xml:space="preserve">итого 20</w:t>
+      </w:r>
+    </w:p>
+    <w:p>
+      <w:pPr>
+        <w:pBdr>
+          <w:left w:val="single" w:color="808080" w:sz="12" w:space="6"/>
+        </w:pBdr>
+        <w:shd w:fill="F2F2F2" w:val="clear"/>
+        <w:spacing w:after="0" w:line="260"/>
+        <w:ind w:left="200"/>
+      </w:pPr>
+      <w:r>
+        <w:rPr>
+          <w:rFonts w:ascii="Courier New" w:cs="Courier New" w:eastAsia="Courier New" w:hAnsi="Courier New"/>
+          <w:sz w:val="20"/>
+          <w:szCs w:val="20"/>
+        </w:rPr>
+        <w:t xml:space="preserve">drwxr-xr-x 2 stepanovgv1 domain users 4096 окт 22 09:03 data</w:t>
+      </w:r>
+    </w:p>
+    <w:p>
+      <w:pPr>
+        <w:pBdr>
+          <w:left w:val="single" w:color="808080" w:sz="12" w:space="6"/>
+        </w:pBdr>
+        <w:shd w:fill="F2F2F2" w:val="clear"/>
+        <w:spacing w:after="0" w:line="260"/>
+        <w:ind w:left="200"/>
+      </w:pPr>
+      <w:r>
+        <w:rPr>
+          <w:rFonts w:ascii="Courier New" w:cs="Courier New" w:eastAsia="Courier New" w:hAnsi="Courier New"/>
+          <w:sz w:val="20"/>
+          <w:szCs w:val="20"/>
+        </w:rPr>
+        <w:t xml:space="preserve">drwxr-xr-x 2 stepanovgv1 domain users 4096 окт 22 09:10 results</w:t>
+      </w:r>
+    </w:p>
+    <w:p>
+      <w:pPr>
+        <w:pBdr>
+          <w:left w:val="single" w:color="808080" w:sz="12" w:space="6"/>
+        </w:pBdr>
+        <w:shd w:fill="F2F2F2" w:val="clear"/>
+        <w:spacing w:after="0" w:line="260"/>
+        <w:ind w:left="200"/>
+      </w:pPr>
+      <w:r>
+        <w:rPr>
+          <w:rFonts w:ascii="Courier New" w:cs="Courier New" w:eastAsia="Courier New" w:hAnsi="Courier New"/>
+          <w:sz w:val="20"/>
+          <w:szCs w:val="20"/>
+        </w:rPr>
+        <w:t xml:space="preserve">drwxr-xr-x 2 stepanovgv1 domain users 4096 окт 22 09:03 scripts</w:t>
+      </w:r>
+    </w:p>
+    <w:p>
+      <w:pPr>
+        <w:pBdr>
+          <w:left w:val="single" w:color="808080" w:sz="12" w:space="6"/>
+        </w:pBdr>
+        <w:shd w:fill="F2F2F2" w:val="clear"/>
+        <w:spacing w:after="0" w:line="260"/>
+        <w:ind w:left="200"/>
+      </w:pPr>
+      <w:r>
+        <w:rPr>
+          <w:rFonts w:ascii="Courier New" w:cs="Courier New" w:eastAsia="Courier New" w:hAnsi="Courier New"/>
+          <w:sz w:val="20"/>
+          <w:szCs w:val="20"/>
+        </w:rPr>
+        <w:t xml:space="preserve">-rw-r--r-- 1 stepanovgv1 domain users  216 окт 22 09:03 sorted_students.txt</w:t>
+      </w:r>
+    </w:p>
+    <w:p>
+      <w:pPr>
+        <w:pBdr>
+          <w:left w:val="single" w:color="808080" w:sz="12" w:space="6"/>
+        </w:pBdr>
+        <w:shd w:fill="F2F2F2" w:val="clear"/>
+        <w:spacing w:after="0" w:line="260"/>
+        <w:ind w:left="200"/>
+      </w:pPr>
+      <w:r>
+        <w:rPr>
+          <w:rFonts w:ascii="Courier New" w:cs="Courier New" w:eastAsia="Courier New" w:hAnsi="Courier New"/>
+          <w:sz w:val="20"/>
+          <w:szCs w:val="20"/>
+        </w:rPr>
+        <w:t xml:space="preserve">-rw-r--r-- 1 stepanovgv1 domain users  216 окт 22 09:03 students.txt</w:t>
+      </w:r>
+    </w:p>
+    <w:p>
+      <w:pPr>
+        <w:pBdr>
+          <w:left w:val="single" w:color="808080" w:sz="12" w:space="6"/>
+        </w:pBdr>
+        <w:shd w:fill="F2F2F2" w:val="clear"/>
+        <w:spacing w:after="0" w:line="260"/>
+        <w:ind w:left="200"/>
+      </w:pPr>
+      <w:r>
+        <w:rPr>
+          <w:rFonts w:ascii="Courier New" w:cs="Courier New" w:eastAsia="Courier New" w:hAnsi="Courier New"/>
+          <w:sz w:val="20"/>
+          <w:szCs w:val="20"/>
+        </w:rPr>
+        <w:t xml:space="preserve">$ ls -a</w:t>
+      </w:r>
+    </w:p>
+    <w:p>
+      <w:pPr>
+        <w:pBdr>
+          <w:left w:val="single" w:color="808080" w:sz="12" w:space="6"/>
+        </w:pBdr>
+        <w:shd w:fill="F2F2F2" w:val="clear"/>
+        <w:spacing w:after="0" w:line="260"/>
+        <w:ind w:left="200"/>
+      </w:pPr>
+      <w:r>
+        <w:rPr>
+          <w:rFonts w:ascii="Courier New" w:cs="Courier New" w:eastAsia="Courier New" w:hAnsi="Courier New"/>
+          <w:sz w:val="20"/>
+          <w:szCs w:val="20"/>
+        </w:rPr>
+        <w:t xml:space="preserve">.</w:t>
+      </w:r>
+    </w:p>
+    <w:p>
+      <w:pPr>
+        <w:pBdr>
+          <w:left w:val="single" w:color="808080" w:sz="12" w:space="6"/>
+        </w:pBdr>
+        <w:shd w:fill="F2F2F2" w:val="clear"/>
+        <w:spacing w:after="0" w:line="260"/>
+        <w:ind w:left="200"/>
+      </w:pPr>
+      <w:r>
+        <w:rPr>
+          <w:rFonts w:ascii="Courier New" w:cs="Courier New" w:eastAsia="Courier New" w:hAnsi="Courier New"/>
+          <w:sz w:val="20"/>
+          <w:szCs w:val="20"/>
+        </w:rPr>
+        <w:t xml:space="preserve">..</w:t>
+      </w:r>
+    </w:p>
+    <w:p>
+      <w:pPr>
+        <w:pBdr>
+          <w:left w:val="single" w:color="808080" w:sz="12" w:space="6"/>
+        </w:pBdr>
+        <w:shd w:fill="F2F2F2" w:val="clear"/>
+        <w:spacing w:after="0" w:line="260"/>
+        <w:ind w:left="200"/>
+      </w:pPr>
+      <w:r>
+        <w:rPr>
+          <w:rFonts w:ascii="Courier New" w:cs="Courier New" w:eastAsia="Courier New" w:hAnsi="Courier New"/>
+          <w:sz w:val="20"/>
+          <w:szCs w:val="20"/>
+        </w:rPr>
+        <w:t xml:space="preserve">data</w:t>
+      </w:r>
+    </w:p>
+    <w:p>
+      <w:pPr>
+        <w:pBdr>
+          <w:left w:val="single" w:color="808080" w:sz="12" w:space="6"/>
+        </w:pBdr>
+        <w:shd w:fill="F2F2F2" w:val="clear"/>
+        <w:spacing w:after="0" w:line="260"/>
+        <w:ind w:left="200"/>
+      </w:pPr>
+      <w:r>
+        <w:rPr>
+          <w:rFonts w:ascii="Courier New" w:cs="Courier New" w:eastAsia="Courier New" w:hAnsi="Courier New"/>
+          <w:sz w:val="20"/>
+          <w:szCs w:val="20"/>
+        </w:rPr>
+        <w:t xml:space="preserve">results</w:t>
+      </w:r>
+    </w:p>
+    <w:p>
+      <w:pPr>
+        <w:pBdr>
+          <w:left w:val="single" w:color="808080" w:sz="12" w:space="6"/>
+        </w:pBdr>
+        <w:shd w:fill="F2F2F2" w:val="clear"/>
+        <w:spacing w:after="0" w:line="260"/>
+        <w:ind w:left="200"/>
+      </w:pPr>
+      <w:r>
+        <w:rPr>
+          <w:rFonts w:ascii="Courier New" w:cs="Courier New" w:eastAsia="Courier New" w:hAnsi="Courier New"/>
+          <w:sz w:val="20"/>
+          <w:szCs w:val="20"/>
+        </w:rPr>
+        <w:t xml:space="preserve">scripts</w:t>
+      </w:r>
+    </w:p>
+    <w:p>
+      <w:pPr>
+        <w:pBdr>
+          <w:left w:val="single" w:color="808080" w:sz="12" w:space="6"/>
+        </w:pBdr>
+        <w:shd w:fill="F2F2F2" w:val="clear"/>
+        <w:spacing w:after="0" w:line="260"/>
+        <w:ind w:left="200"/>
+      </w:pPr>
+      <w:r>
+        <w:rPr>
+          <w:rFonts w:ascii="Courier New" w:cs="Courier New" w:eastAsia="Courier New" w:hAnsi="Courier New"/>
+          <w:sz w:val="20"/>
+          <w:szCs w:val="20"/>
+        </w:rPr>
+        <w:t xml:space="preserve">sorted_students.txt</w:t>
+      </w:r>
+    </w:p>
+    <w:p>
+      <w:pPr>
+        <w:pBdr>
+          <w:left w:val="single" w:color="808080" w:sz="12" w:space="6"/>
+        </w:pBdr>
+        <w:shd w:fill="F2F2F2" w:val="clear"/>
+        <w:spacing w:after="0" w:line="260"/>
+        <w:ind w:left="200"/>
+      </w:pPr>
+      <w:r>
+        <w:rPr>
+          <w:rFonts w:ascii="Courier New" w:cs="Courier New" w:eastAsia="Courier New" w:hAnsi="Courier New"/>
+          <w:sz w:val="20"/>
+          <w:szCs w:val="20"/>
+        </w:rPr>
+        <w:t xml:space="preserve">students.txt</w:t>
+      </w:r>
+    </w:p>
+    <w:p>
+      <w:pPr>
+        <w:pBdr>
+          <w:left w:val="single" w:color="808080" w:sz="12" w:space="6"/>
+        </w:pBdr>
+        <w:shd w:fill="F2F2F2" w:val="clear"/>
+        <w:spacing w:after="0" w:line="260"/>
+        <w:ind w:left="200"/>
+      </w:pPr>
+      <w:r>
+        <w:rPr>
+          <w:rFonts w:ascii="Courier New" w:cs="Courier New" w:eastAsia="Courier New" w:hAnsi="Courier New"/>
+          <w:sz w:val="20"/>
+          <w:szCs w:val="20"/>
+        </w:rPr>
+        <w:t xml:space="preserve">$ date</w:t>
+      </w:r>
+    </w:p>
+    <w:p>
+      <w:pPr>
+        <w:pBdr>
+          <w:left w:val="single" w:color="808080" w:sz="12" w:space="6"/>
+        </w:pBdr>
+        <w:shd w:fill="F2F2F2" w:val="clear"/>
+        <w:spacing w:after="0" w:line="260"/>
+        <w:ind w:left="200"/>
+      </w:pPr>
+      <w:r>
+        <w:rPr>
+          <w:rFonts w:ascii="Courier New" w:cs="Courier New" w:eastAsia="Courier New" w:hAnsi="Courier New"/>
+          <w:sz w:val="20"/>
+          <w:szCs w:val="20"/>
+        </w:rPr>
+        <w:t xml:space="preserve">Чт 22 окт 2026 09:10:38 MSK</w:t>
       </w:r>
     </w:p>
     <w:p>

</xml_diff>

<commit_message>
Update report with real protocol from college PC
Co-Authored-By: Claude Sonnet 5.5 <noreply@anthropic.com>
Claude-Session: https://claude.ai/code/session_01BXekJbo41pFTNXWYwPGDvg
</commit_message>
<xml_diff>
--- a/Laboratornaya_Bash_Linux_Stepanov.docx
+++ b/Laboratornaya_Bash_Linux_Stepanov.docx
@@ -465,6 +465,21 @@
           <w:sz w:val="24"/>
           <w:szCs w:val="24"/>
         </w:rPr>
+        <w:t xml:space="preserve">Работа выполнена на компьютере ubuntu-RDW-63, пользователь stepanovgv1, ОС Ubuntu Linux (протокол от 22.10.2026).</w:t>
+      </w:r>
+    </w:p>
+    <w:p>
+      <w:pPr>
+        <w:spacing w:after="120" w:line="300"/>
+        <w:ind w:firstLine="709"/>
+        <w:jc w:val="both"/>
+      </w:pPr>
+      <w:r>
+        <w:rPr>
+          <w:rFonts w:ascii="Times New Roman" w:cs="Times New Roman" w:eastAsia="Times New Roman" w:hAnsi="Times New Roman"/>
+          <w:sz w:val="24"/>
+          <w:szCs w:val="24"/>
+        </w:rPr>
         <w:t xml:space="preserve">Тема: Основы работы в командной строке Linux и подготовка к разработке сценариев Bash.</w:t>
       </w:r>
     </w:p>
@@ -652,96 +667,6 @@
           <w:sz w:val="20"/>
           <w:szCs w:val="20"/>
         </w:rPr>
-        <w:t xml:space="preserve">data</w:t>
-      </w:r>
-    </w:p>
-    <w:p>
-      <w:pPr>
-        <w:pBdr>
-          <w:left w:val="single" w:color="808080" w:sz="12" w:space="6"/>
-        </w:pBdr>
-        <w:shd w:fill="F2F2F2" w:val="clear"/>
-        <w:spacing w:after="0" w:line="260"/>
-        <w:ind w:left="200"/>
-      </w:pPr>
-      <w:r>
-        <w:rPr>
-          <w:rFonts w:ascii="Courier New" w:cs="Courier New" w:eastAsia="Courier New" w:hAnsi="Courier New"/>
-          <w:sz w:val="20"/>
-          <w:szCs w:val="20"/>
-        </w:rPr>
-        <w:t xml:space="preserve">results</w:t>
-      </w:r>
-    </w:p>
-    <w:p>
-      <w:pPr>
-        <w:pBdr>
-          <w:left w:val="single" w:color="808080" w:sz="12" w:space="6"/>
-        </w:pBdr>
-        <w:shd w:fill="F2F2F2" w:val="clear"/>
-        <w:spacing w:after="0" w:line="260"/>
-        <w:ind w:left="200"/>
-      </w:pPr>
-      <w:r>
-        <w:rPr>
-          <w:rFonts w:ascii="Courier New" w:cs="Courier New" w:eastAsia="Courier New" w:hAnsi="Courier New"/>
-          <w:sz w:val="20"/>
-          <w:szCs w:val="20"/>
-        </w:rPr>
-        <w:t xml:space="preserve">scripts</w:t>
-      </w:r>
-    </w:p>
-    <w:p>
-      <w:pPr>
-        <w:pBdr>
-          <w:left w:val="single" w:color="808080" w:sz="12" w:space="6"/>
-        </w:pBdr>
-        <w:shd w:fill="F2F2F2" w:val="clear"/>
-        <w:spacing w:after="0" w:line="260"/>
-        <w:ind w:left="200"/>
-      </w:pPr>
-      <w:r>
-        <w:rPr>
-          <w:rFonts w:ascii="Courier New" w:cs="Courier New" w:eastAsia="Courier New" w:hAnsi="Courier New"/>
-          <w:sz w:val="20"/>
-          <w:szCs w:val="20"/>
-        </w:rPr>
-        <w:t xml:space="preserve">sorted_students.txt</w:t>
-      </w:r>
-    </w:p>
-    <w:p>
-      <w:pPr>
-        <w:pBdr>
-          <w:left w:val="single" w:color="808080" w:sz="12" w:space="6"/>
-        </w:pBdr>
-        <w:shd w:fill="F2F2F2" w:val="clear"/>
-        <w:spacing w:after="0" w:line="260"/>
-        <w:ind w:left="200"/>
-      </w:pPr>
-      <w:r>
-        <w:rPr>
-          <w:rFonts w:ascii="Courier New" w:cs="Courier New" w:eastAsia="Courier New" w:hAnsi="Courier New"/>
-          <w:sz w:val="20"/>
-          <w:szCs w:val="20"/>
-        </w:rPr>
-        <w:t xml:space="preserve">students.txt</w:t>
-      </w:r>
-    </w:p>
-    <w:p>
-      <w:pPr>
-        <w:pBdr>
-          <w:left w:val="single" w:color="808080" w:sz="12" w:space="6"/>
-        </w:pBdr>
-        <w:shd w:fill="F2F2F2" w:val="clear"/>
-        <w:spacing w:after="0" w:line="260"/>
-        <w:ind w:left="200"/>
-      </w:pPr>
-      <w:r>
-        <w:rPr>
-          <w:rFonts w:ascii="Courier New" w:cs="Courier New" w:eastAsia="Courier New" w:hAnsi="Courier New"/>
-          <w:sz w:val="20"/>
-          <w:szCs w:val="20"/>
-        </w:rPr>
         <w:t xml:space="preserve">$ ls -l</w:t>
       </w:r>
     </w:p>
@@ -760,97 +685,7 @@
           <w:sz w:val="20"/>
           <w:szCs w:val="20"/>
         </w:rPr>
-        <w:t xml:space="preserve">итого 20</w:t>
-      </w:r>
-    </w:p>
-    <w:p>
-      <w:pPr>
-        <w:pBdr>
-          <w:left w:val="single" w:color="808080" w:sz="12" w:space="6"/>
-        </w:pBdr>
-        <w:shd w:fill="F2F2F2" w:val="clear"/>
-        <w:spacing w:after="0" w:line="260"/>
-        <w:ind w:left="200"/>
-      </w:pPr>
-      <w:r>
-        <w:rPr>
-          <w:rFonts w:ascii="Courier New" w:cs="Courier New" w:eastAsia="Courier New" w:hAnsi="Courier New"/>
-          <w:sz w:val="20"/>
-          <w:szCs w:val="20"/>
-        </w:rPr>
-        <w:t xml:space="preserve">drwxr-xr-x 2 stepanovgv1 domain users 4096 окт 22 09:03 data</w:t>
-      </w:r>
-    </w:p>
-    <w:p>
-      <w:pPr>
-        <w:pBdr>
-          <w:left w:val="single" w:color="808080" w:sz="12" w:space="6"/>
-        </w:pBdr>
-        <w:shd w:fill="F2F2F2" w:val="clear"/>
-        <w:spacing w:after="0" w:line="260"/>
-        <w:ind w:left="200"/>
-      </w:pPr>
-      <w:r>
-        <w:rPr>
-          <w:rFonts w:ascii="Courier New" w:cs="Courier New" w:eastAsia="Courier New" w:hAnsi="Courier New"/>
-          <w:sz w:val="20"/>
-          <w:szCs w:val="20"/>
-        </w:rPr>
-        <w:t xml:space="preserve">drwxr-xr-x 2 stepanovgv1 domain users 4096 окт 22 09:10 results</w:t>
-      </w:r>
-    </w:p>
-    <w:p>
-      <w:pPr>
-        <w:pBdr>
-          <w:left w:val="single" w:color="808080" w:sz="12" w:space="6"/>
-        </w:pBdr>
-        <w:shd w:fill="F2F2F2" w:val="clear"/>
-        <w:spacing w:after="0" w:line="260"/>
-        <w:ind w:left="200"/>
-      </w:pPr>
-      <w:r>
-        <w:rPr>
-          <w:rFonts w:ascii="Courier New" w:cs="Courier New" w:eastAsia="Courier New" w:hAnsi="Courier New"/>
-          <w:sz w:val="20"/>
-          <w:szCs w:val="20"/>
-        </w:rPr>
-        <w:t xml:space="preserve">drwxr-xr-x 2 stepanovgv1 domain users 4096 окт 22 09:03 scripts</w:t>
-      </w:r>
-    </w:p>
-    <w:p>
-      <w:pPr>
-        <w:pBdr>
-          <w:left w:val="single" w:color="808080" w:sz="12" w:space="6"/>
-        </w:pBdr>
-        <w:shd w:fill="F2F2F2" w:val="clear"/>
-        <w:spacing w:after="0" w:line="260"/>
-        <w:ind w:left="200"/>
-      </w:pPr>
-      <w:r>
-        <w:rPr>
-          <w:rFonts w:ascii="Courier New" w:cs="Courier New" w:eastAsia="Courier New" w:hAnsi="Courier New"/>
-          <w:sz w:val="20"/>
-          <w:szCs w:val="20"/>
-        </w:rPr>
-        <w:t xml:space="preserve">-rw-r--r-- 1 stepanovgv1 domain users  216 окт 22 09:03 sorted_students.txt</w:t>
-      </w:r>
-    </w:p>
-    <w:p>
-      <w:pPr>
-        <w:pBdr>
-          <w:left w:val="single" w:color="808080" w:sz="12" w:space="6"/>
-        </w:pBdr>
-        <w:shd w:fill="F2F2F2" w:val="clear"/>
-        <w:spacing w:after="0" w:line="260"/>
-        <w:ind w:left="200"/>
-      </w:pPr>
-      <w:r>
-        <w:rPr>
-          <w:rFonts w:ascii="Courier New" w:cs="Courier New" w:eastAsia="Courier New" w:hAnsi="Courier New"/>
-          <w:sz w:val="20"/>
-          <w:szCs w:val="20"/>
-        </w:rPr>
-        <w:t xml:space="preserve">-rw-r--r-- 1 stepanovgv1 domain users  216 окт 22 09:03 students.txt</w:t>
+        <w:t xml:space="preserve">итого 0</w:t>
       </w:r>
     </w:p>
     <w:p>
@@ -922,96 +757,6 @@
           <w:sz w:val="20"/>
           <w:szCs w:val="20"/>
         </w:rPr>
-        <w:t xml:space="preserve">data</w:t>
-      </w:r>
-    </w:p>
-    <w:p>
-      <w:pPr>
-        <w:pBdr>
-          <w:left w:val="single" w:color="808080" w:sz="12" w:space="6"/>
-        </w:pBdr>
-        <w:shd w:fill="F2F2F2" w:val="clear"/>
-        <w:spacing w:after="0" w:line="260"/>
-        <w:ind w:left="200"/>
-      </w:pPr>
-      <w:r>
-        <w:rPr>
-          <w:rFonts w:ascii="Courier New" w:cs="Courier New" w:eastAsia="Courier New" w:hAnsi="Courier New"/>
-          <w:sz w:val="20"/>
-          <w:szCs w:val="20"/>
-        </w:rPr>
-        <w:t xml:space="preserve">results</w:t>
-      </w:r>
-    </w:p>
-    <w:p>
-      <w:pPr>
-        <w:pBdr>
-          <w:left w:val="single" w:color="808080" w:sz="12" w:space="6"/>
-        </w:pBdr>
-        <w:shd w:fill="F2F2F2" w:val="clear"/>
-        <w:spacing w:after="0" w:line="260"/>
-        <w:ind w:left="200"/>
-      </w:pPr>
-      <w:r>
-        <w:rPr>
-          <w:rFonts w:ascii="Courier New" w:cs="Courier New" w:eastAsia="Courier New" w:hAnsi="Courier New"/>
-          <w:sz w:val="20"/>
-          <w:szCs w:val="20"/>
-        </w:rPr>
-        <w:t xml:space="preserve">scripts</w:t>
-      </w:r>
-    </w:p>
-    <w:p>
-      <w:pPr>
-        <w:pBdr>
-          <w:left w:val="single" w:color="808080" w:sz="12" w:space="6"/>
-        </w:pBdr>
-        <w:shd w:fill="F2F2F2" w:val="clear"/>
-        <w:spacing w:after="0" w:line="260"/>
-        <w:ind w:left="200"/>
-      </w:pPr>
-      <w:r>
-        <w:rPr>
-          <w:rFonts w:ascii="Courier New" w:cs="Courier New" w:eastAsia="Courier New" w:hAnsi="Courier New"/>
-          <w:sz w:val="20"/>
-          <w:szCs w:val="20"/>
-        </w:rPr>
-        <w:t xml:space="preserve">sorted_students.txt</w:t>
-      </w:r>
-    </w:p>
-    <w:p>
-      <w:pPr>
-        <w:pBdr>
-          <w:left w:val="single" w:color="808080" w:sz="12" w:space="6"/>
-        </w:pBdr>
-        <w:shd w:fill="F2F2F2" w:val="clear"/>
-        <w:spacing w:after="0" w:line="260"/>
-        <w:ind w:left="200"/>
-      </w:pPr>
-      <w:r>
-        <w:rPr>
-          <w:rFonts w:ascii="Courier New" w:cs="Courier New" w:eastAsia="Courier New" w:hAnsi="Courier New"/>
-          <w:sz w:val="20"/>
-          <w:szCs w:val="20"/>
-        </w:rPr>
-        <w:t xml:space="preserve">students.txt</w:t>
-      </w:r>
-    </w:p>
-    <w:p>
-      <w:pPr>
-        <w:pBdr>
-          <w:left w:val="single" w:color="808080" w:sz="12" w:space="6"/>
-        </w:pBdr>
-        <w:shd w:fill="F2F2F2" w:val="clear"/>
-        <w:spacing w:after="0" w:line="260"/>
-        <w:ind w:left="200"/>
-      </w:pPr>
-      <w:r>
-        <w:rPr>
-          <w:rFonts w:ascii="Courier New" w:cs="Courier New" w:eastAsia="Courier New" w:hAnsi="Courier New"/>
-          <w:sz w:val="20"/>
-          <w:szCs w:val="20"/>
-        </w:rPr>
         <w:t xml:space="preserve">$ date</w:t>
       </w:r>
     </w:p>
@@ -1030,7 +775,7 @@
           <w:sz w:val="20"/>
           <w:szCs w:val="20"/>
         </w:rPr>
-        <w:t xml:space="preserve">Чт 22 окт 2026 09:10:38 MSK</w:t>
+        <w:t xml:space="preserve">Чт 22 окт 2026 09:13:45 MSK</w:t>
       </w:r>
     </w:p>
     <w:p>
@@ -1085,42 +830,6 @@
           <w:sz w:val="20"/>
           <w:szCs w:val="20"/>
         </w:rPr>
-        <w:t xml:space="preserve">$ mkdir practice_linux</w:t>
-      </w:r>
-    </w:p>
-    <w:p>
-      <w:pPr>
-        <w:pBdr>
-          <w:left w:val="single" w:color="808080" w:sz="12" w:space="6"/>
-        </w:pBdr>
-        <w:shd w:fill="F2F2F2" w:val="clear"/>
-        <w:spacing w:after="0" w:line="260"/>
-        <w:ind w:left="200"/>
-      </w:pPr>
-      <w:r>
-        <w:rPr>
-          <w:rFonts w:ascii="Courier New" w:cs="Courier New" w:eastAsia="Courier New" w:hAnsi="Courier New"/>
-          <w:sz w:val="20"/>
-          <w:szCs w:val="20"/>
-        </w:rPr>
-        <w:t xml:space="preserve">$ cd practice_linux</w:t>
-      </w:r>
-    </w:p>
-    <w:p>
-      <w:pPr>
-        <w:pBdr>
-          <w:left w:val="single" w:color="808080" w:sz="12" w:space="6"/>
-        </w:pBdr>
-        <w:shd w:fill="F2F2F2" w:val="clear"/>
-        <w:spacing w:after="0" w:line="260"/>
-        <w:ind w:left="200"/>
-      </w:pPr>
-      <w:r>
-        <w:rPr>
-          <w:rFonts w:ascii="Courier New" w:cs="Courier New" w:eastAsia="Courier New" w:hAnsi="Courier New"/>
-          <w:sz w:val="20"/>
-          <w:szCs w:val="20"/>
-        </w:rPr>
         <w:t xml:space="preserve">$ mkdir data scripts results</w:t>
       </w:r>
     </w:p>
@@ -1139,6 +848,132 @@
           <w:sz w:val="20"/>
           <w:szCs w:val="20"/>
         </w:rPr>
+        <w:t xml:space="preserve">$ pwd</w:t>
+      </w:r>
+    </w:p>
+    <w:p>
+      <w:pPr>
+        <w:pBdr>
+          <w:left w:val="single" w:color="808080" w:sz="12" w:space="6"/>
+        </w:pBdr>
+        <w:shd w:fill="F2F2F2" w:val="clear"/>
+        <w:spacing w:after="0" w:line="260"/>
+        <w:ind w:left="200"/>
+      </w:pPr>
+      <w:r>
+        <w:rPr>
+          <w:rFonts w:ascii="Courier New" w:cs="Courier New" w:eastAsia="Courier New" w:hAnsi="Courier New"/>
+          <w:sz w:val="20"/>
+          <w:szCs w:val="20"/>
+        </w:rPr>
+        <w:t xml:space="preserve">/home/stepanovgv1@cloud.mgupp.ru/practice_linux</w:t>
+      </w:r>
+    </w:p>
+    <w:p>
+      <w:pPr>
+        <w:pBdr>
+          <w:left w:val="single" w:color="808080" w:sz="12" w:space="6"/>
+        </w:pBdr>
+        <w:shd w:fill="F2F2F2" w:val="clear"/>
+        <w:spacing w:after="0" w:line="260"/>
+        <w:ind w:left="200"/>
+      </w:pPr>
+      <w:r>
+        <w:rPr>
+          <w:rFonts w:ascii="Courier New" w:cs="Courier New" w:eastAsia="Courier New" w:hAnsi="Courier New"/>
+          <w:sz w:val="20"/>
+          <w:szCs w:val="20"/>
+        </w:rPr>
+        <w:t xml:space="preserve">$ ls -l</w:t>
+      </w:r>
+    </w:p>
+    <w:p>
+      <w:pPr>
+        <w:pBdr>
+          <w:left w:val="single" w:color="808080" w:sz="12" w:space="6"/>
+        </w:pBdr>
+        <w:shd w:fill="F2F2F2" w:val="clear"/>
+        <w:spacing w:after="0" w:line="260"/>
+        <w:ind w:left="200"/>
+      </w:pPr>
+      <w:r>
+        <w:rPr>
+          <w:rFonts w:ascii="Courier New" w:cs="Courier New" w:eastAsia="Courier New" w:hAnsi="Courier New"/>
+          <w:sz w:val="20"/>
+          <w:szCs w:val="20"/>
+        </w:rPr>
+        <w:t xml:space="preserve">итого 12</w:t>
+      </w:r>
+    </w:p>
+    <w:p>
+      <w:pPr>
+        <w:pBdr>
+          <w:left w:val="single" w:color="808080" w:sz="12" w:space="6"/>
+        </w:pBdr>
+        <w:shd w:fill="F2F2F2" w:val="clear"/>
+        <w:spacing w:after="0" w:line="260"/>
+        <w:ind w:left="200"/>
+      </w:pPr>
+      <w:r>
+        <w:rPr>
+          <w:rFonts w:ascii="Courier New" w:cs="Courier New" w:eastAsia="Courier New" w:hAnsi="Courier New"/>
+          <w:sz w:val="20"/>
+          <w:szCs w:val="20"/>
+        </w:rPr>
+        <w:t xml:space="preserve">drwxr-xr-x 2 stepanovgv1 domain users 4096 окт 22 09:13 data</w:t>
+      </w:r>
+    </w:p>
+    <w:p>
+      <w:pPr>
+        <w:pBdr>
+          <w:left w:val="single" w:color="808080" w:sz="12" w:space="6"/>
+        </w:pBdr>
+        <w:shd w:fill="F2F2F2" w:val="clear"/>
+        <w:spacing w:after="0" w:line="260"/>
+        <w:ind w:left="200"/>
+      </w:pPr>
+      <w:r>
+        <w:rPr>
+          <w:rFonts w:ascii="Courier New" w:cs="Courier New" w:eastAsia="Courier New" w:hAnsi="Courier New"/>
+          <w:sz w:val="20"/>
+          <w:szCs w:val="20"/>
+        </w:rPr>
+        <w:t xml:space="preserve">drwxr-xr-x 2 stepanovgv1 domain users 4096 окт 22 09:13 results</w:t>
+      </w:r>
+    </w:p>
+    <w:p>
+      <w:pPr>
+        <w:pBdr>
+          <w:left w:val="single" w:color="808080" w:sz="12" w:space="6"/>
+        </w:pBdr>
+        <w:shd w:fill="F2F2F2" w:val="clear"/>
+        <w:spacing w:after="0" w:line="260"/>
+        <w:ind w:left="200"/>
+      </w:pPr>
+      <w:r>
+        <w:rPr>
+          <w:rFonts w:ascii="Courier New" w:cs="Courier New" w:eastAsia="Courier New" w:hAnsi="Courier New"/>
+          <w:sz w:val="20"/>
+          <w:szCs w:val="20"/>
+        </w:rPr>
+        <w:t xml:space="preserve">drwxr-xr-x 2 stepanovgv1 domain users 4096 окт 22 09:13 scripts</w:t>
+      </w:r>
+    </w:p>
+    <w:p>
+      <w:pPr>
+        <w:pBdr>
+          <w:left w:val="single" w:color="808080" w:sz="12" w:space="6"/>
+        </w:pBdr>
+        <w:shd w:fill="F2F2F2" w:val="clear"/>
+        <w:spacing w:after="0" w:line="260"/>
+        <w:ind w:left="200"/>
+      </w:pPr>
+      <w:r>
+        <w:rPr>
+          <w:rFonts w:ascii="Courier New" w:cs="Courier New" w:eastAsia="Courier New" w:hAnsi="Courier New"/>
+          <w:sz w:val="20"/>
+          <w:szCs w:val="20"/>
+        </w:rPr>
         <w:t xml:space="preserve">$ touch students.txt</w:t>
       </w:r>
     </w:p>
@@ -1157,24 +992,6 @@
           <w:sz w:val="20"/>
           <w:szCs w:val="20"/>
         </w:rPr>
-        <w:t xml:space="preserve">$ nano students.txt</w:t>
-      </w:r>
-    </w:p>
-    <w:p>
-      <w:pPr>
-        <w:pBdr>
-          <w:left w:val="single" w:color="808080" w:sz="12" w:space="6"/>
-        </w:pBdr>
-        <w:shd w:fill="F2F2F2" w:val="clear"/>
-        <w:spacing w:after="0" w:line="260"/>
-        <w:ind w:left="200"/>
-      </w:pPr>
-      <w:r>
-        <w:rPr>
-          <w:rFonts w:ascii="Courier New" w:cs="Courier New" w:eastAsia="Courier New" w:hAnsi="Courier New"/>
-          <w:sz w:val="20"/>
-          <w:szCs w:val="20"/>
-        </w:rPr>
         <w:t xml:space="preserve">$ cat students.txt</w:t>
       </w:r>
     </w:p>
@@ -1266,6 +1083,186 @@
           <w:szCs w:val="20"/>
         </w:rPr>
         <w:t xml:space="preserve">Кузнецова М.И. 2005 Самара 4.6</w:t>
+      </w:r>
+    </w:p>
+    <w:p>
+      <w:pPr>
+        <w:pBdr>
+          <w:left w:val="single" w:color="808080" w:sz="12" w:space="6"/>
+        </w:pBdr>
+        <w:shd w:fill="F2F2F2" w:val="clear"/>
+        <w:spacing w:after="0" w:line="260"/>
+        <w:ind w:left="200"/>
+      </w:pPr>
+      <w:r>
+        <w:rPr>
+          <w:rFonts w:ascii="Courier New" w:cs="Courier New" w:eastAsia="Courier New" w:hAnsi="Courier New"/>
+          <w:sz w:val="20"/>
+          <w:szCs w:val="20"/>
+        </w:rPr>
+        <w:t xml:space="preserve">$ echo 'тестовая строка' &gt; test.txt</w:t>
+      </w:r>
+    </w:p>
+    <w:p>
+      <w:pPr>
+        <w:pBdr>
+          <w:left w:val="single" w:color="808080" w:sz="12" w:space="6"/>
+        </w:pBdr>
+        <w:shd w:fill="F2F2F2" w:val="clear"/>
+        <w:spacing w:after="0" w:line="260"/>
+        <w:ind w:left="200"/>
+      </w:pPr>
+      <w:r>
+        <w:rPr>
+          <w:rFonts w:ascii="Courier New" w:cs="Courier New" w:eastAsia="Courier New" w:hAnsi="Courier New"/>
+          <w:sz w:val="20"/>
+          <w:szCs w:val="20"/>
+        </w:rPr>
+        <w:t xml:space="preserve">$ cat test.txt</w:t>
+      </w:r>
+    </w:p>
+    <w:p>
+      <w:pPr>
+        <w:pBdr>
+          <w:left w:val="single" w:color="808080" w:sz="12" w:space="6"/>
+        </w:pBdr>
+        <w:shd w:fill="F2F2F2" w:val="clear"/>
+        <w:spacing w:after="0" w:line="260"/>
+        <w:ind w:left="200"/>
+      </w:pPr>
+      <w:r>
+        <w:rPr>
+          <w:rFonts w:ascii="Courier New" w:cs="Courier New" w:eastAsia="Courier New" w:hAnsi="Courier New"/>
+          <w:sz w:val="20"/>
+          <w:szCs w:val="20"/>
+        </w:rPr>
+        <w:t xml:space="preserve">тестовая строка</w:t>
+      </w:r>
+    </w:p>
+    <w:p>
+      <w:pPr>
+        <w:pBdr>
+          <w:left w:val="single" w:color="808080" w:sz="12" w:space="6"/>
+        </w:pBdr>
+        <w:shd w:fill="F2F2F2" w:val="clear"/>
+        <w:spacing w:after="0" w:line="260"/>
+        <w:ind w:left="200"/>
+      </w:pPr>
+      <w:r>
+        <w:rPr>
+          <w:rFonts w:ascii="Courier New" w:cs="Courier New" w:eastAsia="Courier New" w:hAnsi="Courier New"/>
+          <w:sz w:val="20"/>
+          <w:szCs w:val="20"/>
+        </w:rPr>
+        <w:t xml:space="preserve">$ mv test.txt example.txt</w:t>
+      </w:r>
+    </w:p>
+    <w:p>
+      <w:pPr>
+        <w:pBdr>
+          <w:left w:val="single" w:color="808080" w:sz="12" w:space="6"/>
+        </w:pBdr>
+        <w:shd w:fill="F2F2F2" w:val="clear"/>
+        <w:spacing w:after="0" w:line="260"/>
+        <w:ind w:left="200"/>
+      </w:pPr>
+      <w:r>
+        <w:rPr>
+          <w:rFonts w:ascii="Courier New" w:cs="Courier New" w:eastAsia="Courier New" w:hAnsi="Courier New"/>
+          <w:sz w:val="20"/>
+          <w:szCs w:val="20"/>
+        </w:rPr>
+        <w:t xml:space="preserve">$ ls</w:t>
+      </w:r>
+    </w:p>
+    <w:p>
+      <w:pPr>
+        <w:pBdr>
+          <w:left w:val="single" w:color="808080" w:sz="12" w:space="6"/>
+        </w:pBdr>
+        <w:shd w:fill="F2F2F2" w:val="clear"/>
+        <w:spacing w:after="0" w:line="260"/>
+        <w:ind w:left="200"/>
+      </w:pPr>
+      <w:r>
+        <w:rPr>
+          <w:rFonts w:ascii="Courier New" w:cs="Courier New" w:eastAsia="Courier New" w:hAnsi="Courier New"/>
+          <w:sz w:val="20"/>
+          <w:szCs w:val="20"/>
+        </w:rPr>
+        <w:t xml:space="preserve">data</w:t>
+      </w:r>
+    </w:p>
+    <w:p>
+      <w:pPr>
+        <w:pBdr>
+          <w:left w:val="single" w:color="808080" w:sz="12" w:space="6"/>
+        </w:pBdr>
+        <w:shd w:fill="F2F2F2" w:val="clear"/>
+        <w:spacing w:after="0" w:line="260"/>
+        <w:ind w:left="200"/>
+      </w:pPr>
+      <w:r>
+        <w:rPr>
+          <w:rFonts w:ascii="Courier New" w:cs="Courier New" w:eastAsia="Courier New" w:hAnsi="Courier New"/>
+          <w:sz w:val="20"/>
+          <w:szCs w:val="20"/>
+        </w:rPr>
+        <w:t xml:space="preserve">example.txt</w:t>
+      </w:r>
+    </w:p>
+    <w:p>
+      <w:pPr>
+        <w:pBdr>
+          <w:left w:val="single" w:color="808080" w:sz="12" w:space="6"/>
+        </w:pBdr>
+        <w:shd w:fill="F2F2F2" w:val="clear"/>
+        <w:spacing w:after="0" w:line="260"/>
+        <w:ind w:left="200"/>
+      </w:pPr>
+      <w:r>
+        <w:rPr>
+          <w:rFonts w:ascii="Courier New" w:cs="Courier New" w:eastAsia="Courier New" w:hAnsi="Courier New"/>
+          <w:sz w:val="20"/>
+          <w:szCs w:val="20"/>
+        </w:rPr>
+        <w:t xml:space="preserve">results</w:t>
+      </w:r>
+    </w:p>
+    <w:p>
+      <w:pPr>
+        <w:pBdr>
+          <w:left w:val="single" w:color="808080" w:sz="12" w:space="6"/>
+        </w:pBdr>
+        <w:shd w:fill="F2F2F2" w:val="clear"/>
+        <w:spacing w:after="0" w:line="260"/>
+        <w:ind w:left="200"/>
+      </w:pPr>
+      <w:r>
+        <w:rPr>
+          <w:rFonts w:ascii="Courier New" w:cs="Courier New" w:eastAsia="Courier New" w:hAnsi="Courier New"/>
+          <w:sz w:val="20"/>
+          <w:szCs w:val="20"/>
+        </w:rPr>
+        <w:t xml:space="preserve">scripts</w:t>
+      </w:r>
+    </w:p>
+    <w:p>
+      <w:pPr>
+        <w:pBdr>
+          <w:left w:val="single" w:color="808080" w:sz="12" w:space="6"/>
+        </w:pBdr>
+        <w:shd w:fill="F2F2F2" w:val="clear"/>
+        <w:spacing w:after="0" w:line="260"/>
+        <w:ind w:left="200"/>
+      </w:pPr>
+      <w:r>
+        <w:rPr>
+          <w:rFonts w:ascii="Courier New" w:cs="Courier New" w:eastAsia="Courier New" w:hAnsi="Courier New"/>
+          <w:sz w:val="20"/>
+          <w:szCs w:val="20"/>
+        </w:rPr>
+        <w:t xml:space="preserve">students.txt</w:t>
       </w:r>
     </w:p>
     <w:p>
@@ -1374,6 +1371,24 @@
           <w:sz w:val="20"/>
           <w:szCs w:val="20"/>
         </w:rPr>
+        <w:t xml:space="preserve">Иванов И.И. 2005 Москва 4.5</w:t>
+      </w:r>
+    </w:p>
+    <w:p>
+      <w:pPr>
+        <w:pBdr>
+          <w:left w:val="single" w:color="808080" w:sz="12" w:space="6"/>
+        </w:pBdr>
+        <w:shd w:fill="F2F2F2" w:val="clear"/>
+        <w:spacing w:after="0" w:line="260"/>
+        <w:ind w:left="200"/>
+      </w:pPr>
+      <w:r>
+        <w:rPr>
+          <w:rFonts w:ascii="Courier New" w:cs="Courier New" w:eastAsia="Courier New" w:hAnsi="Courier New"/>
+          <w:sz w:val="20"/>
+          <w:szCs w:val="20"/>
+        </w:rPr>
         <w:t xml:space="preserve">$ grep "Казань" students.txt</w:t>
       </w:r>
     </w:p>
@@ -1392,6 +1407,42 @@
           <w:sz w:val="20"/>
           <w:szCs w:val="20"/>
         </w:rPr>
+        <w:t xml:space="preserve">Петров П.С. 2006 Казань 4.2</w:t>
+      </w:r>
+    </w:p>
+    <w:p>
+      <w:pPr>
+        <w:pBdr>
+          <w:left w:val="single" w:color="808080" w:sz="12" w:space="6"/>
+        </w:pBdr>
+        <w:shd w:fill="F2F2F2" w:val="clear"/>
+        <w:spacing w:after="0" w:line="260"/>
+        <w:ind w:left="200"/>
+      </w:pPr>
+      <w:r>
+        <w:rPr>
+          <w:rFonts w:ascii="Courier New" w:cs="Courier New" w:eastAsia="Courier New" w:hAnsi="Courier New"/>
+          <w:sz w:val="20"/>
+          <w:szCs w:val="20"/>
+        </w:rPr>
+        <w:t xml:space="preserve">$ sort students.txt</w:t>
+      </w:r>
+    </w:p>
+    <w:p>
+      <w:pPr>
+        <w:pBdr>
+          <w:left w:val="single" w:color="808080" w:sz="12" w:space="6"/>
+        </w:pBdr>
+        <w:shd w:fill="F2F2F2" w:val="clear"/>
+        <w:spacing w:after="0" w:line="260"/>
+        <w:ind w:left="200"/>
+      </w:pPr>
+      <w:r>
+        <w:rPr>
+          <w:rFonts w:ascii="Courier New" w:cs="Courier New" w:eastAsia="Courier New" w:hAnsi="Courier New"/>
+          <w:sz w:val="20"/>
+          <w:szCs w:val="20"/>
+        </w:rPr>
         <w:t xml:space="preserve">Иванов И.И. 2005 Москва 4.5</w:t>
       </w:r>
     </w:p>
@@ -1410,6 +1461,24 @@
           <w:sz w:val="20"/>
           <w:szCs w:val="20"/>
         </w:rPr>
+        <w:t xml:space="preserve">Кузнецова М.И. 2005 Самара 4.6</w:t>
+      </w:r>
+    </w:p>
+    <w:p>
+      <w:pPr>
+        <w:pBdr>
+          <w:left w:val="single" w:color="808080" w:sz="12" w:space="6"/>
+        </w:pBdr>
+        <w:shd w:fill="F2F2F2" w:val="clear"/>
+        <w:spacing w:after="0" w:line="260"/>
+        <w:ind w:left="200"/>
+      </w:pPr>
+      <w:r>
+        <w:rPr>
+          <w:rFonts w:ascii="Courier New" w:cs="Courier New" w:eastAsia="Courier New" w:hAnsi="Courier New"/>
+          <w:sz w:val="20"/>
+          <w:szCs w:val="20"/>
+        </w:rPr>
         <w:t xml:space="preserve">Петров П.С. 2006 Казань 4.2</w:t>
       </w:r>
     </w:p>
@@ -1428,6 +1497,42 @@
           <w:sz w:val="20"/>
           <w:szCs w:val="20"/>
         </w:rPr>
+        <w:t xml:space="preserve">Сидорова А.В. 2005 Омск 4.8</w:t>
+      </w:r>
+    </w:p>
+    <w:p>
+      <w:pPr>
+        <w:pBdr>
+          <w:left w:val="single" w:color="808080" w:sz="12" w:space="6"/>
+        </w:pBdr>
+        <w:shd w:fill="F2F2F2" w:val="clear"/>
+        <w:spacing w:after="0" w:line="260"/>
+        <w:ind w:left="200"/>
+      </w:pPr>
+      <w:r>
+        <w:rPr>
+          <w:rFonts w:ascii="Courier New" w:cs="Courier New" w:eastAsia="Courier New" w:hAnsi="Courier New"/>
+          <w:sz w:val="20"/>
+          <w:szCs w:val="20"/>
+        </w:rPr>
+        <w:t xml:space="preserve">Смирнов Д.А. 2006 Томск 3.9</w:t>
+      </w:r>
+    </w:p>
+    <w:p>
+      <w:pPr>
+        <w:pBdr>
+          <w:left w:val="single" w:color="808080" w:sz="12" w:space="6"/>
+        </w:pBdr>
+        <w:shd w:fill="F2F2F2" w:val="clear"/>
+        <w:spacing w:after="0" w:line="260"/>
+        <w:ind w:left="200"/>
+      </w:pPr>
+      <w:r>
+        <w:rPr>
+          <w:rFonts w:ascii="Courier New" w:cs="Courier New" w:eastAsia="Courier New" w:hAnsi="Courier New"/>
+          <w:sz w:val="20"/>
+          <w:szCs w:val="20"/>
+        </w:rPr>
         <w:t xml:space="preserve">$ sort students.txt &gt; sorted_students.txt</w:t>
       </w:r>
     </w:p>
@@ -1554,61 +1659,61 @@
           <w:sz w:val="20"/>
           <w:szCs w:val="20"/>
         </w:rPr>
-        <w:t xml:space="preserve">$ wc -l students.txt sorted_students.txt</w:t>
-      </w:r>
-    </w:p>
-    <w:p>
-      <w:pPr>
-        <w:pBdr>
-          <w:left w:val="single" w:color="808080" w:sz="12" w:space="6"/>
-        </w:pBdr>
-        <w:shd w:fill="F2F2F2" w:val="clear"/>
-        <w:spacing w:after="0" w:line="260"/>
-        <w:ind w:left="200"/>
-      </w:pPr>
-      <w:r>
-        <w:rPr>
-          <w:rFonts w:ascii="Courier New" w:cs="Courier New" w:eastAsia="Courier New" w:hAnsi="Courier New"/>
-          <w:sz w:val="20"/>
-          <w:szCs w:val="20"/>
-        </w:rPr>
-        <w:t xml:space="preserve">  5 students.txt</w:t>
-      </w:r>
-    </w:p>
-    <w:p>
-      <w:pPr>
-        <w:pBdr>
-          <w:left w:val="single" w:color="808080" w:sz="12" w:space="6"/>
-        </w:pBdr>
-        <w:shd w:fill="F2F2F2" w:val="clear"/>
-        <w:spacing w:after="0" w:line="260"/>
-        <w:ind w:left="200"/>
-      </w:pPr>
-      <w:r>
-        <w:rPr>
-          <w:rFonts w:ascii="Courier New" w:cs="Courier New" w:eastAsia="Courier New" w:hAnsi="Courier New"/>
-          <w:sz w:val="20"/>
-          <w:szCs w:val="20"/>
-        </w:rPr>
-        <w:t xml:space="preserve">  5 sorted_students.txt</w:t>
-      </w:r>
-    </w:p>
-    <w:p>
-      <w:pPr>
-        <w:pBdr>
-          <w:left w:val="single" w:color="808080" w:sz="12" w:space="6"/>
-        </w:pBdr>
-        <w:shd w:fill="F2F2F2" w:val="clear"/>
-        <w:spacing w:after="0" w:line="260"/>
-        <w:ind w:left="200"/>
-      </w:pPr>
-      <w:r>
-        <w:rPr>
-          <w:rFonts w:ascii="Courier New" w:cs="Courier New" w:eastAsia="Courier New" w:hAnsi="Courier New"/>
-          <w:sz w:val="20"/>
-          <w:szCs w:val="20"/>
-        </w:rPr>
-        <w:t xml:space="preserve"> 10 total</w:t>
+        <w:t xml:space="preserve">$ wc -l students.txt</w:t>
+      </w:r>
+    </w:p>
+    <w:p>
+      <w:pPr>
+        <w:pBdr>
+          <w:left w:val="single" w:color="808080" w:sz="12" w:space="6"/>
+        </w:pBdr>
+        <w:shd w:fill="F2F2F2" w:val="clear"/>
+        <w:spacing w:after="0" w:line="260"/>
+        <w:ind w:left="200"/>
+      </w:pPr>
+      <w:r>
+        <w:rPr>
+          <w:rFonts w:ascii="Courier New" w:cs="Courier New" w:eastAsia="Courier New" w:hAnsi="Courier New"/>
+          <w:sz w:val="20"/>
+          <w:szCs w:val="20"/>
+        </w:rPr>
+        <w:t xml:space="preserve">5 students.txt</w:t>
+      </w:r>
+    </w:p>
+    <w:p>
+      <w:pPr>
+        <w:pBdr>
+          <w:left w:val="single" w:color="808080" w:sz="12" w:space="6"/>
+        </w:pBdr>
+        <w:shd w:fill="F2F2F2" w:val="clear"/>
+        <w:spacing w:after="0" w:line="260"/>
+        <w:ind w:left="200"/>
+      </w:pPr>
+      <w:r>
+        <w:rPr>
+          <w:rFonts w:ascii="Courier New" w:cs="Courier New" w:eastAsia="Courier New" w:hAnsi="Courier New"/>
+          <w:sz w:val="20"/>
+          <w:szCs w:val="20"/>
+        </w:rPr>
+        <w:t xml:space="preserve">$ wc -l sorted_students.txt</w:t>
+      </w:r>
+    </w:p>
+    <w:p>
+      <w:pPr>
+        <w:pBdr>
+          <w:left w:val="single" w:color="808080" w:sz="12" w:space="6"/>
+        </w:pBdr>
+        <w:shd w:fill="F2F2F2" w:val="clear"/>
+        <w:spacing w:after="0" w:line="260"/>
+        <w:ind w:left="200"/>
+      </w:pPr>
+      <w:r>
+        <w:rPr>
+          <w:rFonts w:ascii="Courier New" w:cs="Courier New" w:eastAsia="Courier New" w:hAnsi="Courier New"/>
+          <w:sz w:val="20"/>
+          <w:szCs w:val="20"/>
+        </w:rPr>
+        <w:t xml:space="preserve">5 sorted_students.txt</w:t>
       </w:r>
     </w:p>
     <w:p>
@@ -1752,6 +1857,60 @@
           <w:sz w:val="20"/>
           <w:szCs w:val="20"/>
         </w:rPr>
+        <w:t xml:space="preserve"> </w:t>
+      </w:r>
+    </w:p>
+    <w:p>
+      <w:pPr>
+        <w:pBdr>
+          <w:left w:val="single" w:color="808080" w:sz="12" w:space="6"/>
+        </w:pBdr>
+        <w:shd w:fill="F2F2F2" w:val="clear"/>
+        <w:spacing w:after="0" w:line="260"/>
+        <w:ind w:left="200"/>
+      </w:pPr>
+      <w:r>
+        <w:rPr>
+          <w:rFonts w:ascii="Courier New" w:cs="Courier New" w:eastAsia="Courier New" w:hAnsi="Courier New"/>
+          <w:sz w:val="20"/>
+          <w:szCs w:val="20"/>
+        </w:rPr>
+        <w:t xml:space="preserve">Результат:</w:t>
+      </w:r>
+    </w:p>
+    <w:p>
+      <w:pPr>
+        <w:pBdr>
+          <w:left w:val="single" w:color="808080" w:sz="12" w:space="6"/>
+        </w:pBdr>
+        <w:shd w:fill="F2F2F2" w:val="clear"/>
+        <w:spacing w:after="0" w:line="260"/>
+        <w:ind w:left="200"/>
+      </w:pPr>
+      <w:r>
+        <w:rPr>
+          <w:rFonts w:ascii="Courier New" w:cs="Courier New" w:eastAsia="Courier New" w:hAnsi="Courier New"/>
+          <w:sz w:val="20"/>
+          <w:szCs w:val="20"/>
+        </w:rPr>
+        <w:t xml:space="preserve">$ echo "$student"</w:t>
+      </w:r>
+    </w:p>
+    <w:p>
+      <w:pPr>
+        <w:pBdr>
+          <w:left w:val="single" w:color="808080" w:sz="12" w:space="6"/>
+        </w:pBdr>
+        <w:shd w:fill="F2F2F2" w:val="clear"/>
+        <w:spacing w:after="0" w:line="260"/>
+        <w:ind w:left="200"/>
+      </w:pPr>
+      <w:r>
+        <w:rPr>
+          <w:rFonts w:ascii="Courier New" w:cs="Courier New" w:eastAsia="Courier New" w:hAnsi="Courier New"/>
+          <w:sz w:val="20"/>
+          <w:szCs w:val="20"/>
+        </w:rPr>
         <w:t xml:space="preserve">Иванов И.И.</w:t>
       </w:r>
     </w:p>
@@ -1770,6 +1929,24 @@
           <w:sz w:val="20"/>
           <w:szCs w:val="20"/>
         </w:rPr>
+        <w:t xml:space="preserve">$ echo "$year"</w:t>
+      </w:r>
+    </w:p>
+    <w:p>
+      <w:pPr>
+        <w:pBdr>
+          <w:left w:val="single" w:color="808080" w:sz="12" w:space="6"/>
+        </w:pBdr>
+        <w:shd w:fill="F2F2F2" w:val="clear"/>
+        <w:spacing w:after="0" w:line="260"/>
+        <w:ind w:left="200"/>
+      </w:pPr>
+      <w:r>
+        <w:rPr>
+          <w:rFonts w:ascii="Courier New" w:cs="Courier New" w:eastAsia="Courier New" w:hAnsi="Courier New"/>
+          <w:sz w:val="20"/>
+          <w:szCs w:val="20"/>
+        </w:rPr>
         <w:t xml:space="preserve">2005</w:t>
       </w:r>
     </w:p>
@@ -1788,6 +1965,24 @@
           <w:sz w:val="20"/>
           <w:szCs w:val="20"/>
         </w:rPr>
+        <w:t xml:space="preserve">$ echo "$city"</w:t>
+      </w:r>
+    </w:p>
+    <w:p>
+      <w:pPr>
+        <w:pBdr>
+          <w:left w:val="single" w:color="808080" w:sz="12" w:space="6"/>
+        </w:pBdr>
+        <w:shd w:fill="F2F2F2" w:val="clear"/>
+        <w:spacing w:after="0" w:line="260"/>
+        <w:ind w:left="200"/>
+      </w:pPr>
+      <w:r>
+        <w:rPr>
+          <w:rFonts w:ascii="Courier New" w:cs="Courier New" w:eastAsia="Courier New" w:hAnsi="Courier New"/>
+          <w:sz w:val="20"/>
+          <w:szCs w:val="20"/>
+        </w:rPr>
         <w:t xml:space="preserve">Москва</w:t>
       </w:r>
     </w:p>
@@ -1806,6 +2001,132 @@
           <w:sz w:val="20"/>
           <w:szCs w:val="20"/>
         </w:rPr>
+        <w:t xml:space="preserve">$ cat "$filename"</w:t>
+      </w:r>
+    </w:p>
+    <w:p>
+      <w:pPr>
+        <w:pBdr>
+          <w:left w:val="single" w:color="808080" w:sz="12" w:space="6"/>
+        </w:pBdr>
+        <w:shd w:fill="F2F2F2" w:val="clear"/>
+        <w:spacing w:after="0" w:line="260"/>
+        <w:ind w:left="200"/>
+      </w:pPr>
+      <w:r>
+        <w:rPr>
+          <w:rFonts w:ascii="Courier New" w:cs="Courier New" w:eastAsia="Courier New" w:hAnsi="Courier New"/>
+          <w:sz w:val="20"/>
+          <w:szCs w:val="20"/>
+        </w:rPr>
+        <w:t xml:space="preserve">Иванов И.И. 2005 Москва 4.5</w:t>
+      </w:r>
+    </w:p>
+    <w:p>
+      <w:pPr>
+        <w:pBdr>
+          <w:left w:val="single" w:color="808080" w:sz="12" w:space="6"/>
+        </w:pBdr>
+        <w:shd w:fill="F2F2F2" w:val="clear"/>
+        <w:spacing w:after="0" w:line="260"/>
+        <w:ind w:left="200"/>
+      </w:pPr>
+      <w:r>
+        <w:rPr>
+          <w:rFonts w:ascii="Courier New" w:cs="Courier New" w:eastAsia="Courier New" w:hAnsi="Courier New"/>
+          <w:sz w:val="20"/>
+          <w:szCs w:val="20"/>
+        </w:rPr>
+        <w:t xml:space="preserve">Петров П.С. 2006 Казань 4.2</w:t>
+      </w:r>
+    </w:p>
+    <w:p>
+      <w:pPr>
+        <w:pBdr>
+          <w:left w:val="single" w:color="808080" w:sz="12" w:space="6"/>
+        </w:pBdr>
+        <w:shd w:fill="F2F2F2" w:val="clear"/>
+        <w:spacing w:after="0" w:line="260"/>
+        <w:ind w:left="200"/>
+      </w:pPr>
+      <w:r>
+        <w:rPr>
+          <w:rFonts w:ascii="Courier New" w:cs="Courier New" w:eastAsia="Courier New" w:hAnsi="Courier New"/>
+          <w:sz w:val="20"/>
+          <w:szCs w:val="20"/>
+        </w:rPr>
+        <w:t xml:space="preserve">Сидорова А.В. 2005 Омск 4.8</w:t>
+      </w:r>
+    </w:p>
+    <w:p>
+      <w:pPr>
+        <w:pBdr>
+          <w:left w:val="single" w:color="808080" w:sz="12" w:space="6"/>
+        </w:pBdr>
+        <w:shd w:fill="F2F2F2" w:val="clear"/>
+        <w:spacing w:after="0" w:line="260"/>
+        <w:ind w:left="200"/>
+      </w:pPr>
+      <w:r>
+        <w:rPr>
+          <w:rFonts w:ascii="Courier New" w:cs="Courier New" w:eastAsia="Courier New" w:hAnsi="Courier New"/>
+          <w:sz w:val="20"/>
+          <w:szCs w:val="20"/>
+        </w:rPr>
+        <w:t xml:space="preserve">Смирнов Д.А. 2006 Томск 3.9</w:t>
+      </w:r>
+    </w:p>
+    <w:p>
+      <w:pPr>
+        <w:pBdr>
+          <w:left w:val="single" w:color="808080" w:sz="12" w:space="6"/>
+        </w:pBdr>
+        <w:shd w:fill="F2F2F2" w:val="clear"/>
+        <w:spacing w:after="0" w:line="260"/>
+        <w:ind w:left="200"/>
+      </w:pPr>
+      <w:r>
+        <w:rPr>
+          <w:rFonts w:ascii="Courier New" w:cs="Courier New" w:eastAsia="Courier New" w:hAnsi="Courier New"/>
+          <w:sz w:val="20"/>
+          <w:szCs w:val="20"/>
+        </w:rPr>
+        <w:t xml:space="preserve">Кузнецова М.И. 2005 Самара 4.6</w:t>
+      </w:r>
+    </w:p>
+    <w:p>
+      <w:pPr>
+        <w:pBdr>
+          <w:left w:val="single" w:color="808080" w:sz="12" w:space="6"/>
+        </w:pBdr>
+        <w:shd w:fill="F2F2F2" w:val="clear"/>
+        <w:spacing w:after="0" w:line="260"/>
+        <w:ind w:left="200"/>
+      </w:pPr>
+      <w:r>
+        <w:rPr>
+          <w:rFonts w:ascii="Courier New" w:cs="Courier New" w:eastAsia="Courier New" w:hAnsi="Courier New"/>
+          <w:sz w:val="20"/>
+          <w:szCs w:val="20"/>
+        </w:rPr>
+        <w:t xml:space="preserve">$ echo "Количество записей: $count"</w:t>
+      </w:r>
+    </w:p>
+    <w:p>
+      <w:pPr>
+        <w:pBdr>
+          <w:left w:val="single" w:color="808080" w:sz="12" w:space="6"/>
+        </w:pBdr>
+        <w:shd w:fill="F2F2F2" w:val="clear"/>
+        <w:spacing w:after="0" w:line="260"/>
+        <w:ind w:left="200"/>
+      </w:pPr>
+      <w:r>
+        <w:rPr>
+          <w:rFonts w:ascii="Courier New" w:cs="Courier New" w:eastAsia="Courier New" w:hAnsi="Courier New"/>
+          <w:sz w:val="20"/>
+          <w:szCs w:val="20"/>
+        </w:rPr>
         <w:t xml:space="preserve">Количество записей: 5</w:t>
       </w:r>
     </w:p>
@@ -1824,7 +2145,43 @@
           <w:sz w:val="20"/>
           <w:szCs w:val="20"/>
         </w:rPr>
+        <w:t xml:space="preserve">$ echo "Студент: $name; город: $city; средний балл: $grade"</w:t>
+      </w:r>
+    </w:p>
+    <w:p>
+      <w:pPr>
+        <w:pBdr>
+          <w:left w:val="single" w:color="808080" w:sz="12" w:space="6"/>
+        </w:pBdr>
+        <w:shd w:fill="F2F2F2" w:val="clear"/>
+        <w:spacing w:after="0" w:line="260"/>
+        <w:ind w:left="200"/>
+      </w:pPr>
+      <w:r>
+        <w:rPr>
+          <w:rFonts w:ascii="Courier New" w:cs="Courier New" w:eastAsia="Courier New" w:hAnsi="Courier New"/>
+          <w:sz w:val="20"/>
+          <w:szCs w:val="20"/>
+        </w:rPr>
         <w:t xml:space="preserve">Студент: Иванов И.И.; город: Москва; средний балл: 4.5</w:t>
+      </w:r>
+    </w:p>
+    <w:p>
+      <w:pPr>
+        <w:pBdr>
+          <w:left w:val="single" w:color="808080" w:sz="12" w:space="6"/>
+        </w:pBdr>
+        <w:shd w:fill="F2F2F2" w:val="clear"/>
+        <w:spacing w:after="0" w:line="260"/>
+        <w:ind w:left="200"/>
+      </w:pPr>
+      <w:r>
+        <w:rPr>
+          <w:rFonts w:ascii="Courier New" w:cs="Courier New" w:eastAsia="Courier New" w:hAnsi="Courier New"/>
+          <w:sz w:val="20"/>
+          <w:szCs w:val="20"/>
+        </w:rPr>
+        <w:t xml:space="preserve">$ echo "Студент: $name; город: $city; средний балл: $grade"</w:t>
       </w:r>
     </w:p>
     <w:p>
@@ -2026,25 +2383,79 @@
           <w:sz w:val="20"/>
           <w:szCs w:val="20"/>
         </w:rPr>
-        <w:t xml:space="preserve">g=4 Условие выполнено</w:t>
-      </w:r>
-    </w:p>
-    <w:p>
-      <w:pPr>
-        <w:pBdr>
-          <w:left w:val="single" w:color="808080" w:sz="12" w:space="6"/>
-        </w:pBdr>
-        <w:shd w:fill="F2F2F2" w:val="clear"/>
-        <w:spacing w:after="0" w:line="260"/>
-        <w:ind w:left="200"/>
-      </w:pPr>
-      <w:r>
-        <w:rPr>
-          <w:rFonts w:ascii="Courier New" w:cs="Courier New" w:eastAsia="Courier New" w:hAnsi="Courier New"/>
-          <w:sz w:val="20"/>
-          <w:szCs w:val="20"/>
-        </w:rPr>
-        <w:t xml:space="preserve">g=3 Условие не выполнено</w:t>
+        <w:t xml:space="preserve">Результат:</w:t>
+      </w:r>
+    </w:p>
+    <w:p>
+      <w:pPr>
+        <w:pBdr>
+          <w:left w:val="single" w:color="808080" w:sz="12" w:space="6"/>
+        </w:pBdr>
+        <w:shd w:fill="F2F2F2" w:val="clear"/>
+        <w:spacing w:after="0" w:line="260"/>
+        <w:ind w:left="200"/>
+      </w:pPr>
+      <w:r>
+        <w:rPr>
+          <w:rFonts w:ascii="Courier New" w:cs="Courier New" w:eastAsia="Courier New" w:hAnsi="Courier New"/>
+          <w:sz w:val="20"/>
+          <w:szCs w:val="20"/>
+        </w:rPr>
+        <w:t xml:space="preserve">grade=4</w:t>
+      </w:r>
+    </w:p>
+    <w:p>
+      <w:pPr>
+        <w:pBdr>
+          <w:left w:val="single" w:color="808080" w:sz="12" w:space="6"/>
+        </w:pBdr>
+        <w:shd w:fill="F2F2F2" w:val="clear"/>
+        <w:spacing w:after="0" w:line="260"/>
+        <w:ind w:left="200"/>
+      </w:pPr>
+      <w:r>
+        <w:rPr>
+          <w:rFonts w:ascii="Courier New" w:cs="Courier New" w:eastAsia="Courier New" w:hAnsi="Courier New"/>
+          <w:sz w:val="20"/>
+          <w:szCs w:val="20"/>
+        </w:rPr>
+        <w:t xml:space="preserve">Условие выполнено</w:t>
+      </w:r>
+    </w:p>
+    <w:p>
+      <w:pPr>
+        <w:pBdr>
+          <w:left w:val="single" w:color="808080" w:sz="12" w:space="6"/>
+        </w:pBdr>
+        <w:shd w:fill="F2F2F2" w:val="clear"/>
+        <w:spacing w:after="0" w:line="260"/>
+        <w:ind w:left="200"/>
+      </w:pPr>
+      <w:r>
+        <w:rPr>
+          <w:rFonts w:ascii="Courier New" w:cs="Courier New" w:eastAsia="Courier New" w:hAnsi="Courier New"/>
+          <w:sz w:val="20"/>
+          <w:szCs w:val="20"/>
+        </w:rPr>
+        <w:t xml:space="preserve">grade=3</w:t>
+      </w:r>
+    </w:p>
+    <w:p>
+      <w:pPr>
+        <w:pBdr>
+          <w:left w:val="single" w:color="808080" w:sz="12" w:space="6"/>
+        </w:pBdr>
+        <w:shd w:fill="F2F2F2" w:val="clear"/>
+        <w:spacing w:after="0" w:line="260"/>
+        <w:ind w:left="200"/>
+      </w:pPr>
+      <w:r>
+        <w:rPr>
+          <w:rFonts w:ascii="Courier New" w:cs="Courier New" w:eastAsia="Courier New" w:hAnsi="Courier New"/>
+          <w:sz w:val="20"/>
+          <w:szCs w:val="20"/>
+        </w:rPr>
+        <w:t xml:space="preserve">Условие не выполнено</w:t>
       </w:r>
     </w:p>
     <w:p>
@@ -2098,43 +2509,43 @@
           <w:sz w:val="20"/>
           <w:szCs w:val="20"/>
         </w:rPr>
-        <w:t xml:space="preserve">count=5 Записей достаточно</w:t>
-      </w:r>
-    </w:p>
-    <w:p>
-      <w:pPr>
-        <w:pBdr>
-          <w:left w:val="single" w:color="808080" w:sz="12" w:space="6"/>
-        </w:pBdr>
-        <w:shd w:fill="F2F2F2" w:val="clear"/>
-        <w:spacing w:after="0" w:line="260"/>
-        <w:ind w:left="200"/>
-      </w:pPr>
-      <w:r>
-        <w:rPr>
-          <w:rFonts w:ascii="Courier New" w:cs="Courier New" w:eastAsia="Courier New" w:hAnsi="Courier New"/>
-          <w:sz w:val="20"/>
-          <w:szCs w:val="20"/>
-        </w:rPr>
-        <w:t xml:space="preserve">count=3 Необходимо добавить записи</w:t>
-      </w:r>
-    </w:p>
-    <w:p>
-      <w:pPr>
-        <w:pBdr>
-          <w:left w:val="single" w:color="808080" w:sz="12" w:space="6"/>
-        </w:pBdr>
-        <w:shd w:fill="F2F2F2" w:val="clear"/>
-        <w:spacing w:after="0" w:line="260"/>
-        <w:ind w:left="200"/>
-      </w:pPr>
-      <w:r>
-        <w:rPr>
-          <w:rFonts w:ascii="Courier New" w:cs="Courier New" w:eastAsia="Courier New" w:hAnsi="Courier New"/>
-          <w:sz w:val="20"/>
-          <w:szCs w:val="20"/>
-        </w:rPr>
-        <w:t xml:space="preserve">count=7 Записей достаточно</w:t>
+        <w:t xml:space="preserve">count=5: Записей достаточно</w:t>
+      </w:r>
+    </w:p>
+    <w:p>
+      <w:pPr>
+        <w:pBdr>
+          <w:left w:val="single" w:color="808080" w:sz="12" w:space="6"/>
+        </w:pBdr>
+        <w:shd w:fill="F2F2F2" w:val="clear"/>
+        <w:spacing w:after="0" w:line="260"/>
+        <w:ind w:left="200"/>
+      </w:pPr>
+      <w:r>
+        <w:rPr>
+          <w:rFonts w:ascii="Courier New" w:cs="Courier New" w:eastAsia="Courier New" w:hAnsi="Courier New"/>
+          <w:sz w:val="20"/>
+          <w:szCs w:val="20"/>
+        </w:rPr>
+        <w:t xml:space="preserve">count=3: Необходимо добавить записи</w:t>
+      </w:r>
+    </w:p>
+    <w:p>
+      <w:pPr>
+        <w:pBdr>
+          <w:left w:val="single" w:color="808080" w:sz="12" w:space="6"/>
+        </w:pBdr>
+        <w:shd w:fill="F2F2F2" w:val="clear"/>
+        <w:spacing w:after="0" w:line="260"/>
+        <w:ind w:left="200"/>
+      </w:pPr>
+      <w:r>
+        <w:rPr>
+          <w:rFonts w:ascii="Courier New" w:cs="Courier New" w:eastAsia="Courier New" w:hAnsi="Courier New"/>
+          <w:sz w:val="20"/>
+          <w:szCs w:val="20"/>
+        </w:rPr>
+        <w:t xml:space="preserve">count=7: Записей достаточно</w:t>
       </w:r>
     </w:p>
     <w:p>
@@ -2210,7 +2621,7 @@
           <w:sz w:val="20"/>
           <w:szCs w:val="20"/>
         </w:rPr>
-        <w:t xml:space="preserve">    echo "$i"</w:t>
+        <w:t xml:space="preserve">    echo "Запись № $i"</w:t>
       </w:r>
     </w:p>
     <w:p>
@@ -2318,7 +2729,7 @@
           <w:sz w:val="20"/>
           <w:szCs w:val="20"/>
         </w:rPr>
-        <w:t xml:space="preserve">    echo "$i"</w:t>
+        <w:t xml:space="preserve">    echo "Номер: $i"</w:t>
       </w:r>
     </w:p>
     <w:p>
@@ -2498,25 +2909,349 @@
           <w:sz w:val="20"/>
           <w:szCs w:val="20"/>
         </w:rPr>
-        <w:t xml:space="preserve">1 2 3 4 5 6 7 8 9 10 </w:t>
-      </w:r>
-    </w:p>
-    <w:p>
-      <w:pPr>
-        <w:pBdr>
-          <w:left w:val="single" w:color="808080" w:sz="12" w:space="6"/>
-        </w:pBdr>
-        <w:shd w:fill="F2F2F2" w:val="clear"/>
-        <w:spacing w:after="0" w:line="260"/>
-        <w:ind w:left="200"/>
-      </w:pPr>
-      <w:r>
-        <w:rPr>
-          <w:rFonts w:ascii="Courier New" w:cs="Courier New" w:eastAsia="Courier New" w:hAnsi="Courier New"/>
-          <w:sz w:val="20"/>
-          <w:szCs w:val="20"/>
-        </w:rPr>
-        <w:t xml:space="preserve">1 2 3 4 5 6 7 </w:t>
+        <w:t xml:space="preserve">for 1..10:</w:t>
+      </w:r>
+    </w:p>
+    <w:p>
+      <w:pPr>
+        <w:pBdr>
+          <w:left w:val="single" w:color="808080" w:sz="12" w:space="6"/>
+        </w:pBdr>
+        <w:shd w:fill="F2F2F2" w:val="clear"/>
+        <w:spacing w:after="0" w:line="260"/>
+        <w:ind w:left="200"/>
+      </w:pPr>
+      <w:r>
+        <w:rPr>
+          <w:rFonts w:ascii="Courier New" w:cs="Courier New" w:eastAsia="Courier New" w:hAnsi="Courier New"/>
+          <w:sz w:val="20"/>
+          <w:szCs w:val="20"/>
+        </w:rPr>
+        <w:t xml:space="preserve">Запись № 1</w:t>
+      </w:r>
+    </w:p>
+    <w:p>
+      <w:pPr>
+        <w:pBdr>
+          <w:left w:val="single" w:color="808080" w:sz="12" w:space="6"/>
+        </w:pBdr>
+        <w:shd w:fill="F2F2F2" w:val="clear"/>
+        <w:spacing w:after="0" w:line="260"/>
+        <w:ind w:left="200"/>
+      </w:pPr>
+      <w:r>
+        <w:rPr>
+          <w:rFonts w:ascii="Courier New" w:cs="Courier New" w:eastAsia="Courier New" w:hAnsi="Courier New"/>
+          <w:sz w:val="20"/>
+          <w:szCs w:val="20"/>
+        </w:rPr>
+        <w:t xml:space="preserve">Запись № 2</w:t>
+      </w:r>
+    </w:p>
+    <w:p>
+      <w:pPr>
+        <w:pBdr>
+          <w:left w:val="single" w:color="808080" w:sz="12" w:space="6"/>
+        </w:pBdr>
+        <w:shd w:fill="F2F2F2" w:val="clear"/>
+        <w:spacing w:after="0" w:line="260"/>
+        <w:ind w:left="200"/>
+      </w:pPr>
+      <w:r>
+        <w:rPr>
+          <w:rFonts w:ascii="Courier New" w:cs="Courier New" w:eastAsia="Courier New" w:hAnsi="Courier New"/>
+          <w:sz w:val="20"/>
+          <w:szCs w:val="20"/>
+        </w:rPr>
+        <w:t xml:space="preserve">Запись № 3</w:t>
+      </w:r>
+    </w:p>
+    <w:p>
+      <w:pPr>
+        <w:pBdr>
+          <w:left w:val="single" w:color="808080" w:sz="12" w:space="6"/>
+        </w:pBdr>
+        <w:shd w:fill="F2F2F2" w:val="clear"/>
+        <w:spacing w:after="0" w:line="260"/>
+        <w:ind w:left="200"/>
+      </w:pPr>
+      <w:r>
+        <w:rPr>
+          <w:rFonts w:ascii="Courier New" w:cs="Courier New" w:eastAsia="Courier New" w:hAnsi="Courier New"/>
+          <w:sz w:val="20"/>
+          <w:szCs w:val="20"/>
+        </w:rPr>
+        <w:t xml:space="preserve">Запись № 4</w:t>
+      </w:r>
+    </w:p>
+    <w:p>
+      <w:pPr>
+        <w:pBdr>
+          <w:left w:val="single" w:color="808080" w:sz="12" w:space="6"/>
+        </w:pBdr>
+        <w:shd w:fill="F2F2F2" w:val="clear"/>
+        <w:spacing w:after="0" w:line="260"/>
+        <w:ind w:left="200"/>
+      </w:pPr>
+      <w:r>
+        <w:rPr>
+          <w:rFonts w:ascii="Courier New" w:cs="Courier New" w:eastAsia="Courier New" w:hAnsi="Courier New"/>
+          <w:sz w:val="20"/>
+          <w:szCs w:val="20"/>
+        </w:rPr>
+        <w:t xml:space="preserve">Запись № 5</w:t>
+      </w:r>
+    </w:p>
+    <w:p>
+      <w:pPr>
+        <w:pBdr>
+          <w:left w:val="single" w:color="808080" w:sz="12" w:space="6"/>
+        </w:pBdr>
+        <w:shd w:fill="F2F2F2" w:val="clear"/>
+        <w:spacing w:after="0" w:line="260"/>
+        <w:ind w:left="200"/>
+      </w:pPr>
+      <w:r>
+        <w:rPr>
+          <w:rFonts w:ascii="Courier New" w:cs="Courier New" w:eastAsia="Courier New" w:hAnsi="Courier New"/>
+          <w:sz w:val="20"/>
+          <w:szCs w:val="20"/>
+        </w:rPr>
+        <w:t xml:space="preserve">Запись № 6</w:t>
+      </w:r>
+    </w:p>
+    <w:p>
+      <w:pPr>
+        <w:pBdr>
+          <w:left w:val="single" w:color="808080" w:sz="12" w:space="6"/>
+        </w:pBdr>
+        <w:shd w:fill="F2F2F2" w:val="clear"/>
+        <w:spacing w:after="0" w:line="260"/>
+        <w:ind w:left="200"/>
+      </w:pPr>
+      <w:r>
+        <w:rPr>
+          <w:rFonts w:ascii="Courier New" w:cs="Courier New" w:eastAsia="Courier New" w:hAnsi="Courier New"/>
+          <w:sz w:val="20"/>
+          <w:szCs w:val="20"/>
+        </w:rPr>
+        <w:t xml:space="preserve">Запись № 7</w:t>
+      </w:r>
+    </w:p>
+    <w:p>
+      <w:pPr>
+        <w:pBdr>
+          <w:left w:val="single" w:color="808080" w:sz="12" w:space="6"/>
+        </w:pBdr>
+        <w:shd w:fill="F2F2F2" w:val="clear"/>
+        <w:spacing w:after="0" w:line="260"/>
+        <w:ind w:left="200"/>
+      </w:pPr>
+      <w:r>
+        <w:rPr>
+          <w:rFonts w:ascii="Courier New" w:cs="Courier New" w:eastAsia="Courier New" w:hAnsi="Courier New"/>
+          <w:sz w:val="20"/>
+          <w:szCs w:val="20"/>
+        </w:rPr>
+        <w:t xml:space="preserve">Запись № 8</w:t>
+      </w:r>
+    </w:p>
+    <w:p>
+      <w:pPr>
+        <w:pBdr>
+          <w:left w:val="single" w:color="808080" w:sz="12" w:space="6"/>
+        </w:pBdr>
+        <w:shd w:fill="F2F2F2" w:val="clear"/>
+        <w:spacing w:after="0" w:line="260"/>
+        <w:ind w:left="200"/>
+      </w:pPr>
+      <w:r>
+        <w:rPr>
+          <w:rFonts w:ascii="Courier New" w:cs="Courier New" w:eastAsia="Courier New" w:hAnsi="Courier New"/>
+          <w:sz w:val="20"/>
+          <w:szCs w:val="20"/>
+        </w:rPr>
+        <w:t xml:space="preserve">Запись № 9</w:t>
+      </w:r>
+    </w:p>
+    <w:p>
+      <w:pPr>
+        <w:pBdr>
+          <w:left w:val="single" w:color="808080" w:sz="12" w:space="6"/>
+        </w:pBdr>
+        <w:shd w:fill="F2F2F2" w:val="clear"/>
+        <w:spacing w:after="0" w:line="260"/>
+        <w:ind w:left="200"/>
+      </w:pPr>
+      <w:r>
+        <w:rPr>
+          <w:rFonts w:ascii="Courier New" w:cs="Courier New" w:eastAsia="Courier New" w:hAnsi="Courier New"/>
+          <w:sz w:val="20"/>
+          <w:szCs w:val="20"/>
+        </w:rPr>
+        <w:t xml:space="preserve">Запись № 10</w:t>
+      </w:r>
+    </w:p>
+    <w:p>
+      <w:pPr>
+        <w:pBdr>
+          <w:left w:val="single" w:color="808080" w:sz="12" w:space="6"/>
+        </w:pBdr>
+        <w:shd w:fill="F2F2F2" w:val="clear"/>
+        <w:spacing w:after="0" w:line="260"/>
+        <w:ind w:left="200"/>
+      </w:pPr>
+      <w:r>
+        <w:rPr>
+          <w:rFonts w:ascii="Courier New" w:cs="Courier New" w:eastAsia="Courier New" w:hAnsi="Courier New"/>
+          <w:sz w:val="20"/>
+          <w:szCs w:val="20"/>
+        </w:rPr>
+        <w:t xml:space="preserve">while 1..7:</w:t>
+      </w:r>
+    </w:p>
+    <w:p>
+      <w:pPr>
+        <w:pBdr>
+          <w:left w:val="single" w:color="808080" w:sz="12" w:space="6"/>
+        </w:pBdr>
+        <w:shd w:fill="F2F2F2" w:val="clear"/>
+        <w:spacing w:after="0" w:line="260"/>
+        <w:ind w:left="200"/>
+      </w:pPr>
+      <w:r>
+        <w:rPr>
+          <w:rFonts w:ascii="Courier New" w:cs="Courier New" w:eastAsia="Courier New" w:hAnsi="Courier New"/>
+          <w:sz w:val="20"/>
+          <w:szCs w:val="20"/>
+        </w:rPr>
+        <w:t xml:space="preserve">Номер: 1</w:t>
+      </w:r>
+    </w:p>
+    <w:p>
+      <w:pPr>
+        <w:pBdr>
+          <w:left w:val="single" w:color="808080" w:sz="12" w:space="6"/>
+        </w:pBdr>
+        <w:shd w:fill="F2F2F2" w:val="clear"/>
+        <w:spacing w:after="0" w:line="260"/>
+        <w:ind w:left="200"/>
+      </w:pPr>
+      <w:r>
+        <w:rPr>
+          <w:rFonts w:ascii="Courier New" w:cs="Courier New" w:eastAsia="Courier New" w:hAnsi="Courier New"/>
+          <w:sz w:val="20"/>
+          <w:szCs w:val="20"/>
+        </w:rPr>
+        <w:t xml:space="preserve">Номер: 2</w:t>
+      </w:r>
+    </w:p>
+    <w:p>
+      <w:pPr>
+        <w:pBdr>
+          <w:left w:val="single" w:color="808080" w:sz="12" w:space="6"/>
+        </w:pBdr>
+        <w:shd w:fill="F2F2F2" w:val="clear"/>
+        <w:spacing w:after="0" w:line="260"/>
+        <w:ind w:left="200"/>
+      </w:pPr>
+      <w:r>
+        <w:rPr>
+          <w:rFonts w:ascii="Courier New" w:cs="Courier New" w:eastAsia="Courier New" w:hAnsi="Courier New"/>
+          <w:sz w:val="20"/>
+          <w:szCs w:val="20"/>
+        </w:rPr>
+        <w:t xml:space="preserve">Номер: 3</w:t>
+      </w:r>
+    </w:p>
+    <w:p>
+      <w:pPr>
+        <w:pBdr>
+          <w:left w:val="single" w:color="808080" w:sz="12" w:space="6"/>
+        </w:pBdr>
+        <w:shd w:fill="F2F2F2" w:val="clear"/>
+        <w:spacing w:after="0" w:line="260"/>
+        <w:ind w:left="200"/>
+      </w:pPr>
+      <w:r>
+        <w:rPr>
+          <w:rFonts w:ascii="Courier New" w:cs="Courier New" w:eastAsia="Courier New" w:hAnsi="Courier New"/>
+          <w:sz w:val="20"/>
+          <w:szCs w:val="20"/>
+        </w:rPr>
+        <w:t xml:space="preserve">Номер: 4</w:t>
+      </w:r>
+    </w:p>
+    <w:p>
+      <w:pPr>
+        <w:pBdr>
+          <w:left w:val="single" w:color="808080" w:sz="12" w:space="6"/>
+        </w:pBdr>
+        <w:shd w:fill="F2F2F2" w:val="clear"/>
+        <w:spacing w:after="0" w:line="260"/>
+        <w:ind w:left="200"/>
+      </w:pPr>
+      <w:r>
+        <w:rPr>
+          <w:rFonts w:ascii="Courier New" w:cs="Courier New" w:eastAsia="Courier New" w:hAnsi="Courier New"/>
+          <w:sz w:val="20"/>
+          <w:szCs w:val="20"/>
+        </w:rPr>
+        <w:t xml:space="preserve">Номер: 5</w:t>
+      </w:r>
+    </w:p>
+    <w:p>
+      <w:pPr>
+        <w:pBdr>
+          <w:left w:val="single" w:color="808080" w:sz="12" w:space="6"/>
+        </w:pBdr>
+        <w:shd w:fill="F2F2F2" w:val="clear"/>
+        <w:spacing w:after="0" w:line="260"/>
+        <w:ind w:left="200"/>
+      </w:pPr>
+      <w:r>
+        <w:rPr>
+          <w:rFonts w:ascii="Courier New" w:cs="Courier New" w:eastAsia="Courier New" w:hAnsi="Courier New"/>
+          <w:sz w:val="20"/>
+          <w:szCs w:val="20"/>
+        </w:rPr>
+        <w:t xml:space="preserve">Номер: 6</w:t>
+      </w:r>
+    </w:p>
+    <w:p>
+      <w:pPr>
+        <w:pBdr>
+          <w:left w:val="single" w:color="808080" w:sz="12" w:space="6"/>
+        </w:pBdr>
+        <w:shd w:fill="F2F2F2" w:val="clear"/>
+        <w:spacing w:after="0" w:line="260"/>
+        <w:ind w:left="200"/>
+      </w:pPr>
+      <w:r>
+        <w:rPr>
+          <w:rFonts w:ascii="Courier New" w:cs="Courier New" w:eastAsia="Courier New" w:hAnsi="Courier New"/>
+          <w:sz w:val="20"/>
+          <w:szCs w:val="20"/>
+        </w:rPr>
+        <w:t xml:space="preserve">Номер: 7</w:t>
+      </w:r>
+    </w:p>
+    <w:p>
+      <w:pPr>
+        <w:pBdr>
+          <w:left w:val="single" w:color="808080" w:sz="12" w:space="6"/>
+        </w:pBdr>
+        <w:shd w:fill="F2F2F2" w:val="clear"/>
+        <w:spacing w:after="0" w:line="260"/>
+        <w:ind w:left="200"/>
+      </w:pPr>
+      <w:r>
+        <w:rPr>
+          <w:rFonts w:ascii="Courier New" w:cs="Courier New" w:eastAsia="Courier New" w:hAnsi="Courier New"/>
+          <w:sz w:val="20"/>
+          <w:szCs w:val="20"/>
+        </w:rPr>
+        <w:t xml:space="preserve">Чтение students.txt циклом:</w:t>
       </w:r>
     </w:p>
     <w:p>
@@ -2792,97 +3527,97 @@
           <w:sz w:val="20"/>
           <w:szCs w:val="20"/>
         </w:rPr>
+        <w:t xml:space="preserve">Имя сценария: parameters.sh</w:t>
+      </w:r>
+    </w:p>
+    <w:p>
+      <w:pPr>
+        <w:pBdr>
+          <w:left w:val="single" w:color="808080" w:sz="12" w:space="6"/>
+        </w:pBdr>
+        <w:shd w:fill="F2F2F2" w:val="clear"/>
+        <w:spacing w:after="0" w:line="260"/>
+        <w:ind w:left="200"/>
+      </w:pPr>
+      <w:r>
+        <w:rPr>
+          <w:rFonts w:ascii="Courier New" w:cs="Courier New" w:eastAsia="Courier New" w:hAnsi="Courier New"/>
+          <w:sz w:val="20"/>
+          <w:szCs w:val="20"/>
+        </w:rPr>
+        <w:t xml:space="preserve">Фамилия и инициалы: Иванов И.И.</w:t>
+      </w:r>
+    </w:p>
+    <w:p>
+      <w:pPr>
+        <w:pBdr>
+          <w:left w:val="single" w:color="808080" w:sz="12" w:space="6"/>
+        </w:pBdr>
+        <w:shd w:fill="F2F2F2" w:val="clear"/>
+        <w:spacing w:after="0" w:line="260"/>
+        <w:ind w:left="200"/>
+      </w:pPr>
+      <w:r>
+        <w:rPr>
+          <w:rFonts w:ascii="Courier New" w:cs="Courier New" w:eastAsia="Courier New" w:hAnsi="Courier New"/>
+          <w:sz w:val="20"/>
+          <w:szCs w:val="20"/>
+        </w:rPr>
+        <w:t xml:space="preserve">Город: Москва</w:t>
+      </w:r>
+    </w:p>
+    <w:p>
+      <w:pPr>
+        <w:pBdr>
+          <w:left w:val="single" w:color="808080" w:sz="12" w:space="6"/>
+        </w:pBdr>
+        <w:shd w:fill="F2F2F2" w:val="clear"/>
+        <w:spacing w:after="0" w:line="260"/>
+        <w:ind w:left="200"/>
+      </w:pPr>
+      <w:r>
+        <w:rPr>
+          <w:rFonts w:ascii="Courier New" w:cs="Courier New" w:eastAsia="Courier New" w:hAnsi="Courier New"/>
+          <w:sz w:val="20"/>
+          <w:szCs w:val="20"/>
+        </w:rPr>
+        <w:t xml:space="preserve">Год рождения: 2005</w:t>
+      </w:r>
+    </w:p>
+    <w:p>
+      <w:pPr>
+        <w:pBdr>
+          <w:left w:val="single" w:color="808080" w:sz="12" w:space="6"/>
+        </w:pBdr>
+        <w:shd w:fill="F2F2F2" w:val="clear"/>
+        <w:spacing w:after="0" w:line="260"/>
+        <w:ind w:left="200"/>
+      </w:pPr>
+      <w:r>
+        <w:rPr>
+          <w:rFonts w:ascii="Courier New" w:cs="Courier New" w:eastAsia="Courier New" w:hAnsi="Courier New"/>
+          <w:sz w:val="20"/>
+          <w:szCs w:val="20"/>
+        </w:rPr>
+        <w:t xml:space="preserve">Количество параметров: 3</w:t>
+      </w:r>
+    </w:p>
+    <w:p>
+      <w:pPr>
+        <w:pBdr>
+          <w:left w:val="single" w:color="808080" w:sz="12" w:space="6"/>
+        </w:pBdr>
+        <w:shd w:fill="F2F2F2" w:val="clear"/>
+        <w:spacing w:after="0" w:line="260"/>
+        <w:ind w:left="200"/>
+      </w:pPr>
+      <w:r>
+        <w:rPr>
+          <w:rFonts w:ascii="Courier New" w:cs="Courier New" w:eastAsia="Courier New" w:hAnsi="Courier New"/>
+          <w:sz w:val="20"/>
+          <w:szCs w:val="20"/>
+        </w:rPr>
         <w:t xml:space="preserve">$ bash parameters.sh "Петров П.С." "Казань" 2006</w:t>
-      </w:r>
-    </w:p>
-    <w:p>
-      <w:pPr>
-        <w:pBdr>
-          <w:left w:val="single" w:color="808080" w:sz="12" w:space="6"/>
-        </w:pBdr>
-        <w:shd w:fill="F2F2F2" w:val="clear"/>
-        <w:spacing w:after="0" w:line="260"/>
-        <w:ind w:left="200"/>
-      </w:pPr>
-      <w:r>
-        <w:rPr>
-          <w:rFonts w:ascii="Courier New" w:cs="Courier New" w:eastAsia="Courier New" w:hAnsi="Courier New"/>
-          <w:sz w:val="20"/>
-          <w:szCs w:val="20"/>
-        </w:rPr>
-        <w:t xml:space="preserve">Имя сценария: parameters.sh</w:t>
-      </w:r>
-    </w:p>
-    <w:p>
-      <w:pPr>
-        <w:pBdr>
-          <w:left w:val="single" w:color="808080" w:sz="12" w:space="6"/>
-        </w:pBdr>
-        <w:shd w:fill="F2F2F2" w:val="clear"/>
-        <w:spacing w:after="0" w:line="260"/>
-        <w:ind w:left="200"/>
-      </w:pPr>
-      <w:r>
-        <w:rPr>
-          <w:rFonts w:ascii="Courier New" w:cs="Courier New" w:eastAsia="Courier New" w:hAnsi="Courier New"/>
-          <w:sz w:val="20"/>
-          <w:szCs w:val="20"/>
-        </w:rPr>
-        <w:t xml:space="preserve">Фамилия и инициалы: Иванов И.И.</w:t>
-      </w:r>
-    </w:p>
-    <w:p>
-      <w:pPr>
-        <w:pBdr>
-          <w:left w:val="single" w:color="808080" w:sz="12" w:space="6"/>
-        </w:pBdr>
-        <w:shd w:fill="F2F2F2" w:val="clear"/>
-        <w:spacing w:after="0" w:line="260"/>
-        <w:ind w:left="200"/>
-      </w:pPr>
-      <w:r>
-        <w:rPr>
-          <w:rFonts w:ascii="Courier New" w:cs="Courier New" w:eastAsia="Courier New" w:hAnsi="Courier New"/>
-          <w:sz w:val="20"/>
-          <w:szCs w:val="20"/>
-        </w:rPr>
-        <w:t xml:space="preserve">Город: Москва</w:t>
-      </w:r>
-    </w:p>
-    <w:p>
-      <w:pPr>
-        <w:pBdr>
-          <w:left w:val="single" w:color="808080" w:sz="12" w:space="6"/>
-        </w:pBdr>
-        <w:shd w:fill="F2F2F2" w:val="clear"/>
-        <w:spacing w:after="0" w:line="260"/>
-        <w:ind w:left="200"/>
-      </w:pPr>
-      <w:r>
-        <w:rPr>
-          <w:rFonts w:ascii="Courier New" w:cs="Courier New" w:eastAsia="Courier New" w:hAnsi="Courier New"/>
-          <w:sz w:val="20"/>
-          <w:szCs w:val="20"/>
-        </w:rPr>
-        <w:t xml:space="preserve">Год рождения: 2005</w:t>
-      </w:r>
-    </w:p>
-    <w:p>
-      <w:pPr>
-        <w:pBdr>
-          <w:left w:val="single" w:color="808080" w:sz="12" w:space="6"/>
-        </w:pBdr>
-        <w:shd w:fill="F2F2F2" w:val="clear"/>
-        <w:spacing w:after="0" w:line="260"/>
-        <w:ind w:left="200"/>
-      </w:pPr>
-      <w:r>
-        <w:rPr>
-          <w:rFonts w:ascii="Courier New" w:cs="Courier New" w:eastAsia="Courier New" w:hAnsi="Courier New"/>
-          <w:sz w:val="20"/>
-          <w:szCs w:val="20"/>
-        </w:rPr>
-        <w:t xml:space="preserve">Количество параметров: 3</w:t>
       </w:r>
     </w:p>
     <w:p>
@@ -3155,6 +3890,206 @@
         </w:rPr>
         <w:t xml:space="preserve">Конец.</w:t>
       </w:r>
+    </w:p>
+    <w:p>
+      <w:pPr>
+        <w:spacing w:after="120" w:line="300"/>
+        <w:ind w:firstLine="0"/>
+        <w:jc w:val="both"/>
+      </w:pPr>
+      <w:r>
+        <w:rPr>
+          <w:rFonts w:ascii="Times New Roman" w:cs="Times New Roman" w:eastAsia="Times New Roman" w:hAnsi="Times New Roman"/>
+          <w:sz w:val="24"/>
+          <w:szCs w:val="24"/>
+        </w:rPr>
+        <w:t xml:space="preserve">Результат выполнения проверки на практике:</w:t>
+      </w:r>
+    </w:p>
+    <w:p>
+      <w:pPr>
+        <w:pBdr>
+          <w:left w:val="single" w:color="808080" w:sz="12" w:space="6"/>
+        </w:pBdr>
+        <w:shd w:fill="F2F2F2" w:val="clear"/>
+        <w:spacing w:after="0" w:line="260"/>
+        <w:ind w:left="200"/>
+      </w:pPr>
+      <w:r>
+        <w:rPr>
+          <w:rFonts w:ascii="Courier New" w:cs="Courier New" w:eastAsia="Courier New" w:hAnsi="Courier New"/>
+          <w:sz w:val="20"/>
+          <w:szCs w:val="20"/>
+        </w:rPr>
+        <w:t xml:space="preserve">$ bash scripts/check_students.sh students.txt</w:t>
+      </w:r>
+    </w:p>
+    <w:p>
+      <w:pPr>
+        <w:pBdr>
+          <w:left w:val="single" w:color="808080" w:sz="12" w:space="6"/>
+        </w:pBdr>
+        <w:shd w:fill="F2F2F2" w:val="clear"/>
+        <w:spacing w:after="0" w:line="260"/>
+        <w:ind w:left="200"/>
+      </w:pPr>
+      <w:r>
+        <w:rPr>
+          <w:rFonts w:ascii="Courier New" w:cs="Courier New" w:eastAsia="Courier New" w:hAnsi="Courier New"/>
+          <w:sz w:val="20"/>
+          <w:szCs w:val="20"/>
+        </w:rPr>
+        <w:t xml:space="preserve">Иванов И.И. 2005 Москва 4.5</w:t>
+      </w:r>
+    </w:p>
+    <w:p>
+      <w:pPr>
+        <w:pBdr>
+          <w:left w:val="single" w:color="808080" w:sz="12" w:space="6"/>
+        </w:pBdr>
+        <w:shd w:fill="F2F2F2" w:val="clear"/>
+        <w:spacing w:after="0" w:line="260"/>
+        <w:ind w:left="200"/>
+      </w:pPr>
+      <w:r>
+        <w:rPr>
+          <w:rFonts w:ascii="Courier New" w:cs="Courier New" w:eastAsia="Courier New" w:hAnsi="Courier New"/>
+          <w:sz w:val="20"/>
+          <w:szCs w:val="20"/>
+        </w:rPr>
+        <w:t xml:space="preserve">Петров П.С. 2006 Казань 4.2</w:t>
+      </w:r>
+    </w:p>
+    <w:p>
+      <w:pPr>
+        <w:pBdr>
+          <w:left w:val="single" w:color="808080" w:sz="12" w:space="6"/>
+        </w:pBdr>
+        <w:shd w:fill="F2F2F2" w:val="clear"/>
+        <w:spacing w:after="0" w:line="260"/>
+        <w:ind w:left="200"/>
+      </w:pPr>
+      <w:r>
+        <w:rPr>
+          <w:rFonts w:ascii="Courier New" w:cs="Courier New" w:eastAsia="Courier New" w:hAnsi="Courier New"/>
+          <w:sz w:val="20"/>
+          <w:szCs w:val="20"/>
+        </w:rPr>
+        <w:t xml:space="preserve">Сидорова А.В. 2005 Омск 4.8</w:t>
+      </w:r>
+    </w:p>
+    <w:p>
+      <w:pPr>
+        <w:pBdr>
+          <w:left w:val="single" w:color="808080" w:sz="12" w:space="6"/>
+        </w:pBdr>
+        <w:shd w:fill="F2F2F2" w:val="clear"/>
+        <w:spacing w:after="0" w:line="260"/>
+        <w:ind w:left="200"/>
+      </w:pPr>
+      <w:r>
+        <w:rPr>
+          <w:rFonts w:ascii="Courier New" w:cs="Courier New" w:eastAsia="Courier New" w:hAnsi="Courier New"/>
+          <w:sz w:val="20"/>
+          <w:szCs w:val="20"/>
+        </w:rPr>
+        <w:t xml:space="preserve">Смирнов Д.А. 2006 Томск 3.9</w:t>
+      </w:r>
+    </w:p>
+    <w:p>
+      <w:pPr>
+        <w:pBdr>
+          <w:left w:val="single" w:color="808080" w:sz="12" w:space="6"/>
+        </w:pBdr>
+        <w:shd w:fill="F2F2F2" w:val="clear"/>
+        <w:spacing w:after="0" w:line="260"/>
+        <w:ind w:left="200"/>
+      </w:pPr>
+      <w:r>
+        <w:rPr>
+          <w:rFonts w:ascii="Courier New" w:cs="Courier New" w:eastAsia="Courier New" w:hAnsi="Courier New"/>
+          <w:sz w:val="20"/>
+          <w:szCs w:val="20"/>
+        </w:rPr>
+        <w:t xml:space="preserve">Кузнецова М.И. 2005 Самара 4.6</w:t>
+      </w:r>
+    </w:p>
+    <w:p>
+      <w:pPr>
+        <w:pBdr>
+          <w:left w:val="single" w:color="808080" w:sz="12" w:space="6"/>
+        </w:pBdr>
+        <w:shd w:fill="F2F2F2" w:val="clear"/>
+        <w:spacing w:after="0" w:line="260"/>
+        <w:ind w:left="200"/>
+      </w:pPr>
+      <w:r>
+        <w:rPr>
+          <w:rFonts w:ascii="Courier New" w:cs="Courier New" w:eastAsia="Courier New" w:hAnsi="Courier New"/>
+          <w:sz w:val="20"/>
+          <w:szCs w:val="20"/>
+        </w:rPr>
+        <w:t xml:space="preserve">Количество записей: 5</w:t>
+      </w:r>
+    </w:p>
+    <w:p>
+      <w:pPr>
+        <w:pBdr>
+          <w:left w:val="single" w:color="808080" w:sz="12" w:space="6"/>
+        </w:pBdr>
+        <w:shd w:fill="F2F2F2" w:val="clear"/>
+        <w:spacing w:after="0" w:line="260"/>
+        <w:ind w:left="200"/>
+      </w:pPr>
+      <w:r>
+        <w:rPr>
+          <w:rFonts w:ascii="Courier New" w:cs="Courier New" w:eastAsia="Courier New" w:hAnsi="Courier New"/>
+          <w:sz w:val="20"/>
+          <w:szCs w:val="20"/>
+        </w:rPr>
+        <w:t xml:space="preserve">Записей достаточно</w:t>
+      </w:r>
+    </w:p>
+    <w:p>
+      <w:pPr>
+        <w:pBdr>
+          <w:left w:val="single" w:color="808080" w:sz="12" w:space="6"/>
+        </w:pBdr>
+        <w:shd w:fill="F2F2F2" w:val="clear"/>
+        <w:spacing w:after="0" w:line="260"/>
+        <w:ind w:left="200"/>
+      </w:pPr>
+      <w:r>
+        <w:rPr>
+          <w:rFonts w:ascii="Courier New" w:cs="Courier New" w:eastAsia="Courier New" w:hAnsi="Courier New"/>
+          <w:sz w:val="20"/>
+          <w:szCs w:val="20"/>
+        </w:rPr>
+        <w:t xml:space="preserve">$ bash scripts/check_students.sh missing.txt</w:t>
+      </w:r>
+    </w:p>
+    <w:p>
+      <w:pPr>
+        <w:pBdr>
+          <w:left w:val="single" w:color="808080" w:sz="12" w:space="6"/>
+        </w:pBdr>
+        <w:shd w:fill="F2F2F2" w:val="clear"/>
+        <w:spacing w:after="0" w:line="260"/>
+        <w:ind w:left="200"/>
+      </w:pPr>
+      <w:r>
+        <w:rPr>
+          <w:rFonts w:ascii="Courier New" w:cs="Courier New" w:eastAsia="Courier New" w:hAnsi="Courier New"/>
+          <w:sz w:val="20"/>
+          <w:szCs w:val="20"/>
+        </w:rPr>
+        <w:t xml:space="preserve">Ошибка: файл missing.txt не найден</w:t>
+      </w:r>
+    </w:p>
+    <w:p>
+      <w:pPr>
+        <w:spacing w:after="100"/>
+      </w:pPr>
     </w:p>
     <w:p>
       <w:pPr>

</xml_diff>

<commit_message>
Add screenshot step script and report placeholders
Co-Authored-By: Claude Sonnet 5.5 <noreply@anthropic.com>
Claude-Session: https://claude.ai/code/session_01BXekJbo41pFTNXWYwPGDvg
</commit_message>
<xml_diff>
--- a/Laboratornaya_Bash_Linux_Stepanov.docx
+++ b/Laboratornaya_Bash_Linux_Stepanov.docx
@@ -785,6 +785,43 @@
     </w:p>
     <w:p>
       <w:pPr>
+        <w:pBdr>
+          <w:top w:val="dashed" w:color="808080" w:sz="6" w:space="40"/>
+          <w:bottom w:val="dashed" w:color="808080" w:sz="6" w:space="40"/>
+          <w:left w:val="dashed" w:color="808080" w:sz="6" w:space="8"/>
+          <w:right w:val="dashed" w:color="808080" w:sz="6" w:space="8"/>
+        </w:pBdr>
+        <w:spacing w:after="60" w:before="120"/>
+        <w:jc w:val="center"/>
+      </w:pPr>
+      <w:r>
+        <w:rPr>
+          <w:rFonts w:ascii="Times New Roman" w:cs="Times New Roman" w:eastAsia="Times New Roman" w:hAnsi="Times New Roman"/>
+          <w:color w:val="808080"/>
+          <w:sz w:val="22"/>
+          <w:szCs w:val="22"/>
+        </w:rPr>
+        <w:t xml:space="preserve">[Вставьте скриншот терминала: Задание 1]</w:t>
+      </w:r>
+    </w:p>
+    <w:p>
+      <w:pPr>
+        <w:spacing w:after="160"/>
+        <w:jc w:val="center"/>
+      </w:pPr>
+      <w:r>
+        <w:rPr>
+          <w:rFonts w:ascii="Times New Roman" w:cs="Times New Roman" w:eastAsia="Times New Roman" w:hAnsi="Times New Roman"/>
+          <w:i/>
+          <w:iCs/>
+          <w:sz w:val="22"/>
+          <w:szCs w:val="22"/>
+        </w:rPr>
+        <w:t xml:space="preserve">Рисунок — Задание 1</w:t>
+      </w:r>
+    </w:p>
+    <w:p>
+      <w:pPr>
         <w:spacing w:after="120" w:line="300"/>
         <w:ind w:firstLine="709"/>
         <w:jc w:val="both"/>
@@ -1272,6 +1309,43 @@
     </w:p>
     <w:p>
       <w:pPr>
+        <w:pBdr>
+          <w:top w:val="dashed" w:color="808080" w:sz="6" w:space="40"/>
+          <w:bottom w:val="dashed" w:color="808080" w:sz="6" w:space="40"/>
+          <w:left w:val="dashed" w:color="808080" w:sz="6" w:space="8"/>
+          <w:right w:val="dashed" w:color="808080" w:sz="6" w:space="8"/>
+        </w:pBdr>
+        <w:spacing w:after="60" w:before="120"/>
+        <w:jc w:val="center"/>
+      </w:pPr>
+      <w:r>
+        <w:rPr>
+          <w:rFonts w:ascii="Times New Roman" w:cs="Times New Roman" w:eastAsia="Times New Roman" w:hAnsi="Times New Roman"/>
+          <w:color w:val="808080"/>
+          <w:sz w:val="22"/>
+          <w:szCs w:val="22"/>
+        </w:rPr>
+        <w:t xml:space="preserve">[Вставьте скриншот терминала: Задание 2]</w:t>
+      </w:r>
+    </w:p>
+    <w:p>
+      <w:pPr>
+        <w:spacing w:after="160"/>
+        <w:jc w:val="center"/>
+      </w:pPr>
+      <w:r>
+        <w:rPr>
+          <w:rFonts w:ascii="Times New Roman" w:cs="Times New Roman" w:eastAsia="Times New Roman" w:hAnsi="Times New Roman"/>
+          <w:i/>
+          <w:iCs/>
+          <w:sz w:val="22"/>
+          <w:szCs w:val="22"/>
+        </w:rPr>
+        <w:t xml:space="preserve">Рисунок — Задание 2</w:t>
+      </w:r>
+    </w:p>
+    <w:p>
+      <w:pPr>
         <w:spacing w:after="120" w:line="300"/>
         <w:ind w:firstLine="709"/>
         <w:jc w:val="both"/>
@@ -1723,6 +1797,43 @@
     </w:p>
     <w:p>
       <w:pPr>
+        <w:pBdr>
+          <w:top w:val="dashed" w:color="808080" w:sz="6" w:space="40"/>
+          <w:bottom w:val="dashed" w:color="808080" w:sz="6" w:space="40"/>
+          <w:left w:val="dashed" w:color="808080" w:sz="6" w:space="8"/>
+          <w:right w:val="dashed" w:color="808080" w:sz="6" w:space="8"/>
+        </w:pBdr>
+        <w:spacing w:after="60" w:before="120"/>
+        <w:jc w:val="center"/>
+      </w:pPr>
+      <w:r>
+        <w:rPr>
+          <w:rFonts w:ascii="Times New Roman" w:cs="Times New Roman" w:eastAsia="Times New Roman" w:hAnsi="Times New Roman"/>
+          <w:color w:val="808080"/>
+          <w:sz w:val="22"/>
+          <w:szCs w:val="22"/>
+        </w:rPr>
+        <w:t xml:space="preserve">[Вставьте скриншот терминала: Задание 3]</w:t>
+      </w:r>
+    </w:p>
+    <w:p>
+      <w:pPr>
+        <w:spacing w:after="160"/>
+        <w:jc w:val="center"/>
+      </w:pPr>
+      <w:r>
+        <w:rPr>
+          <w:rFonts w:ascii="Times New Roman" w:cs="Times New Roman" w:eastAsia="Times New Roman" w:hAnsi="Times New Roman"/>
+          <w:i/>
+          <w:iCs/>
+          <w:sz w:val="22"/>
+          <w:szCs w:val="22"/>
+        </w:rPr>
+        <w:t xml:space="preserve">Рисунок — Задание 3</w:t>
+      </w:r>
+    </w:p>
+    <w:p>
+      <w:pPr>
         <w:spacing w:after="120" w:line="300"/>
         <w:ind w:firstLine="709"/>
         <w:jc w:val="both"/>
@@ -2209,6 +2320,43 @@
     </w:p>
     <w:p>
       <w:pPr>
+        <w:pBdr>
+          <w:top w:val="dashed" w:color="808080" w:sz="6" w:space="40"/>
+          <w:bottom w:val="dashed" w:color="808080" w:sz="6" w:space="40"/>
+          <w:left w:val="dashed" w:color="808080" w:sz="6" w:space="8"/>
+          <w:right w:val="dashed" w:color="808080" w:sz="6" w:space="8"/>
+        </w:pBdr>
+        <w:spacing w:after="60" w:before="120"/>
+        <w:jc w:val="center"/>
+      </w:pPr>
+      <w:r>
+        <w:rPr>
+          <w:rFonts w:ascii="Times New Roman" w:cs="Times New Roman" w:eastAsia="Times New Roman" w:hAnsi="Times New Roman"/>
+          <w:color w:val="808080"/>
+          <w:sz w:val="22"/>
+          <w:szCs w:val="22"/>
+        </w:rPr>
+        <w:t xml:space="preserve">[Вставьте скриншот терминала: Задание 4 (переменные)]</w:t>
+      </w:r>
+    </w:p>
+    <w:p>
+      <w:pPr>
+        <w:spacing w:after="160"/>
+        <w:jc w:val="center"/>
+      </w:pPr>
+      <w:r>
+        <w:rPr>
+          <w:rFonts w:ascii="Times New Roman" w:cs="Times New Roman" w:eastAsia="Times New Roman" w:hAnsi="Times New Roman"/>
+          <w:i/>
+          <w:iCs/>
+          <w:sz w:val="22"/>
+          <w:szCs w:val="22"/>
+        </w:rPr>
+        <w:t xml:space="preserve">Рисунок — Задание 4 (переменные)</w:t>
+      </w:r>
+    </w:p>
+    <w:p>
+      <w:pPr>
         <w:pStyle w:val="Heading2"/>
         <w:spacing w:after="120" w:before="240"/>
       </w:pPr>
@@ -2555,6 +2703,43 @@
     </w:p>
     <w:p>
       <w:pPr>
+        <w:pBdr>
+          <w:top w:val="dashed" w:color="808080" w:sz="6" w:space="40"/>
+          <w:bottom w:val="dashed" w:color="808080" w:sz="6" w:space="40"/>
+          <w:left w:val="dashed" w:color="808080" w:sz="6" w:space="8"/>
+          <w:right w:val="dashed" w:color="808080" w:sz="6" w:space="8"/>
+        </w:pBdr>
+        <w:spacing w:after="60" w:before="120"/>
+        <w:jc w:val="center"/>
+      </w:pPr>
+      <w:r>
+        <w:rPr>
+          <w:rFonts w:ascii="Times New Roman" w:cs="Times New Roman" w:eastAsia="Times New Roman" w:hAnsi="Times New Roman"/>
+          <w:color w:val="808080"/>
+          <w:sz w:val="22"/>
+          <w:szCs w:val="22"/>
+        </w:rPr>
+        <w:t xml:space="preserve">[Вставьте скриншот терминала: Задание 5 (условия)]</w:t>
+      </w:r>
+    </w:p>
+    <w:p>
+      <w:pPr>
+        <w:spacing w:after="160"/>
+        <w:jc w:val="center"/>
+      </w:pPr>
+      <w:r>
+        <w:rPr>
+          <w:rFonts w:ascii="Times New Roman" w:cs="Times New Roman" w:eastAsia="Times New Roman" w:hAnsi="Times New Roman"/>
+          <w:i/>
+          <w:iCs/>
+          <w:sz w:val="22"/>
+          <w:szCs w:val="22"/>
+        </w:rPr>
+        <w:t xml:space="preserve">Рисунок — Задание 5 (условия)</w:t>
+      </w:r>
+    </w:p>
+    <w:p>
+      <w:pPr>
         <w:pStyle w:val="Heading2"/>
         <w:spacing w:after="120" w:before="240"/>
       </w:pPr>
@@ -3351,6 +3536,43 @@
     </w:p>
     <w:p>
       <w:pPr>
+        <w:pBdr>
+          <w:top w:val="dashed" w:color="808080" w:sz="6" w:space="40"/>
+          <w:bottom w:val="dashed" w:color="808080" w:sz="6" w:space="40"/>
+          <w:left w:val="dashed" w:color="808080" w:sz="6" w:space="8"/>
+          <w:right w:val="dashed" w:color="808080" w:sz="6" w:space="8"/>
+        </w:pBdr>
+        <w:spacing w:after="60" w:before="120"/>
+        <w:jc w:val="center"/>
+      </w:pPr>
+      <w:r>
+        <w:rPr>
+          <w:rFonts w:ascii="Times New Roman" w:cs="Times New Roman" w:eastAsia="Times New Roman" w:hAnsi="Times New Roman"/>
+          <w:color w:val="808080"/>
+          <w:sz w:val="22"/>
+          <w:szCs w:val="22"/>
+        </w:rPr>
+        <w:t xml:space="preserve">[Вставьте скриншот терминала: Задание 6 (циклы)]</w:t>
+      </w:r>
+    </w:p>
+    <w:p>
+      <w:pPr>
+        <w:spacing w:after="160"/>
+        <w:jc w:val="center"/>
+      </w:pPr>
+      <w:r>
+        <w:rPr>
+          <w:rFonts w:ascii="Times New Roman" w:cs="Times New Roman" w:eastAsia="Times New Roman" w:hAnsi="Times New Roman"/>
+          <w:i/>
+          <w:iCs/>
+          <w:sz w:val="22"/>
+          <w:szCs w:val="22"/>
+        </w:rPr>
+        <w:t xml:space="preserve">Рисунок — Задание 6 (циклы)</w:t>
+      </w:r>
+    </w:p>
+    <w:p>
+      <w:pPr>
         <w:pStyle w:val="Heading1"/>
         <w:spacing w:after="120" w:before="240"/>
       </w:pPr>
@@ -3714,6 +3936,43 @@
       <w:pPr>
         <w:spacing w:after="100"/>
       </w:pPr>
+    </w:p>
+    <w:p>
+      <w:pPr>
+        <w:pBdr>
+          <w:top w:val="dashed" w:color="808080" w:sz="6" w:space="40"/>
+          <w:bottom w:val="dashed" w:color="808080" w:sz="6" w:space="40"/>
+          <w:left w:val="dashed" w:color="808080" w:sz="6" w:space="8"/>
+          <w:right w:val="dashed" w:color="808080" w:sz="6" w:space="8"/>
+        </w:pBdr>
+        <w:spacing w:after="60" w:before="120"/>
+        <w:jc w:val="center"/>
+      </w:pPr>
+      <w:r>
+        <w:rPr>
+          <w:rFonts w:ascii="Times New Roman" w:cs="Times New Roman" w:eastAsia="Times New Roman" w:hAnsi="Times New Roman"/>
+          <w:color w:val="808080"/>
+          <w:sz w:val="22"/>
+          <w:szCs w:val="22"/>
+        </w:rPr>
+        <w:t xml:space="preserve">[Вставьте скриншот терминала: Задание 7 (параметры)]</w:t>
+      </w:r>
+    </w:p>
+    <w:p>
+      <w:pPr>
+        <w:spacing w:after="160"/>
+        <w:jc w:val="center"/>
+      </w:pPr>
+      <w:r>
+        <w:rPr>
+          <w:rFonts w:ascii="Times New Roman" w:cs="Times New Roman" w:eastAsia="Times New Roman" w:hAnsi="Times New Roman"/>
+          <w:i/>
+          <w:iCs/>
+          <w:sz w:val="22"/>
+          <w:szCs w:val="22"/>
+        </w:rPr>
+        <w:t xml:space="preserve">Рисунок — Задание 7 (параметры)</w:t>
+      </w:r>
     </w:p>
     <w:p>
       <w:pPr>
@@ -4090,6 +4349,43 @@
       <w:pPr>
         <w:spacing w:after="100"/>
       </w:pPr>
+    </w:p>
+    <w:p>
+      <w:pPr>
+        <w:pBdr>
+          <w:top w:val="dashed" w:color="808080" w:sz="6" w:space="40"/>
+          <w:bottom w:val="dashed" w:color="808080" w:sz="6" w:space="40"/>
+          <w:left w:val="dashed" w:color="808080" w:sz="6" w:space="8"/>
+          <w:right w:val="dashed" w:color="808080" w:sz="6" w:space="8"/>
+        </w:pBdr>
+        <w:spacing w:after="60" w:before="120"/>
+        <w:jc w:val="center"/>
+      </w:pPr>
+      <w:r>
+        <w:rPr>
+          <w:rFonts w:ascii="Times New Roman" w:cs="Times New Roman" w:eastAsia="Times New Roman" w:hAnsi="Times New Roman"/>
+          <w:color w:val="808080"/>
+          <w:sz w:val="22"/>
+          <w:szCs w:val="22"/>
+        </w:rPr>
+        <w:t xml:space="preserve">[Вставьте скриншот терминала: Итоговое задание]</w:t>
+      </w:r>
+    </w:p>
+    <w:p>
+      <w:pPr>
+        <w:spacing w:after="160"/>
+        <w:jc w:val="center"/>
+      </w:pPr>
+      <w:r>
+        <w:rPr>
+          <w:rFonts w:ascii="Times New Roman" w:cs="Times New Roman" w:eastAsia="Times New Roman" w:hAnsi="Times New Roman"/>
+          <w:i/>
+          <w:iCs/>
+          <w:sz w:val="22"/>
+          <w:szCs w:val="22"/>
+        </w:rPr>
+        <w:t xml:space="preserve">Рисунок — Итоговое задание</w:t>
+      </w:r>
     </w:p>
     <w:p>
       <w:pPr>

</xml_diff>

<commit_message>
Align report headings with lab task numbers
Co-Authored-By: Claude Sonnet 5.5 <noreply@anthropic.com>
Claude-Session: https://claude.ai/code/session_01BXekJbo41pFTNXWYwPGDvg
</commit_message>
<xml_diff>
--- a/Laboratornaya_Bash_Linux_Stepanov.docx
+++ b/Laboratornaya_Bash_Linux_Stepanov.docx
@@ -527,7 +527,7 @@
           <w:sz w:val="28"/>
           <w:szCs w:val="28"/>
         </w:rPr>
-        <w:t xml:space="preserve">2. Выполненные команды и результаты</w:t>
+        <w:t xml:space="preserve">2. Ход выполнения работы</w:t>
       </w:r>
     </w:p>
     <w:p>
@@ -832,23 +832,6 @@
     </w:p>
     <w:p>
       <w:pPr>
-        <w:pStyle w:val="Heading1"/>
-        <w:spacing w:after="120" w:before="240"/>
-      </w:pPr>
-      <w:r>
-        <w:rPr>
-          <w:rFonts w:ascii="Times New Roman" w:cs="Times New Roman" w:eastAsia="Times New Roman" w:hAnsi="Times New Roman"/>
-          <w:b/>
-          <w:bCs/>
-          <w:color w:val="000000"/>
-          <w:sz w:val="28"/>
-          <w:szCs w:val="28"/>
-        </w:rPr>
-        <w:t xml:space="preserve">3. Переменные, условия и циклы</w:t>
-      </w:r>
-    </w:p>
-    <w:p>
-      <w:pPr>
         <w:pStyle w:val="Heading2"/>
         <w:spacing w:after="120" w:before="240"/>
       </w:pPr>
@@ -861,7 +844,7 @@
           <w:sz w:val="26"/>
           <w:szCs w:val="26"/>
         </w:rPr>
-        <w:t xml:space="preserve">Переменные</w:t>
+        <w:t xml:space="preserve">Задание 4. Переменные</w:t>
       </w:r>
     </w:p>
     <w:p>
@@ -1018,7 +1001,7 @@
           <w:sz w:val="26"/>
           <w:szCs w:val="26"/>
         </w:rPr>
-        <w:t xml:space="preserve">Условные конструкции</w:t>
+        <w:t xml:space="preserve">Задание 5. Условные конструкции</w:t>
       </w:r>
     </w:p>
     <w:p>
@@ -1229,7 +1212,7 @@
           <w:sz w:val="26"/>
           <w:szCs w:val="26"/>
         </w:rPr>
-        <w:t xml:space="preserve">Циклы</w:t>
+        <w:t xml:space="preserve">Задание 6. Циклы</w:t>
       </w:r>
     </w:p>
     <w:p>
@@ -1590,7 +1573,7 @@
     </w:p>
     <w:p>
       <w:pPr>
-        <w:pStyle w:val="Heading1"/>
+        <w:pStyle w:val="Heading2"/>
         <w:spacing w:after="120" w:before="240"/>
       </w:pPr>
       <w:r>
@@ -1599,10 +1582,10 @@
           <w:b/>
           <w:bCs/>
           <w:color w:val="000000"/>
-          <w:sz w:val="28"/>
-          <w:szCs w:val="28"/>
-        </w:rPr>
-        <w:t xml:space="preserve">4. Сценарий с параметрами</w:t>
+          <w:sz w:val="26"/>
+          <w:szCs w:val="26"/>
+        </w:rPr>
+        <w:t xml:space="preserve">Задание 7. Передача параметров сценарию</w:t>
       </w:r>
     </w:p>
     <w:p>
@@ -1798,7 +1781,7 @@
     </w:p>
     <w:p>
       <w:pPr>
-        <w:pStyle w:val="Heading1"/>
+        <w:pStyle w:val="Heading2"/>
         <w:spacing w:after="120" w:before="240"/>
       </w:pPr>
       <w:r>
@@ -1807,10 +1790,10 @@
           <w:b/>
           <w:bCs/>
           <w:color w:val="000000"/>
-          <w:sz w:val="28"/>
-          <w:szCs w:val="28"/>
-        </w:rPr>
-        <w:t xml:space="preserve">5. Алгоритм итогового задания</w:t>
+          <w:sz w:val="26"/>
+          <w:szCs w:val="26"/>
+        </w:rPr>
+        <w:t xml:space="preserve">Итоговое задание. Алгоритм обработки students.txt</w:t>
       </w:r>
     </w:p>
     <w:p>
@@ -2473,7 +2456,7 @@
           <w:sz w:val="28"/>
           <w:szCs w:val="28"/>
         </w:rPr>
-        <w:t xml:space="preserve">6. Ответы на контрольные вопросы</w:t>
+        <w:t xml:space="preserve">3. Ответы на контрольные вопросы</w:t>
       </w:r>
     </w:p>
     <w:p>
@@ -2850,7 +2833,7 @@
           <w:sz w:val="28"/>
           <w:szCs w:val="28"/>
         </w:rPr>
-        <w:t xml:space="preserve">7. Вывод</w:t>
+        <w:t xml:space="preserve">4. Вывод</w:t>
       </w:r>
     </w:p>
     <w:p>

</xml_diff>

<commit_message>
Embed new terminal screenshots with prompts into report
Co-Authored-By: Claude Sonnet 5.5 <noreply@anthropic.com>
Claude-Session: https://claude.ai/code/session_01BXekJbo41pFTNXWYwPGDvg
</commit_message>
<xml_diff>
--- a/Laboratornaya_Bash_Linux_Stepanov.docx
+++ b/Laboratornaya_Bash_Linux_Stepanov.docx
@@ -571,7 +571,7 @@
       <w:r>
         <w:drawing>
           <wp:inline distT="0" distB="0" distL="0" distR="0">
-            <wp:extent cx="5334000" cy="3362325"/>
+            <wp:extent cx="5810250" cy="1971675"/>
             <wp:effectExtent t="0" r="0" b="0" l="0"/>
             <wp:docPr id="1" name="Скриншот терминала, задание 1" descr="Скриншот терминала, задание 1" title="Скриншот терминала, задание 1"/>
             <wp:cNvGraphicFramePr>
@@ -596,7 +596,7 @@
                   <pic:spPr bwMode="auto">
                     <a:xfrm>
                       <a:off x="0" y="0"/>
-                      <a:ext cx="5334000" cy="3362325"/>
+                      <a:ext cx="5810250" cy="1971675"/>
                     </a:xfrm>
                     <a:prstGeom prst="rect">
                       <a:avLst/>
@@ -666,7 +666,7 @@
       <w:r>
         <w:drawing>
           <wp:inline distT="0" distB="0" distL="0" distR="0">
-            <wp:extent cx="5334000" cy="3505200"/>
+            <wp:extent cx="5810250" cy="3505200"/>
             <wp:effectExtent t="0" r="0" b="0" l="0"/>
             <wp:docPr id="1" name="Скриншот терминала, задание 2" descr="Скриншот терминала, задание 2" title="Скриншот терминала, задание 2"/>
             <wp:cNvGraphicFramePr>
@@ -691,7 +691,7 @@
                   <pic:spPr bwMode="auto">
                     <a:xfrm>
                       <a:off x="0" y="0"/>
-                      <a:ext cx="5334000" cy="3505200"/>
+                      <a:ext cx="5810250" cy="3505200"/>
                     </a:xfrm>
                     <a:prstGeom prst="rect">
                       <a:avLst/>
@@ -761,7 +761,7 @@
       <w:r>
         <w:drawing>
           <wp:inline distT="0" distB="0" distL="0" distR="0">
-            <wp:extent cx="5334000" cy="3505200"/>
+            <wp:extent cx="5810250" cy="3028950"/>
             <wp:effectExtent t="0" r="0" b="0" l="0"/>
             <wp:docPr id="1" name="Скриншот терминала, задание 3" descr="Скриншот терминала, задание 3" title="Скриншот терминала, задание 3"/>
             <wp:cNvGraphicFramePr>
@@ -786,7 +786,7 @@
                   <pic:spPr bwMode="auto">
                     <a:xfrm>
                       <a:off x="0" y="0"/>
-                      <a:ext cx="5334000" cy="3505200"/>
+                      <a:ext cx="5810250" cy="3028950"/>
                     </a:xfrm>
                     <a:prstGeom prst="rect">
                       <a:avLst/>
@@ -933,7 +933,7 @@
       <w:r>
         <w:drawing>
           <wp:inline distT="0" distB="0" distL="0" distR="0">
-            <wp:extent cx="5334000" cy="3362325"/>
+            <wp:extent cx="5810250" cy="3457575"/>
             <wp:effectExtent t="0" r="0" b="0" l="0"/>
             <wp:docPr id="1" name="Скриншот терминала, задание 4 (переменные)" descr="Скриншот терминала, задание 4 (переменные)" title="Скриншот терминала, задание 4 (переменные)"/>
             <wp:cNvGraphicFramePr>
@@ -958,7 +958,7 @@
                   <pic:spPr bwMode="auto">
                     <a:xfrm>
                       <a:off x="0" y="0"/>
-                      <a:ext cx="5334000" cy="3362325"/>
+                      <a:ext cx="5810250" cy="3457575"/>
                     </a:xfrm>
                     <a:prstGeom prst="rect">
                       <a:avLst/>
@@ -1144,7 +1144,7 @@
       <w:r>
         <w:drawing>
           <wp:inline distT="0" distB="0" distL="0" distR="0">
-            <wp:extent cx="5334000" cy="3362325"/>
+            <wp:extent cx="5810250" cy="2657475"/>
             <wp:effectExtent t="0" r="0" b="0" l="0"/>
             <wp:docPr id="1" name="Скриншот терминала, задание 5 (условия)" descr="Скриншот терминала, задание 5 (условия)" title="Скриншот терминала, задание 5 (условия)"/>
             <wp:cNvGraphicFramePr>
@@ -1169,7 +1169,7 @@
                   <pic:spPr bwMode="auto">
                     <a:xfrm>
                       <a:off x="0" y="0"/>
-                      <a:ext cx="5334000" cy="3362325"/>
+                      <a:ext cx="5810250" cy="2657475"/>
                     </a:xfrm>
                     <a:prstGeom prst="rect">
                       <a:avLst/>
@@ -1517,7 +1517,7 @@
       <w:r>
         <w:drawing>
           <wp:inline distT="0" distB="0" distL="0" distR="0">
-            <wp:extent cx="5334000" cy="3505200"/>
+            <wp:extent cx="5810250" cy="3305175"/>
             <wp:effectExtent t="0" r="0" b="0" l="0"/>
             <wp:docPr id="1" name="Скриншот терминала, задание 6 (циклы)" descr="Скриншот терминала, задание 6 (циклы)" title="Скриншот терминала, задание 6 (циклы)"/>
             <wp:cNvGraphicFramePr>
@@ -1542,7 +1542,7 @@
                   <pic:spPr bwMode="auto">
                     <a:xfrm>
                       <a:off x="0" y="0"/>
-                      <a:ext cx="5334000" cy="3505200"/>
+                      <a:ext cx="5810250" cy="3305175"/>
                     </a:xfrm>
                     <a:prstGeom prst="rect">
                       <a:avLst/>
@@ -1725,7 +1725,7 @@
       <w:r>
         <w:drawing>
           <wp:inline distT="0" distB="0" distL="0" distR="0">
-            <wp:extent cx="5334000" cy="3362325"/>
+            <wp:extent cx="5810250" cy="2981325"/>
             <wp:effectExtent t="0" r="0" b="0" l="0"/>
             <wp:docPr id="1" name="Скриншот терминала, задание 7 (параметры)" descr="Скриншот терминала, задание 7 (параметры)" title="Скриншот терминала, задание 7 (параметры)"/>
             <wp:cNvGraphicFramePr>
@@ -1750,7 +1750,7 @@
                   <pic:spPr bwMode="auto">
                     <a:xfrm>
                       <a:off x="0" y="0"/>
-                      <a:ext cx="5334000" cy="3362325"/>
+                      <a:ext cx="5810250" cy="2981325"/>
                     </a:xfrm>
                     <a:prstGeom prst="rect">
                       <a:avLst/>
@@ -1979,7 +1979,7 @@
       <w:r>
         <w:drawing>
           <wp:inline distT="0" distB="0" distL="0" distR="0">
-            <wp:extent cx="5334000" cy="3362325"/>
+            <wp:extent cx="5810250" cy="2828925"/>
             <wp:effectExtent t="0" r="0" b="0" l="0"/>
             <wp:docPr id="1" name="Скриншот терминала, итоговое задание" descr="Скриншот терминала, итоговое задание" title="Скриншот терминала, итоговое задание"/>
             <wp:cNvGraphicFramePr>
@@ -2004,7 +2004,7 @@
                   <pic:spPr bwMode="auto">
                     <a:xfrm>
                       <a:off x="0" y="0"/>
-                      <a:ext cx="5334000" cy="3362325"/>
+                      <a:ext cx="5810250" cy="2828925"/>
                     </a:xfrm>
                     <a:prstGeom prst="rect">
                       <a:avLst/>

</xml_diff>

<commit_message>
Rewrite report and lab scripts per section 18 (ASCII, no filler)
Co-Authored-By: Claude Sonnet 5.5 <noreply@anthropic.com>
Claude-Session: https://claude.ai/code/session_01BXekJbo41pFTNXWYwPGDvg
</commit_message>
<xml_diff>
--- a/Laboratornaya_Bash_Linux_Stepanov.docx
+++ b/Laboratornaya_Bash_Linux_Stepanov.docx
@@ -139,7 +139,7 @@
           <w:sz w:val="36"/>
           <w:szCs w:val="36"/>
         </w:rPr>
-        <w:t xml:space="preserve">ОТЧЁТ</w:t>
+        <w:t xml:space="preserve">ОТЧЕТ</w:t>
       </w:r>
     </w:p>
     <w:p>
@@ -173,7 +173,7 @@
           <w:sz w:val="24"/>
           <w:szCs w:val="24"/>
         </w:rPr>
-        <w:t xml:space="preserve">«Основы работы в командной строке Linux и подготовка к разработке сценариев Bash»</w:t>
+        <w:t xml:space="preserve">"Основы работы в командной строке Linux и подготовка к разработке сценариев Bash"</w:t>
       </w:r>
     </w:p>
     <w:p>
@@ -465,7 +465,7 @@
           <w:sz w:val="24"/>
           <w:szCs w:val="24"/>
         </w:rPr>
-        <w:t xml:space="preserve">Работа выполнена на компьютере ubuntu-RDW-63, пользователь stepanovgv1, ОС Ubuntu Linux (протокол от 22.10.2026).</w:t>
+        <w:t xml:space="preserve">Тема: основы работы в командной строке Linux и подготовка к разработке сценариев Bash.</w:t>
       </w:r>
     </w:p>
     <w:p>
@@ -480,7 +480,7 @@
           <w:sz w:val="24"/>
           <w:szCs w:val="24"/>
         </w:rPr>
-        <w:t xml:space="preserve">Тема: Основы работы в командной строке Linux и подготовка к разработке сценариев Bash.</w:t>
+        <w:t xml:space="preserve">Цель: получить навыки работы с командной строкой Linux, создавать и обрабатывать файлы, использовать переменные, условия и циклы, подготовить данные для сценария.</w:t>
       </w:r>
     </w:p>
     <w:p>
@@ -495,7 +495,7 @@
           <w:sz w:val="24"/>
           <w:szCs w:val="24"/>
         </w:rPr>
-        <w:t xml:space="preserve">Цель работы: получить практические навыки работы с командной строкой Linux, научиться создавать и обрабатывать файлы, использовать переменные, условия и циклы; подготовиться к разработке командного сценария, автоматизирующего обработку данных.</w:t>
+        <w:t xml:space="preserve">Оборудование и ПО: ПК, Linux, Bash, редактор nano.</w:t>
       </w:r>
     </w:p>
     <w:p>
@@ -510,7 +510,7 @@
           <w:sz w:val="24"/>
           <w:szCs w:val="24"/>
         </w:rPr>
-        <w:t xml:space="preserve">Оборудование и ПО: персональный компьютер, ОС Linux, интерпретатор Bash, текстовый редактор nano.</w:t>
+        <w:t xml:space="preserve">Среда: ubuntu-RDW-63, пользователь stepanovgv1, Ubuntu Linux, дата 22.10.2026.</w:t>
       </w:r>
     </w:p>
     <w:p>
@@ -527,7 +527,7 @@
           <w:sz w:val="28"/>
           <w:szCs w:val="28"/>
         </w:rPr>
-        <w:t xml:space="preserve">2. Ход выполнения работы</w:t>
+        <w:t xml:space="preserve">2. Ход работы</w:t>
       </w:r>
     </w:p>
     <w:p>
@@ -559,7 +559,7 @@
           <w:sz w:val="24"/>
           <w:szCs w:val="24"/>
         </w:rPr>
-        <w:t xml:space="preserve">Команды pwd, whoami, ls, ls -l, ls -a и date позволяют определить текущий каталог, пользователя, содержимое каталога (в том числе подробное и со скрытыми файлами) и текущее время. Результат выполнения команд (каталог practice_linux):</w:t>
+        <w:t xml:space="preserve">Команды: pwd, whoami, ls, ls -l, ls -a, date. Рабочий каталог: practice_linux.</w:t>
       </w:r>
     </w:p>
     <w:p>
@@ -622,7 +622,7 @@
           <w:sz w:val="22"/>
           <w:szCs w:val="22"/>
         </w:rPr>
-        <w:t xml:space="preserve">Рисунок 1 — Скриншот терминала, задание 1</w:t>
+        <w:t xml:space="preserve">Рисунок 1 - Скриншот терминала, задание 1</w:t>
       </w:r>
     </w:p>
     <w:p>
@@ -637,7 +637,7 @@
           <w:sz w:val="24"/>
           <w:szCs w:val="24"/>
         </w:rPr>
-        <w:t xml:space="preserve">Ответы: pwd показывает путь к текущему каталогу; ls выводит только имена, ls -l — подробные сведения (права, владельца, размер, время изменения); ls -a показывает и скрытые файлы, имена которых начинаются с точки. Знать текущий каталог важно, чтобы команды выполнялись над нужными файлами.</w:t>
+        <w:t xml:space="preserve">pwd: путь к текущему каталогу. ls: имена файлов. ls -l: права, владелец, размер, время изменения. ls -a: скрытые файлы, имя начинается с точки. Текущий каталог определяет, где команды ищут и создают файлы.</w:t>
       </w:r>
     </w:p>
     <w:p>
@@ -655,6 +655,21 @@
           <w:szCs w:val="26"/>
         </w:rPr>
         <w:t xml:space="preserve">Задание 2. Создание каталогов и файлов</w:t>
+      </w:r>
+    </w:p>
+    <w:p>
+      <w:pPr>
+        <w:spacing w:after="120" w:line="300"/>
+        <w:ind w:firstLine="709"/>
+        <w:jc w:val="both"/>
+      </w:pPr>
+      <w:r>
+        <w:rPr>
+          <w:rFonts w:ascii="Times New Roman" w:cs="Times New Roman" w:eastAsia="Times New Roman" w:hAnsi="Times New Roman"/>
+          <w:sz w:val="24"/>
+          <w:szCs w:val="24"/>
+        </w:rPr>
+        <w:t xml:space="preserve">Команды: mkdir data scripts results, touch students.txt, cat &gt; students.txt (5 строк), cat, mv test.txt example.txt. Файл students.txt создан через heredoc вместо nano. Повторный touch не очищает файл, меняется только время изменения.</w:t>
       </w:r>
     </w:p>
     <w:p>
@@ -717,22 +732,7 @@
           <w:sz w:val="22"/>
           <w:szCs w:val="22"/>
         </w:rPr>
-        <w:t xml:space="preserve">Рисунок 2 — Скриншот терминала, задание 2</w:t>
-      </w:r>
-    </w:p>
-    <w:p>
-      <w:pPr>
-        <w:spacing w:after="120" w:line="300"/>
-        <w:ind w:firstLine="709"/>
-        <w:jc w:val="both"/>
-      </w:pPr>
-      <w:r>
-        <w:rPr>
-          <w:rFonts w:ascii="Times New Roman" w:cs="Times New Roman" w:eastAsia="Times New Roman" w:hAnsi="Times New Roman"/>
-          <w:sz w:val="24"/>
-          <w:szCs w:val="24"/>
-        </w:rPr>
-        <w:t xml:space="preserve">Закрепление: командами touch test.txt, echo "строка" &gt; test.txt, cat test.txt и mv test.txt example.txt создан и переименован файл; результат проверен командой ls. Повторный touch существующего файла не удаляет его содержимое, а лишь обновляет время изменения.</w:t>
+        <w:t xml:space="preserve">Рисунок 2 - Скриншот терминала, задание 2</w:t>
       </w:r>
     </w:p>
     <w:p>
@@ -750,6 +750,21 @@
           <w:szCs w:val="26"/>
         </w:rPr>
         <w:t xml:space="preserve">Задание 3. Обработка текстовых данных</w:t>
+      </w:r>
+    </w:p>
+    <w:p>
+      <w:pPr>
+        <w:spacing w:after="120" w:line="300"/>
+        <w:ind w:firstLine="709"/>
+        <w:jc w:val="both"/>
+      </w:pPr>
+      <w:r>
+        <w:rPr>
+          <w:rFonts w:ascii="Times New Roman" w:cs="Times New Roman" w:eastAsia="Times New Roman" w:hAnsi="Times New Roman"/>
+          <w:sz w:val="24"/>
+          <w:szCs w:val="24"/>
+        </w:rPr>
+        <w:t xml:space="preserve">wc -l students.txt: 5 строк. grep ищет строки по подстроке, sort сортирует вывод. sort students.txt &gt; sorted_students.txt пишет результат в новый файл, students.txt не меняется. Оператор &gt; перезаписывает файл, &gt;&gt; дописывает в конец.</w:t>
       </w:r>
     </w:p>
     <w:p>
@@ -812,22 +827,7 @@
           <w:sz w:val="22"/>
           <w:szCs w:val="22"/>
         </w:rPr>
-        <w:t xml:space="preserve">Рисунок 3 — Скриншот терминала, задание 3</w:t>
-      </w:r>
-    </w:p>
-    <w:p>
-      <w:pPr>
-        <w:spacing w:after="120" w:line="300"/>
-        <w:ind w:firstLine="709"/>
-        <w:jc w:val="both"/>
-      </w:pPr>
-      <w:r>
-        <w:rPr>
-          <w:rFonts w:ascii="Times New Roman" w:cs="Times New Roman" w:eastAsia="Times New Roman" w:hAnsi="Times New Roman"/>
-          <w:sz w:val="24"/>
-          <w:szCs w:val="24"/>
-        </w:rPr>
-        <w:t xml:space="preserve">Исходный файл не изменился, так как sort выводит результат на экран, а запись в новый файл выполняет перенаправление. Оператор &gt; заменяет содержимое файла, &gt;&gt; добавляет данные в конец.</w:t>
+        <w:t xml:space="preserve">Рисунок 3 - Скриншот терминала, задание 3</w:t>
       </w:r>
     </w:p>
     <w:p>
@@ -862,7 +862,7 @@
           <w:sz w:val="20"/>
           <w:szCs w:val="20"/>
         </w:rPr>
-        <w:t xml:space="preserve">student="Иванов И.И."; year=2005; city="Москва"</w:t>
+        <w:t xml:space="preserve">student="Иванов И.И."</w:t>
       </w:r>
     </w:p>
     <w:p>
@@ -880,7 +880,7 @@
           <w:sz w:val="20"/>
           <w:szCs w:val="20"/>
         </w:rPr>
-        <w:t xml:space="preserve">filename="students.txt"</w:t>
+        <w:t xml:space="preserve">year=2005</w:t>
       </w:r>
     </w:p>
     <w:p>
@@ -898,7 +898,7 @@
           <w:sz w:val="20"/>
           <w:szCs w:val="20"/>
         </w:rPr>
-        <w:t xml:space="preserve">count=$(wc -l &lt; "$filename")</w:t>
+        <w:t xml:space="preserve">city="Москва"</w:t>
       </w:r>
     </w:p>
     <w:p>
@@ -916,6 +916,42 @@
           <w:sz w:val="20"/>
           <w:szCs w:val="20"/>
         </w:rPr>
+        <w:t xml:space="preserve">filename="students.txt"</w:t>
+      </w:r>
+    </w:p>
+    <w:p>
+      <w:pPr>
+        <w:pBdr>
+          <w:left w:val="single" w:color="808080" w:sz="12" w:space="6"/>
+        </w:pBdr>
+        <w:shd w:fill="F2F2F2" w:val="clear"/>
+        <w:spacing w:after="0" w:line="260"/>
+        <w:ind w:left="200"/>
+      </w:pPr>
+      <w:r>
+        <w:rPr>
+          <w:rFonts w:ascii="Courier New" w:cs="Courier New" w:eastAsia="Courier New" w:hAnsi="Courier New"/>
+          <w:sz w:val="20"/>
+          <w:szCs w:val="20"/>
+        </w:rPr>
+        <w:t xml:space="preserve">count=$(wc -l &lt; "$filename")</w:t>
+      </w:r>
+    </w:p>
+    <w:p>
+      <w:pPr>
+        <w:pBdr>
+          <w:left w:val="single" w:color="808080" w:sz="12" w:space="6"/>
+        </w:pBdr>
+        <w:shd w:fill="F2F2F2" w:val="clear"/>
+        <w:spacing w:after="0" w:line="260"/>
+        <w:ind w:left="200"/>
+      </w:pPr>
+      <w:r>
+        <w:rPr>
+          <w:rFonts w:ascii="Courier New" w:cs="Courier New" w:eastAsia="Courier New" w:hAnsi="Courier New"/>
+          <w:sz w:val="20"/>
+          <w:szCs w:val="20"/>
+        </w:rPr>
         <w:t xml:space="preserve">echo "Количество записей: $count"</w:t>
       </w:r>
     </w:p>
@@ -923,6 +959,21 @@
       <w:pPr>
         <w:spacing w:after="100"/>
       </w:pPr>
+    </w:p>
+    <w:p>
+      <w:pPr>
+        <w:spacing w:after="120" w:line="300"/>
+        <w:ind w:firstLine="709"/>
+        <w:jc w:val="both"/>
+      </w:pPr>
+      <w:r>
+        <w:rPr>
+          <w:rFonts w:ascii="Times New Roman" w:cs="Times New Roman" w:eastAsia="Times New Roman" w:hAnsi="Times New Roman"/>
+          <w:sz w:val="24"/>
+          <w:szCs w:val="24"/>
+        </w:rPr>
+        <w:t xml:space="preserve">$(...) сохраняет вывод команды в переменную. Значение с пробелами записывается в кавычках. После city="Казань" вывод меняется, остальные переменные остаются.</w:t>
+      </w:r>
     </w:p>
     <w:p>
       <w:pPr>
@@ -935,7 +986,7 @@
           <wp:inline distT="0" distB="0" distL="0" distR="0">
             <wp:extent cx="5810250" cy="3457575"/>
             <wp:effectExtent t="0" r="0" b="0" l="0"/>
-            <wp:docPr id="1" name="Скриншот терминала, задание 4 (переменные)" descr="Скриншот терминала, задание 4 (переменные)" title="Скриншот терминала, задание 4 (переменные)"/>
+            <wp:docPr id="1" name="Скриншот терминала, задание 4" descr="Скриншот терминала, задание 4" title="Скриншот терминала, задание 4"/>
             <wp:cNvGraphicFramePr>
               <a:graphicFrameLocks xmlns:a="http://schemas.openxmlformats.org/drawingml/2006/main" noChangeAspect="1"/>
             </wp:cNvGraphicFramePr>
@@ -984,7 +1035,7 @@
           <w:sz w:val="22"/>
           <w:szCs w:val="22"/>
         </w:rPr>
-        <w:t xml:space="preserve">Рисунок 4 — Скриншот терминала, задание 4 (переменные)</w:t>
+        <w:t xml:space="preserve">Рисунок 4 - Скриншот терминала, задание 4</w:t>
       </w:r>
     </w:p>
     <w:p>
@@ -1137,6 +1188,21 @@
     </w:p>
     <w:p>
       <w:pPr>
+        <w:spacing w:after="120" w:line="300"/>
+        <w:ind w:firstLine="709"/>
+        <w:jc w:val="both"/>
+      </w:pPr>
+      <w:r>
+        <w:rPr>
+          <w:rFonts w:ascii="Times New Roman" w:cs="Times New Roman" w:eastAsia="Times New Roman" w:hAnsi="Times New Roman"/>
+          <w:sz w:val="24"/>
+          <w:szCs w:val="24"/>
+        </w:rPr>
+        <w:t xml:space="preserve">Проверки: -ge для чисел, -f для файла. Входные данные: grade = 4 и 3, файлы students.txt и missing.txt, count = 5, 3 и 7.</w:t>
+      </w:r>
+    </w:p>
+    <w:p>
+      <w:pPr>
         <w:keepNext/>
         <w:spacing w:after="60" w:before="120"/>
         <w:jc w:val="center"/>
@@ -1146,7 +1212,7 @@
           <wp:inline distT="0" distB="0" distL="0" distR="0">
             <wp:extent cx="5810250" cy="2657475"/>
             <wp:effectExtent t="0" r="0" b="0" l="0"/>
-            <wp:docPr id="1" name="Скриншот терминала, задание 5 (условия)" descr="Скриншот терминала, задание 5 (условия)" title="Скриншот терминала, задание 5 (условия)"/>
+            <wp:docPr id="1" name="Скриншот терминала, задание 5" descr="Скриншот терминала, задание 5" title="Скриншот терминала, задание 5"/>
             <wp:cNvGraphicFramePr>
               <a:graphicFrameLocks xmlns:a="http://schemas.openxmlformats.org/drawingml/2006/main" noChangeAspect="1"/>
             </wp:cNvGraphicFramePr>
@@ -1195,7 +1261,7 @@
           <w:sz w:val="22"/>
           <w:szCs w:val="22"/>
         </w:rPr>
-        <w:t xml:space="preserve">Рисунок 5 — Скриншот терминала, задание 5 (условия)</w:t>
+        <w:t xml:space="preserve">Рисунок 5 - Скриншот терминала, задание 5</w:t>
       </w:r>
     </w:p>
     <w:p>
@@ -1230,7 +1296,7 @@
           <w:sz w:val="20"/>
           <w:szCs w:val="20"/>
         </w:rPr>
-        <w:t xml:space="preserve">for i in 1 2 3 4 5 6 7 8 9 10</w:t>
+        <w:t xml:space="preserve">for i in 1 2 3 4 5 6 7 8 9 10; do echo "Запись № $i"; done</w:t>
       </w:r>
     </w:p>
     <w:p>
@@ -1248,7 +1314,7 @@
           <w:sz w:val="20"/>
           <w:szCs w:val="20"/>
         </w:rPr>
-        <w:t xml:space="preserve">do</w:t>
+        <w:t xml:space="preserve"> </w:t>
       </w:r>
     </w:p>
     <w:p>
@@ -1266,7 +1332,7 @@
           <w:sz w:val="20"/>
           <w:szCs w:val="20"/>
         </w:rPr>
-        <w:t xml:space="preserve">    echo "Запись № $i"</w:t>
+        <w:t xml:space="preserve">i=1</w:t>
       </w:r>
     </w:p>
     <w:p>
@@ -1284,7 +1350,7 @@
           <w:sz w:val="20"/>
           <w:szCs w:val="20"/>
         </w:rPr>
-        <w:t xml:space="preserve">done</w:t>
+        <w:t xml:space="preserve">while [ "$i" -le 7 ]; do echo "Номер: $i"; i=$((i + 1)); done</w:t>
       </w:r>
     </w:p>
     <w:p>
@@ -1320,193 +1386,28 @@
           <w:sz w:val="20"/>
           <w:szCs w:val="20"/>
         </w:rPr>
-        <w:t xml:space="preserve">i=1</w:t>
-      </w:r>
-    </w:p>
-    <w:p>
-      <w:pPr>
-        <w:pBdr>
-          <w:left w:val="single" w:color="808080" w:sz="12" w:space="6"/>
-        </w:pBdr>
-        <w:shd w:fill="F2F2F2" w:val="clear"/>
-        <w:spacing w:after="0" w:line="260"/>
-        <w:ind w:left="200"/>
-      </w:pPr>
-      <w:r>
-        <w:rPr>
-          <w:rFonts w:ascii="Courier New" w:cs="Courier New" w:eastAsia="Courier New" w:hAnsi="Courier New"/>
-          <w:sz w:val="20"/>
-          <w:szCs w:val="20"/>
-        </w:rPr>
-        <w:t xml:space="preserve">while [ "$i" -le 7 ]</w:t>
-      </w:r>
-    </w:p>
-    <w:p>
-      <w:pPr>
-        <w:pBdr>
-          <w:left w:val="single" w:color="808080" w:sz="12" w:space="6"/>
-        </w:pBdr>
-        <w:shd w:fill="F2F2F2" w:val="clear"/>
-        <w:spacing w:after="0" w:line="260"/>
-        <w:ind w:left="200"/>
-      </w:pPr>
-      <w:r>
-        <w:rPr>
-          <w:rFonts w:ascii="Courier New" w:cs="Courier New" w:eastAsia="Courier New" w:hAnsi="Courier New"/>
-          <w:sz w:val="20"/>
-          <w:szCs w:val="20"/>
-        </w:rPr>
-        <w:t xml:space="preserve">do</w:t>
-      </w:r>
-    </w:p>
-    <w:p>
-      <w:pPr>
-        <w:pBdr>
-          <w:left w:val="single" w:color="808080" w:sz="12" w:space="6"/>
-        </w:pBdr>
-        <w:shd w:fill="F2F2F2" w:val="clear"/>
-        <w:spacing w:after="0" w:line="260"/>
-        <w:ind w:left="200"/>
-      </w:pPr>
-      <w:r>
-        <w:rPr>
-          <w:rFonts w:ascii="Courier New" w:cs="Courier New" w:eastAsia="Courier New" w:hAnsi="Courier New"/>
-          <w:sz w:val="20"/>
-          <w:szCs w:val="20"/>
-        </w:rPr>
-        <w:t xml:space="preserve">    echo "Номер: $i"</w:t>
-      </w:r>
-    </w:p>
-    <w:p>
-      <w:pPr>
-        <w:pBdr>
-          <w:left w:val="single" w:color="808080" w:sz="12" w:space="6"/>
-        </w:pBdr>
-        <w:shd w:fill="F2F2F2" w:val="clear"/>
-        <w:spacing w:after="0" w:line="260"/>
-        <w:ind w:left="200"/>
-      </w:pPr>
-      <w:r>
-        <w:rPr>
-          <w:rFonts w:ascii="Courier New" w:cs="Courier New" w:eastAsia="Courier New" w:hAnsi="Courier New"/>
-          <w:sz w:val="20"/>
-          <w:szCs w:val="20"/>
-        </w:rPr>
-        <w:t xml:space="preserve">    i=$((i + 1))</w:t>
-      </w:r>
-    </w:p>
-    <w:p>
-      <w:pPr>
-        <w:pBdr>
-          <w:left w:val="single" w:color="808080" w:sz="12" w:space="6"/>
-        </w:pBdr>
-        <w:shd w:fill="F2F2F2" w:val="clear"/>
-        <w:spacing w:after="0" w:line="260"/>
-        <w:ind w:left="200"/>
-      </w:pPr>
-      <w:r>
-        <w:rPr>
-          <w:rFonts w:ascii="Courier New" w:cs="Courier New" w:eastAsia="Courier New" w:hAnsi="Courier New"/>
-          <w:sz w:val="20"/>
-          <w:szCs w:val="20"/>
-        </w:rPr>
-        <w:t xml:space="preserve">done</w:t>
-      </w:r>
-    </w:p>
-    <w:p>
-      <w:pPr>
-        <w:pBdr>
-          <w:left w:val="single" w:color="808080" w:sz="12" w:space="6"/>
-        </w:pBdr>
-        <w:shd w:fill="F2F2F2" w:val="clear"/>
-        <w:spacing w:after="0" w:line="260"/>
-        <w:ind w:left="200"/>
-      </w:pPr>
-      <w:r>
-        <w:rPr>
-          <w:rFonts w:ascii="Courier New" w:cs="Courier New" w:eastAsia="Courier New" w:hAnsi="Courier New"/>
-          <w:sz w:val="20"/>
-          <w:szCs w:val="20"/>
-        </w:rPr>
-        <w:t xml:space="preserve"> </w:t>
-      </w:r>
-    </w:p>
-    <w:p>
-      <w:pPr>
-        <w:pBdr>
-          <w:left w:val="single" w:color="808080" w:sz="12" w:space="6"/>
-        </w:pBdr>
-        <w:shd w:fill="F2F2F2" w:val="clear"/>
-        <w:spacing w:after="0" w:line="260"/>
-        <w:ind w:left="200"/>
-      </w:pPr>
-      <w:r>
-        <w:rPr>
-          <w:rFonts w:ascii="Courier New" w:cs="Courier New" w:eastAsia="Courier New" w:hAnsi="Courier New"/>
-          <w:sz w:val="20"/>
-          <w:szCs w:val="20"/>
-        </w:rPr>
-        <w:t xml:space="preserve">while IFS= read -r line</w:t>
-      </w:r>
-    </w:p>
-    <w:p>
-      <w:pPr>
-        <w:pBdr>
-          <w:left w:val="single" w:color="808080" w:sz="12" w:space="6"/>
-        </w:pBdr>
-        <w:shd w:fill="F2F2F2" w:val="clear"/>
-        <w:spacing w:after="0" w:line="260"/>
-        <w:ind w:left="200"/>
-      </w:pPr>
-      <w:r>
-        <w:rPr>
-          <w:rFonts w:ascii="Courier New" w:cs="Courier New" w:eastAsia="Courier New" w:hAnsi="Courier New"/>
-          <w:sz w:val="20"/>
-          <w:szCs w:val="20"/>
-        </w:rPr>
-        <w:t xml:space="preserve">do</w:t>
-      </w:r>
-    </w:p>
-    <w:p>
-      <w:pPr>
-        <w:pBdr>
-          <w:left w:val="single" w:color="808080" w:sz="12" w:space="6"/>
-        </w:pBdr>
-        <w:shd w:fill="F2F2F2" w:val="clear"/>
-        <w:spacing w:after="0" w:line="260"/>
-        <w:ind w:left="200"/>
-      </w:pPr>
-      <w:r>
-        <w:rPr>
-          <w:rFonts w:ascii="Courier New" w:cs="Courier New" w:eastAsia="Courier New" w:hAnsi="Courier New"/>
-          <w:sz w:val="20"/>
-          <w:szCs w:val="20"/>
-        </w:rPr>
-        <w:t xml:space="preserve">    echo "$line"</w:t>
-      </w:r>
-    </w:p>
-    <w:p>
-      <w:pPr>
-        <w:pBdr>
-          <w:left w:val="single" w:color="808080" w:sz="12" w:space="6"/>
-        </w:pBdr>
-        <w:shd w:fill="F2F2F2" w:val="clear"/>
-        <w:spacing w:after="0" w:line="260"/>
-        <w:ind w:left="200"/>
-      </w:pPr>
-      <w:r>
-        <w:rPr>
-          <w:rFonts w:ascii="Courier New" w:cs="Courier New" w:eastAsia="Courier New" w:hAnsi="Courier New"/>
-          <w:sz w:val="20"/>
-          <w:szCs w:val="20"/>
-        </w:rPr>
-        <w:t xml:space="preserve">done &lt; students.txt</w:t>
+        <w:t xml:space="preserve">while IFS= read -r line; do echo "$line"; done &lt; students.txt</w:t>
       </w:r>
     </w:p>
     <w:p>
       <w:pPr>
         <w:spacing w:after="100"/>
       </w:pPr>
+    </w:p>
+    <w:p>
+      <w:pPr>
+        <w:spacing w:after="120" w:line="300"/>
+        <w:ind w:firstLine="709"/>
+        <w:jc w:val="both"/>
+      </w:pPr>
+      <w:r>
+        <w:rPr>
+          <w:rFonts w:ascii="Times New Roman" w:cs="Times New Roman" w:eastAsia="Times New Roman" w:hAnsi="Times New Roman"/>
+          <w:sz w:val="24"/>
+          <w:szCs w:val="24"/>
+        </w:rPr>
+        <w:t xml:space="preserve">for: числа 1-10. while: числа 1-7, условие меняется через i=$((i + 1)). Третий цикл читает students.txt построчно.</w:t>
+      </w:r>
     </w:p>
     <w:p>
       <w:pPr>
@@ -1519,7 +1420,7 @@
           <wp:inline distT="0" distB="0" distL="0" distR="0">
             <wp:extent cx="5810250" cy="3305175"/>
             <wp:effectExtent t="0" r="0" b="0" l="0"/>
-            <wp:docPr id="1" name="Скриншот терминала, задание 6 (циклы)" descr="Скриншот терминала, задание 6 (циклы)" title="Скриншот терминала, задание 6 (циклы)"/>
+            <wp:docPr id="1" name="Скриншот терминала, задание 6" descr="Скриншот терминала, задание 6" title="Скриншот терминала, задание 6"/>
             <wp:cNvGraphicFramePr>
               <a:graphicFrameLocks xmlns:a="http://schemas.openxmlformats.org/drawingml/2006/main" noChangeAspect="1"/>
             </wp:cNvGraphicFramePr>
@@ -1568,7 +1469,7 @@
           <w:sz w:val="22"/>
           <w:szCs w:val="22"/>
         </w:rPr>
-        <w:t xml:space="preserve">Рисунок 6 — Скриншот терминала, задание 6 (циклы)</w:t>
+        <w:t xml:space="preserve">Рисунок 6 - Скриншот терминала, задание 6</w:t>
       </w:r>
     </w:p>
     <w:p>
@@ -1586,21 +1487,6 @@
           <w:szCs w:val="26"/>
         </w:rPr>
         <w:t xml:space="preserve">Задание 7. Передача параметров сценарию</w:t>
-      </w:r>
-    </w:p>
-    <w:p>
-      <w:pPr>
-        <w:spacing w:after="120" w:line="300"/>
-        <w:ind w:firstLine="709"/>
-        <w:jc w:val="both"/>
-      </w:pPr>
-      <w:r>
-        <w:rPr>
-          <w:rFonts w:ascii="Times New Roman" w:cs="Times New Roman" w:eastAsia="Times New Roman" w:hAnsi="Times New Roman"/>
-          <w:sz w:val="24"/>
-          <w:szCs w:val="24"/>
-        </w:rPr>
-        <w:t xml:space="preserve">Сценарий scripts/parameters.sh принимает три параметра: фамилию и инициалы, город и год рождения.</w:t>
       </w:r>
     </w:p>
     <w:p>
@@ -1718,6 +1604,21 @@
     </w:p>
     <w:p>
       <w:pPr>
+        <w:spacing w:after="120" w:line="300"/>
+        <w:ind w:firstLine="709"/>
+        <w:jc w:val="both"/>
+      </w:pPr>
+      <w:r>
+        <w:rPr>
+          <w:rFonts w:ascii="Times New Roman" w:cs="Times New Roman" w:eastAsia="Times New Roman" w:hAnsi="Times New Roman"/>
+          <w:sz w:val="24"/>
+          <w:szCs w:val="24"/>
+        </w:rPr>
+        <w:t xml:space="preserve">$0: имя сценария. $1-$3: параметры. $#: число параметров. Запуск с двумя наборами данных, текст с пробелами в кавычках.</w:t>
+      </w:r>
+    </w:p>
+    <w:p>
+      <w:pPr>
         <w:keepNext/>
         <w:spacing w:after="60" w:before="120"/>
         <w:jc w:val="center"/>
@@ -1727,7 +1628,7 @@
           <wp:inline distT="0" distB="0" distL="0" distR="0">
             <wp:extent cx="5810250" cy="2981325"/>
             <wp:effectExtent t="0" r="0" b="0" l="0"/>
-            <wp:docPr id="1" name="Скриншот терминала, задание 7 (параметры)" descr="Скриншот терминала, задание 7 (параметры)" title="Скриншот терминала, задание 7 (параметры)"/>
+            <wp:docPr id="1" name="Скриншот терминала, задание 7" descr="Скриншот терминала, задание 7" title="Скриншот терминала, задание 7"/>
             <wp:cNvGraphicFramePr>
               <a:graphicFrameLocks xmlns:a="http://schemas.openxmlformats.org/drawingml/2006/main" noChangeAspect="1"/>
             </wp:cNvGraphicFramePr>
@@ -1776,7 +1677,7 @@
           <w:sz w:val="22"/>
           <w:szCs w:val="22"/>
         </w:rPr>
-        <w:t xml:space="preserve">Рисунок 7 — Скриншот терминала, задание 7 (параметры)</w:t>
+        <w:t xml:space="preserve">Рисунок 7 - Скриншот терминала, задание 7</w:t>
       </w:r>
     </w:p>
     <w:p>
@@ -1794,21 +1695,6 @@
           <w:szCs w:val="26"/>
         </w:rPr>
         <w:t xml:space="preserve">Итоговое задание. Алгоритм обработки students.txt</w:t>
-      </w:r>
-    </w:p>
-    <w:p>
-      <w:pPr>
-        <w:spacing w:after="120" w:line="300"/>
-        <w:ind w:firstLine="709"/>
-        <w:jc w:val="both"/>
-      </w:pPr>
-      <w:r>
-        <w:rPr>
-          <w:rFonts w:ascii="Times New Roman" w:cs="Times New Roman" w:eastAsia="Times New Roman" w:hAnsi="Times New Roman"/>
-          <w:sz w:val="24"/>
-          <w:szCs w:val="24"/>
-        </w:rPr>
-        <w:t xml:space="preserve">Алгоритм обработки файла students.txt:</w:t>
       </w:r>
     </w:p>
     <w:p>
@@ -1826,7 +1712,7 @@
           <w:sz w:val="24"/>
           <w:szCs w:val="24"/>
         </w:rPr>
-        <w:t xml:space="preserve">Начало.</w:t>
+        <w:t xml:space="preserve">Проверить файл: if [ -f students.txt ].</w:t>
       </w:r>
     </w:p>
     <w:p>
@@ -1844,7 +1730,7 @@
           <w:sz w:val="24"/>
           <w:szCs w:val="24"/>
         </w:rPr>
-        <w:t xml:space="preserve">Проверить существование файла students.txt (if [ -f ... ]).</w:t>
+        <w:t xml:space="preserve">Файла нет: вывести сообщение, выйти.</w:t>
       </w:r>
     </w:p>
     <w:p>
@@ -1862,7 +1748,7 @@
           <w:sz w:val="24"/>
           <w:szCs w:val="24"/>
         </w:rPr>
-        <w:t xml:space="preserve">Если файла нет — вывести сообщение об ошибке и завершить работу.</w:t>
+        <w:t xml:space="preserve">Файл есть: вывести содержимое (cat).</w:t>
       </w:r>
     </w:p>
     <w:p>
@@ -1880,7 +1766,7 @@
           <w:sz w:val="24"/>
           <w:szCs w:val="24"/>
         </w:rPr>
-        <w:t xml:space="preserve">Если файл есть — вывести его содержимое командой cat.</w:t>
+        <w:t xml:space="preserve">Посчитать строки: count=$(wc -l &lt; students.txt).</w:t>
       </w:r>
     </w:p>
     <w:p>
@@ -1898,7 +1784,7 @@
           <w:sz w:val="24"/>
           <w:szCs w:val="24"/>
         </w:rPr>
-        <w:t xml:space="preserve">Подсчитать строки: count=$(wc -l &lt; students.txt).</w:t>
+        <w:t xml:space="preserve">Сравнить: [ "$count" -ge 5 ].</w:t>
       </w:r>
     </w:p>
     <w:p>
@@ -1916,7 +1802,7 @@
           <w:sz w:val="24"/>
           <w:szCs w:val="24"/>
         </w:rPr>
-        <w:t xml:space="preserve">Сравнить count с 5 (if [ "$count" -ge 5 ]).</w:t>
+        <w:t xml:space="preserve">count &gt;= 5: сообщение о достаточном числе записей.</w:t>
       </w:r>
     </w:p>
     <w:p>
@@ -1934,118 +1820,7 @@
           <w:sz w:val="24"/>
           <w:szCs w:val="24"/>
         </w:rPr>
-        <w:t xml:space="preserve">Если count ≥ 5 — вывести «Записей достаточно», иначе — предупреждение «Необходимо добавить записи».</w:t>
-      </w:r>
-    </w:p>
-    <w:p>
-      <w:pPr>
-        <w:pStyle w:val="ListParagraph"/>
-        <w:numPr>
-          <w:ilvl w:val="0"/>
-          <w:numId w:val="2"/>
-        </w:numPr>
-        <w:spacing w:after="80"/>
-      </w:pPr>
-      <w:r>
-        <w:rPr>
-          <w:rFonts w:ascii="Times New Roman" w:cs="Times New Roman" w:eastAsia="Times New Roman" w:hAnsi="Times New Roman"/>
-          <w:sz w:val="24"/>
-          <w:szCs w:val="24"/>
-        </w:rPr>
-        <w:t xml:space="preserve">Конец.</w:t>
-      </w:r>
-    </w:p>
-    <w:p>
-      <w:pPr>
-        <w:spacing w:after="120" w:line="300"/>
-        <w:ind w:firstLine="0"/>
-        <w:jc w:val="both"/>
-      </w:pPr>
-      <w:r>
-        <w:rPr>
-          <w:rFonts w:ascii="Times New Roman" w:cs="Times New Roman" w:eastAsia="Times New Roman" w:hAnsi="Times New Roman"/>
-          <w:sz w:val="24"/>
-          <w:szCs w:val="24"/>
-        </w:rPr>
-        <w:t xml:space="preserve">Результат выполнения проверки на практике:</w:t>
-      </w:r>
-    </w:p>
-    <w:p>
-      <w:pPr>
-        <w:keepNext/>
-        <w:spacing w:after="60" w:before="120"/>
-        <w:jc w:val="center"/>
-      </w:pPr>
-      <w:r>
-        <w:drawing>
-          <wp:inline distT="0" distB="0" distL="0" distR="0">
-            <wp:extent cx="5810250" cy="2828925"/>
-            <wp:effectExtent t="0" r="0" b="0" l="0"/>
-            <wp:docPr id="1" name="Скриншот терминала, итоговое задание" descr="Скриншот терминала, итоговое задание" title="Скриншот терминала, итоговое задание"/>
-            <wp:cNvGraphicFramePr>
-              <a:graphicFrameLocks xmlns:a="http://schemas.openxmlformats.org/drawingml/2006/main" noChangeAspect="1"/>
-            </wp:cNvGraphicFramePr>
-            <a:graphic xmlns:a="http://schemas.openxmlformats.org/drawingml/2006/main">
-              <a:graphicData uri="http://schemas.openxmlformats.org/drawingml/2006/picture">
-                <pic:pic xmlns:pic="http://schemas.openxmlformats.org/drawingml/2006/picture">
-                  <pic:nvPicPr>
-                    <pic:cNvPr id="0" name="" descr=""/>
-                    <pic:cNvPicPr>
-                      <a:picLocks noChangeAspect="1" noChangeArrowheads="1"/>
-                    </pic:cNvPicPr>
-                  </pic:nvPicPr>
-                  <pic:blipFill>
-                    <a:blip r:embed="rId14" cstate="none"/>
-                    <a:srcRect/>
-                    <a:stretch>
-                      <a:fillRect/>
-                    </a:stretch>
-                  </pic:blipFill>
-                  <pic:spPr bwMode="auto">
-                    <a:xfrm>
-                      <a:off x="0" y="0"/>
-                      <a:ext cx="5810250" cy="2828925"/>
-                    </a:xfrm>
-                    <a:prstGeom prst="rect">
-                      <a:avLst/>
-                    </a:prstGeom>
-                  </pic:spPr>
-                </pic:pic>
-              </a:graphicData>
-            </a:graphic>
-          </wp:inline>
-        </w:drawing>
-      </w:r>
-    </w:p>
-    <w:p>
-      <w:pPr>
-        <w:spacing w:after="160"/>
-        <w:jc w:val="center"/>
-      </w:pPr>
-      <w:r>
-        <w:rPr>
-          <w:rFonts w:ascii="Times New Roman" w:cs="Times New Roman" w:eastAsia="Times New Roman" w:hAnsi="Times New Roman"/>
-          <w:i/>
-          <w:iCs/>
-          <w:sz w:val="22"/>
-          <w:szCs w:val="22"/>
-        </w:rPr>
-        <w:t xml:space="preserve">Рисунок 8 — Скриншот терминала, итоговое задание</w:t>
-      </w:r>
-    </w:p>
-    <w:p>
-      <w:pPr>
-        <w:spacing w:after="120" w:line="300"/>
-        <w:ind w:firstLine="0"/>
-        <w:jc w:val="both"/>
-      </w:pPr>
-      <w:r>
-        <w:rPr>
-          <w:rFonts w:ascii="Times New Roman" w:cs="Times New Roman" w:eastAsia="Times New Roman" w:hAnsi="Times New Roman"/>
-          <w:sz w:val="24"/>
-          <w:szCs w:val="24"/>
-        </w:rPr>
-        <w:t xml:space="preserve">Необходимые средства по этапам:</w:t>
+        <w:t xml:space="preserve">count &lt; 5: предупреждение.</w:t>
       </w:r>
     </w:p>
     <w:tbl>
@@ -2121,7 +1896,7 @@
                 <w:sz w:val="22"/>
                 <w:szCs w:val="22"/>
               </w:rPr>
-              <w:t xml:space="preserve">Что используется</w:t>
+              <w:t xml:space="preserve">Средство</w:t>
             </w:r>
           </w:p>
         </w:tc>
@@ -2272,7 +2047,7 @@
                 <w:sz w:val="22"/>
                 <w:szCs w:val="22"/>
               </w:rPr>
-              <w:t xml:space="preserve">Подсчёт строк</w:t>
+              <w:t xml:space="preserve">Подсчет строк</w:t>
             </w:r>
           </w:p>
         </w:tc>
@@ -2361,7 +2136,7 @@
                 <w:sz w:val="22"/>
                 <w:szCs w:val="22"/>
               </w:rPr>
-              <w:t xml:space="preserve">оператор -ge: [ "$count" -ge 5 ]</w:t>
+              <w:t xml:space="preserve">[ "$count" -ge 5 ]</w:t>
             </w:r>
           </w:p>
         </w:tc>
@@ -2392,7 +2167,7 @@
                 <w:sz w:val="22"/>
                 <w:szCs w:val="22"/>
               </w:rPr>
-              <w:t xml:space="preserve">Вывод сообщения</w:t>
+              <w:t xml:space="preserve">Выбор сообщения</w:t>
             </w:r>
           </w:p>
         </w:tc>
@@ -2421,7 +2196,7 @@
                 <w:sz w:val="22"/>
                 <w:szCs w:val="22"/>
               </w:rPr>
-              <w:t xml:space="preserve">конструкция if … else … fi и команда echo</w:t>
+              <w:t xml:space="preserve">if ... else ... fi, echo</w:t>
             </w:r>
           </w:p>
         </w:tc>
@@ -2444,6 +2219,84 @@
     </w:p>
     <w:p>
       <w:pPr>
+        <w:spacing w:after="120" w:line="300"/>
+        <w:ind w:firstLine="709"/>
+        <w:jc w:val="both"/>
+      </w:pPr>
+      <w:r>
+        <w:rPr>
+          <w:rFonts w:ascii="Times New Roman" w:cs="Times New Roman" w:eastAsia="Times New Roman" w:hAnsi="Times New Roman"/>
+          <w:sz w:val="24"/>
+          <w:szCs w:val="24"/>
+        </w:rPr>
+        <w:t xml:space="preserve">Проверка алгоритма сценарием check_students.sh: файл students.txt и отсутствующий файл missing.txt.</w:t>
+      </w:r>
+    </w:p>
+    <w:p>
+      <w:pPr>
+        <w:keepNext/>
+        <w:spacing w:after="60" w:before="120"/>
+        <w:jc w:val="center"/>
+      </w:pPr>
+      <w:r>
+        <w:drawing>
+          <wp:inline distT="0" distB="0" distL="0" distR="0">
+            <wp:extent cx="5810250" cy="2828925"/>
+            <wp:effectExtent t="0" r="0" b="0" l="0"/>
+            <wp:docPr id="1" name="Скриншот терминала, итоговое задание" descr="Скриншот терминала, итоговое задание" title="Скриншот терминала, итоговое задание"/>
+            <wp:cNvGraphicFramePr>
+              <a:graphicFrameLocks xmlns:a="http://schemas.openxmlformats.org/drawingml/2006/main" noChangeAspect="1"/>
+            </wp:cNvGraphicFramePr>
+            <a:graphic xmlns:a="http://schemas.openxmlformats.org/drawingml/2006/main">
+              <a:graphicData uri="http://schemas.openxmlformats.org/drawingml/2006/picture">
+                <pic:pic xmlns:pic="http://schemas.openxmlformats.org/drawingml/2006/picture">
+                  <pic:nvPicPr>
+                    <pic:cNvPr id="0" name="" descr=""/>
+                    <pic:cNvPicPr>
+                      <a:picLocks noChangeAspect="1" noChangeArrowheads="1"/>
+                    </pic:cNvPicPr>
+                  </pic:nvPicPr>
+                  <pic:blipFill>
+                    <a:blip r:embed="rId14" cstate="none"/>
+                    <a:srcRect/>
+                    <a:stretch>
+                      <a:fillRect/>
+                    </a:stretch>
+                  </pic:blipFill>
+                  <pic:spPr bwMode="auto">
+                    <a:xfrm>
+                      <a:off x="0" y="0"/>
+                      <a:ext cx="5810250" cy="2828925"/>
+                    </a:xfrm>
+                    <a:prstGeom prst="rect">
+                      <a:avLst/>
+                    </a:prstGeom>
+                  </pic:spPr>
+                </pic:pic>
+              </a:graphicData>
+            </a:graphic>
+          </wp:inline>
+        </w:drawing>
+      </w:r>
+    </w:p>
+    <w:p>
+      <w:pPr>
+        <w:spacing w:after="160"/>
+        <w:jc w:val="center"/>
+      </w:pPr>
+      <w:r>
+        <w:rPr>
+          <w:rFonts w:ascii="Times New Roman" w:cs="Times New Roman" w:eastAsia="Times New Roman" w:hAnsi="Times New Roman"/>
+          <w:i/>
+          <w:iCs/>
+          <w:sz w:val="22"/>
+          <w:szCs w:val="22"/>
+        </w:rPr>
+        <w:t xml:space="preserve">Рисунок 8 - Скриншот терминала, итоговое задание</w:t>
+      </w:r>
+    </w:p>
+    <w:p>
+      <w:pPr>
         <w:pStyle w:val="Heading1"/>
         <w:spacing w:after="120" w:before="240"/>
       </w:pPr>
@@ -2461,6 +2314,7 @@
     </w:p>
     <w:p>
       <w:pPr>
+        <w:keepNext/>
         <w:spacing w:after="40"/>
       </w:pPr>
       <w:r>
@@ -2486,11 +2340,12 @@
           <w:sz w:val="24"/>
           <w:szCs w:val="24"/>
         </w:rPr>
-        <w:t xml:space="preserve">Текстовый интерфейс, в котором пользователь вводит команды, а система их выполняет.</w:t>
-      </w:r>
-    </w:p>
-    <w:p>
-      <w:pPr>
+        <w:t xml:space="preserve">Текстовый интерфейс: пользователь вводит команды, система их выполняет.</w:t>
+      </w:r>
+    </w:p>
+    <w:p>
+      <w:pPr>
+        <w:keepNext/>
         <w:spacing w:after="40"/>
       </w:pPr>
       <w:r>
@@ -2516,11 +2371,12 @@
           <w:sz w:val="24"/>
           <w:szCs w:val="24"/>
         </w:rPr>
-        <w:t xml:space="preserve">Текстовый файл с последовательностью команд, выполняемых интерпретатором; позволяет автоматизировать работу.</w:t>
-      </w:r>
-    </w:p>
-    <w:p>
-      <w:pPr>
+        <w:t xml:space="preserve">Файл с последовательностью команд для Bash.</w:t>
+      </w:r>
+    </w:p>
+    <w:p>
+      <w:pPr>
+        <w:keepNext/>
         <w:spacing w:after="40"/>
       </w:pPr>
       <w:r>
@@ -2531,7 +2387,7 @@
           <w:sz w:val="24"/>
           <w:szCs w:val="24"/>
         </w:rPr>
-        <w:t xml:space="preserve">3. Для чего используются pwd, ls, cd и cat?</w:t>
+        <w:t xml:space="preserve">3. Для чего используются команды pwd, ls, cd и cat?</w:t>
       </w:r>
     </w:p>
     <w:p>
@@ -2546,11 +2402,12 @@
           <w:sz w:val="24"/>
           <w:szCs w:val="24"/>
         </w:rPr>
-        <w:t xml:space="preserve">pwd — показать текущий каталог, ls — вывести список файлов, cd — перейти в другой каталог, cat — вывести содержимое файла.</w:t>
-      </w:r>
-    </w:p>
-    <w:p>
-      <w:pPr>
+        <w:t xml:space="preserve">pwd: текущий каталог. ls: список файлов. cd: смена каталога. cat: вывод файла.</w:t>
+      </w:r>
+    </w:p>
+    <w:p>
+      <w:pPr>
+        <w:keepNext/>
         <w:spacing w:after="40"/>
       </w:pPr>
       <w:r>
@@ -2576,11 +2433,12 @@
           <w:sz w:val="24"/>
           <w:szCs w:val="24"/>
         </w:rPr>
-        <w:t xml:space="preserve">Каталог — mkdir имя, файл — touch имя или редактор nano имя.</w:t>
-      </w:r>
-    </w:p>
-    <w:p>
-      <w:pPr>
+        <w:t xml:space="preserve">Каталог: mkdir имя. Файл: touch имя или nano имя.</w:t>
+      </w:r>
+    </w:p>
+    <w:p>
+      <w:pPr>
+        <w:keepNext/>
         <w:spacing w:after="40"/>
       </w:pPr>
       <w:r>
@@ -2591,7 +2449,7 @@
           <w:sz w:val="24"/>
           <w:szCs w:val="24"/>
         </w:rPr>
-        <w:t xml:space="preserve">5. Для чего нужны grep, sort и wc -l?</w:t>
+        <w:t xml:space="preserve">5. Для чего нужны команды grep, sort и wc -l?</w:t>
       </w:r>
     </w:p>
     <w:p>
@@ -2606,11 +2464,12 @@
           <w:sz w:val="24"/>
           <w:szCs w:val="24"/>
         </w:rPr>
-        <w:t xml:space="preserve">grep ищет строки по шаблону, sort сортирует строки, wc -l считает количество строк.</w:t>
-      </w:r>
-    </w:p>
-    <w:p>
-      <w:pPr>
+        <w:t xml:space="preserve">grep: поиск строк по шаблону. sort: сортировка строк. wc -l: число строк.</w:t>
+      </w:r>
+    </w:p>
+    <w:p>
+      <w:pPr>
+        <w:keepNext/>
         <w:spacing w:after="40"/>
       </w:pPr>
       <w:r>
@@ -2636,11 +2495,12 @@
           <w:sz w:val="24"/>
           <w:szCs w:val="24"/>
         </w:rPr>
-        <w:t xml:space="preserve">Именованная область для хранения значения. Присваивание без пробелов: year=2005; значение читается через $year.</w:t>
-      </w:r>
-    </w:p>
-    <w:p>
-      <w:pPr>
+        <w:t xml:space="preserve">Именованное значение. Присваивание без пробелов: year=2005. Чтение: $year.</w:t>
+      </w:r>
+    </w:p>
+    <w:p>
+      <w:pPr>
+        <w:keepNext/>
         <w:spacing w:after="40"/>
       </w:pPr>
       <w:r>
@@ -2666,11 +2526,12 @@
           <w:sz w:val="24"/>
           <w:szCs w:val="24"/>
         </w:rPr>
-        <w:t xml:space="preserve">Проверяется условие в [ ]; при истине выполняются команды после then, иначе — после else; завершается fi.</w:t>
-      </w:r>
-    </w:p>
-    <w:p>
-      <w:pPr>
+        <w:t xml:space="preserve">Проверяет условие в [ ]. then: ветка при истине. else: ветка при ложном условии. fi закрывает блок.</w:t>
+      </w:r>
+    </w:p>
+    <w:p>
+      <w:pPr>
+        <w:keepNext/>
         <w:spacing w:after="40"/>
       </w:pPr>
       <w:r>
@@ -2696,11 +2557,12 @@
           <w:sz w:val="24"/>
           <w:szCs w:val="24"/>
         </w:rPr>
-        <w:t xml:space="preserve">for перебирает заданный список значений, while повторяется, пока условие истинно.</w:t>
-      </w:r>
-    </w:p>
-    <w:p>
-      <w:pPr>
+        <w:t xml:space="preserve">for перебирает список значений. while повторяется, пока условие истинно.</w:t>
+      </w:r>
+    </w:p>
+    <w:p>
+      <w:pPr>
+        <w:keepNext/>
         <w:spacing w:after="40"/>
       </w:pPr>
       <w:r>
@@ -2711,7 +2573,7 @@
           <w:sz w:val="24"/>
           <w:szCs w:val="24"/>
         </w:rPr>
-        <w:t xml:space="preserve">9. Как передаются параметры сценарию?</w:t>
+        <w:t xml:space="preserve">9. Как передаются параметры командному сценарию?</w:t>
       </w:r>
     </w:p>
     <w:p>
@@ -2726,11 +2588,12 @@
           <w:sz w:val="24"/>
           <w:szCs w:val="24"/>
         </w:rPr>
-        <w:t xml:space="preserve">Через аргументы при запуске: bash script.sh a b; доступны как $1, $2, …, их число — $#.</w:t>
-      </w:r>
-    </w:p>
-    <w:p>
-      <w:pPr>
+        <w:t xml:space="preserve">Аргументами запуска: bash script.sh a b. Доступны $1, $2, число параметров в $#.</w:t>
+      </w:r>
+    </w:p>
+    <w:p>
+      <w:pPr>
+        <w:keepNext/>
         <w:spacing w:after="40"/>
       </w:pPr>
       <w:r>
@@ -2756,11 +2619,12 @@
           <w:sz w:val="24"/>
           <w:szCs w:val="24"/>
         </w:rPr>
-        <w:t xml:space="preserve">Чтобы избежать ошибок при обращении к отсутствующему файлу и вывести понятное сообщение.</w:t>
-      </w:r>
-    </w:p>
-    <w:p>
-      <w:pPr>
+        <w:t xml:space="preserve">Без проверки cat выдает системную ошибку. Проверка -f выводит причину.</w:t>
+      </w:r>
+    </w:p>
+    <w:p>
+      <w:pPr>
+        <w:keepNext/>
         <w:spacing w:after="40"/>
       </w:pPr>
       <w:r>
@@ -2786,11 +2650,12 @@
           <w:sz w:val="24"/>
           <w:szCs w:val="24"/>
         </w:rPr>
-        <w:t xml:space="preserve">Когда нужно обработать каждую строку или несколько файлов одинаковым образом.</w:t>
-      </w:r>
-    </w:p>
-    <w:p>
-      <w:pPr>
+        <w:t xml:space="preserve">Одно правило для каждой строки файла или для списка файлов.</w:t>
+      </w:r>
+    </w:p>
+    <w:p>
+      <w:pPr>
+        <w:keepNext/>
         <w:spacing w:after="40"/>
       </w:pPr>
       <w:r>
@@ -2816,7 +2681,7 @@
           <w:sz w:val="24"/>
           <w:szCs w:val="24"/>
         </w:rPr>
-        <w:t xml:space="preserve">Алгоритм определяет порядок действий, проверки и возможные ошибки до написания кода, что уменьшает число ошибок.</w:t>
+        <w:t xml:space="preserve">Алгоритм фиксирует порядок действий, проверки и ошибки до кода.</w:t>
       </w:r>
     </w:p>
     <w:p>
@@ -2848,7 +2713,7 @@
           <w:sz w:val="24"/>
           <w:szCs w:val="24"/>
         </w:rPr>
-        <w:t xml:space="preserve">В ходе работы освоены базовые операции командной строки Linux: навигация, создание каталогов и файлов, поиск, сортировка и подсчёт строк. Изучены переменные, условные конструкции if, циклы for и while, а также передача параметров сценарию. Подготовлен алгоритм обработки файла students.txt, который станет основой для разработки полноценного сценария в следующей практической работе.</w:t>
+        <w:t xml:space="preserve">Команды заданий 1-7 запущены на ubuntu-RDW-63, вывод приложен скриншотами. Алгоритм обработки students.txt составлен. Реализация сценария по алгоритму - следующая работа.</w:t>
       </w:r>
     </w:p>
     <w:p>
@@ -2868,9 +2733,7 @@
     </w:p>
     <w:p>
       <w:pPr>
-        <w:spacing w:after="120" w:line="300"/>
-        <w:ind w:firstLine="0"/>
-        <w:jc w:val="left"/>
+        <w:spacing w:after="60"/>
       </w:pPr>
       <w:r>
         <w:rPr>
@@ -2880,7 +2743,7 @@
           <w:sz w:val="24"/>
           <w:szCs w:val="24"/>
         </w:rPr>
-        <w:t xml:space="preserve">Работу выполнил: Степанов Глеб Владиславович, группа 25о9-090207-ИС/3.</w:t>
+        <w:t xml:space="preserve">Выполнил: Степанов Глеб Владиславович, группа 25о9-090207-ИС/3</w:t>
       </w:r>
     </w:p>
     <w:sectPr>
@@ -3074,7 +2937,7 @@
     <w:lvl w:ilvl="0" w15:tentative="1">
       <w:start w:val="1"/>
       <w:numFmt w:val="bullet"/>
-      <w:lvlText w:val="–"/>
+      <w:lvlText w:val="-"/>
       <w:lvlJc w:val="left"/>
       <w:pPr>
         <w:ind w:left="720" w:hanging="360"/>

</xml_diff>